<commit_message>
Freeze MRNB100 georisk validation package
</commit_message>
<xml_diff>
--- a/manuscript/A_reproducible_reliability_benchmark.docx
+++ b/manuscript/A_reproducible_reliability_benchmark.docx
@@ -11,11 +11,10 @@
           <w:b/>
         </w:rPr>
       </w:pPr>
+      <w:bookmarkStart w:id="0" w:name="_GoBack"/>
+      <w:bookmarkEnd w:id="0"/>
       <w:r>
-        <w:rPr>
-          <w:b/>
-        </w:rPr>
-        <w:t>A reproducible reliability benchmark for non-stationary liquefaction probability under groundwater and gradation-change scenarios</w:t>
+        <w:t>Non-stationary liquefaction reliability updating under groundwater and gradation-change scenarios</w:t>
       </w:r>
     </w:p>
     <w:p>
@@ -42,35 +41,7 @@
         <w:rPr>
           <w:lang w:val="es-PA"/>
         </w:rPr>
-        <w:t xml:space="preserve">Universidad de </w:t>
-      </w:r>
-      <w:proofErr w:type="spellStart"/>
-      <w:r>
-        <w:rPr>
-          <w:lang w:val="es-PA"/>
-        </w:rPr>
-        <w:t>Panama</w:t>
-      </w:r>
-      <w:proofErr w:type="spellEnd"/>
-      <w:r>
-        <w:rPr>
-          <w:lang w:val="es-PA"/>
-        </w:rPr>
-        <w:t xml:space="preserve">, </w:t>
-      </w:r>
-      <w:proofErr w:type="spellStart"/>
-      <w:r>
-        <w:rPr>
-          <w:lang w:val="es-PA"/>
-        </w:rPr>
-        <w:t>Panama</w:t>
-      </w:r>
-      <w:proofErr w:type="spellEnd"/>
-      <w:r>
-        <w:rPr>
-          <w:lang w:val="es-PA"/>
-        </w:rPr>
-        <w:t xml:space="preserve">. </w:t>
+        <w:t xml:space="preserve">Universidad de Panama, Panama. </w:t>
       </w:r>
       <w:r>
         <w:t>Corresponding author: gabriel.montufar@up.ac.pa</w:t>
@@ -89,50 +60,35 @@
     </w:p>
     <w:p>
       <w:pPr>
-        <w:pStyle w:val="Abstract"/>
+        <w:pStyle w:val="Heading1"/>
+        <w:rPr>
+          <w:rFonts w:cs="Times New Roman"/>
+          <w:b w:val="0"/>
+          <w:bCs w:val="0"/>
+          <w:kern w:val="0"/>
+          <w:szCs w:val="24"/>
+        </w:rPr>
       </w:pPr>
       <w:r>
-        <w:t xml:space="preserve">Liquefaction assessments </w:t>
+        <w:rPr>
+          <w:rFonts w:cs="Times New Roman"/>
+          <w:b w:val="0"/>
+          <w:bCs w:val="0"/>
+          <w:kern w:val="0"/>
+          <w:szCs w:val="24"/>
+        </w:rPr>
+        <w:t xml:space="preserve">Liquefaction assessments are often reported as a factor of safety or as a probability for fixed groundwater and soil-gradation conditions. This stationary representation is convenient for design checks, but it can understate service-life georisk when groundwater depth and gradation states change during the lifetime of an engineered system. This paper presents a non-stationary liquefaction reliability updating method for groundwater and gradation-change scenarios, framed as a risk-management and decision-support problem rather than only as a computational benchmark. The method defines a time-dependent limit-state function using cyclic stress ratio, cyclic resistance ratio, fines-content correction, model uncertainty, groundwater depth and layer-wise soil variability, and evaluates a transparent four-layer profile over a 50-year planning horizon under stationary, rising, seasonal and extreme groundwater scenarios combined with constant gradation, fines accumulation and fines washout. Stationary, deterministic-probabilistic and non-stationary probabilistic assessments are compared to expose when the critical layer, Pf(t) trajectory, threshold-crossing time and screening decision change. External case-history discrimination and calibration checks are reported using AUC, Brier score, sensitivity and specificity. The documented evidence chain separates Hu et al. [16] case-history discrimination, Nisqually PRJ-3758 spatial holdout calibration diagnostics, SODO/UW adverse-holdout guardrails and Canterbury PRJ-2937 multi-site external transfer. A cost-sensitive decision frontier then evaluates whether calibration-favoured or missed-event-averse screening rules are preferable when false negatives are assigned higher engineering cost than false positives. The contribution is a decision-oriented reliability update for changing geotechnical </w:t>
       </w:r>
-      <w:proofErr w:type="gramStart"/>
       <w:r>
-        <w:t>are often reported</w:t>
-      </w:r>
-      <w:proofErr w:type="gramEnd"/>
-      <w:r>
-        <w:t xml:space="preserve"> as a factor of safety or as a probability for fixed groundwater and soil-gradation conditions. This stationary representation is convenient for design checks, but it is incomplete when groundwater depth and gradation states may change during the service life of an engineered system. This paper presents a reproducible non-stationary reliability </w:t>
-      </w:r>
-      <w:proofErr w:type="gramStart"/>
-      <w:r>
-        <w:t>benchmark</w:t>
-      </w:r>
-      <w:proofErr w:type="gramEnd"/>
-      <w:r>
-        <w:t xml:space="preserve"> for estimating liquefaction probability under coupled groundwater and gradation-change scenarios. The framework defines a time-dependent limit-state function using cyclic stress ratio, cyclic resistance ratio, fines-content correction, model uncertainty, groundwater depth and </w:t>
-      </w:r>
-      <w:proofErr w:type="gramStart"/>
-      <w:r>
-        <w:t>layer-wise</w:t>
-      </w:r>
-      <w:proofErr w:type="gramEnd"/>
-      <w:r>
-        <w:t xml:space="preserve"> soil variability. A transparent four-layer profile is evaluated with Monte Carlo simulation over a 50-year planning horizon under stationary, rising, seasonal and extreme groundwater scenarios combined with constant gradation, fines accumulation and fines washout. Deterministic, stationary-probabilistic and non-stationary probabilistic assessments </w:t>
-      </w:r>
-      <w:proofErr w:type="gramStart"/>
-      <w:r>
-        <w:t>are compared</w:t>
-      </w:r>
-      <w:proofErr w:type="gramEnd"/>
-      <w:r>
-        <w:t xml:space="preserve">. Results show that shallow layers that appear marginally stable under stationary assumptions can reach higher computed liquefaction probabilities when groundwater rise, extreme events and gradation changes are included. The contribution is not a new empirical triggering curve, but an auditable workflow that converts liquefaction assessment into a scenario-conditioned probability indicator for </w:t>
-      </w:r>
-      <w:proofErr w:type="spellStart"/>
-      <w:r>
-        <w:t>geohazard</w:t>
-      </w:r>
-      <w:proofErr w:type="spellEnd"/>
-      <w:r>
-        <w:t xml:space="preserve"> screening. It supports reproducible trend-consistency evaluation rather than site-specific design calibration and transparent model checking in geoengineering workflows.</w:t>
+        <w:rPr>
+          <w:rFonts w:cs="Times New Roman"/>
+          <w:b w:val="0"/>
+          <w:bCs w:val="0"/>
+          <w:kern w:val="0"/>
+          <w:szCs w:val="24"/>
+        </w:rPr>
+        <w:lastRenderedPageBreak/>
+        <w:t>states that turns non-stationary geomaterial and groundwater uncertainty into auditable risk-ranking and operating-policy evidence.</w:t>
       </w:r>
     </w:p>
     <w:p>
@@ -150,21 +106,8 @@
       <w:pPr>
         <w:pStyle w:val="Keywords"/>
       </w:pPr>
-      <w:proofErr w:type="gramStart"/>
       <w:r>
-        <w:t>liquefaction</w:t>
-      </w:r>
-      <w:proofErr w:type="gramEnd"/>
-      <w:r>
-        <w:t xml:space="preserve">; geotechnical reliability; </w:t>
-      </w:r>
-      <w:proofErr w:type="spellStart"/>
-      <w:r>
-        <w:t>geohazard</w:t>
-      </w:r>
-      <w:proofErr w:type="spellEnd"/>
-      <w:r>
-        <w:t xml:space="preserve"> risk; groundwater; gradation; non-stationary modelling</w:t>
+        <w:t>liquefaction; geotechnical reliability; geohazard risk; groundwater; gradation; non-stationary modelling</w:t>
       </w:r>
     </w:p>
     <w:p>
@@ -175,7 +118,6 @@
         </w:rPr>
       </w:pPr>
       <w:r>
-        <w:lastRenderedPageBreak/>
         <w:t>1. Introduction</w:t>
       </w:r>
     </w:p>
@@ -184,83 +126,23 @@
         <w:pStyle w:val="Paragraph"/>
       </w:pPr>
       <w:r>
-        <w:t xml:space="preserve">Simplified liquefaction procedures remain central to geotechnical earthquake engineering because they transform site investigation data and seismic demand into an interpretable triggering index [4, 17, 42, 43, </w:t>
-      </w:r>
-      <w:proofErr w:type="gramStart"/>
-      <w:r>
-        <w:t>50</w:t>
-      </w:r>
-      <w:proofErr w:type="gramEnd"/>
-      <w:r>
-        <w:t xml:space="preserve">]. Probabilistic extensions of these procedures acknowledge epistemic and </w:t>
-      </w:r>
-      <w:proofErr w:type="spellStart"/>
-      <w:r>
-        <w:t>aleatory</w:t>
-      </w:r>
-      <w:proofErr w:type="spellEnd"/>
-      <w:r>
-        <w:t xml:space="preserve"> uncertainty in demand, resistance and model form [5, 21, 22, </w:t>
-      </w:r>
-      <w:proofErr w:type="gramStart"/>
-      <w:r>
-        <w:t>32</w:t>
-      </w:r>
-      <w:proofErr w:type="gramEnd"/>
-      <w:r>
-        <w:t xml:space="preserve">]. However, many practical assessments remain effectively stationary: the groundwater table, fines content and soil index parameters </w:t>
-      </w:r>
-      <w:proofErr w:type="gramStart"/>
-      <w:r>
-        <w:t>are treated</w:t>
-      </w:r>
-      <w:proofErr w:type="gramEnd"/>
-      <w:r>
-        <w:t xml:space="preserve"> as fixed descriptors of the site rather than as variables that may evolve during the planning horizon.</w:t>
+        <w:t>Simplified liquefaction procedures remain central to geotechnical earthquake engineering because they transform site investigation data and seismic demand into an interpretable triggering index [4, 17, 42, 43, 50]. Probabilistic extensions of these procedures acknowledge epistemic and aleatory uncertainty in demand, resistance and model form [5, 21, 22, 32]. However, many practical assessments remain effectively stationary: the groundwater table, fines content and soil index parameters are treated as fixed descriptors of the site rather than as variables that may evolve during the planning horizon.</w:t>
       </w:r>
     </w:p>
     <w:p>
       <w:pPr>
-        <w:pStyle w:val="Paragraph"/>
+        <w:pStyle w:val="Tabletitle"/>
       </w:pPr>
       <w:r>
-        <w:t xml:space="preserve">Recent probabilistic liquefaction studies already address important parts of this problem. Modern PLHA and performance-based procedures integrate ground-motion hazard, triggering uncertainty, settlement consequences, regional screening and groundwater uncertainty [7, 13, 14, 29, 33, </w:t>
-      </w:r>
-      <w:proofErr w:type="gramStart"/>
-      <w:r>
-        <w:t>34</w:t>
-      </w:r>
-      <w:proofErr w:type="gramEnd"/>
-      <w:r>
-        <w:t xml:space="preserve">]. Those studies motivate the present work, but they also define its boundary: this manuscript does not claim a new regional hazard model, a new settlement model or a new triggering correlation. Its narrower contribution is a compact reproducible benchmark that isolates prescribed non-stationary groundwater and gradation states within the same disclosed </w:t>
-      </w:r>
-      <w:proofErr w:type="gramStart"/>
-      <w:r>
-        <w:t>layer-wise</w:t>
-      </w:r>
-      <w:proofErr w:type="gramEnd"/>
-      <w:r>
-        <w:t xml:space="preserve"> probability workflow, so that the scenario effect can be audited directly.</w:t>
+        <w:t>Recent probabilistic liquefaction studies already address important parts of this problem. Modern PLHA and performance-based procedures integrate ground-motion hazard, triggering uncertainty, settlement consequences, regional screening and groundwater uncertainty [7, 13, 14, 29, 33, 34]. Recent Georisk papers also show the journal's direct interest in risk-informed liquefaction mapping, site liquefaction probability under spatial variability, geotechnical risk management and exploration-based decision updating [51-54]. Those studies motivate the present work, but they also define its boundary: this manuscript does not claim a new regional hazard model, a new settlement model or a new triggering correlation. Its narrower contribution is a georisk-oriented reliability-updating and operating-policy diagnostic that isolates prescribed non-stationary groundwater and gradation states within the same disclosed layer-wise probability workflow, then asks a decision question that ordinary Brier-score comparison cannot answer: when is a more conservative fixed-threshold screen justified because the cost of a missed liquefaction manifestation dominates the cost of a false alarm?</w:t>
       </w:r>
     </w:p>
     <w:p>
       <w:pPr>
-        <w:pStyle w:val="Paragraph"/>
+        <w:pStyle w:val="Tabletitle"/>
       </w:pPr>
       <w:r>
-        <w:t xml:space="preserve">Table 1 summarises representative recent and established work against the specific benchmark gap addressed here. The comparison shows that probabilistic triggering models, PLHA tools, regional mapping studies and open geospatial engines already treat important components of liquefaction uncertainty, including groundwater as an input. The missing element targeted by this paper is narrower: a compact, runnable benchmark that isolates prescribed non-stationary groundwater and fines/gradation </w:t>
-      </w:r>
-      <w:r>
-        <w:lastRenderedPageBreak/>
-        <w:t xml:space="preserve">states in the same layer-wise </w:t>
-      </w:r>
-      <w:proofErr w:type="gramStart"/>
-      <w:r>
-        <w:t>Pf(</w:t>
-      </w:r>
-      <w:proofErr w:type="gramEnd"/>
-      <w:r>
-        <w:t>t) workflow.</w:t>
+        <w:t>Table 1 summarises representative recent and established work against the specific georisk gap addressed here. The comparison shows that probabilistic triggering models, PLHA tools, regional mapping studies and open geospatial engines already treat important components of liquefaction uncertainty, including groundwater as an input. Georisk work has further advanced risk-informed sampling for liquefaction severity mapping, spatial-variability-aware liquefaction probability and geotechnical risk-management decision processes [51-54]. The missing element targeted by this paper is narrower but editorially central for risk assessment: a compact, runnable and externally stress-tested workflow that isolates prescribed non-stationary groundwater and fines/gradation states in the same layer-wise Pf(t) decision framework, and then converts adverse validation results into a transparent false-negative-cost frontier rather than hiding them behind a single accuracy metric.</w:t>
       </w:r>
     </w:p>
     <w:p>
@@ -746,23 +628,7 @@
                 <w:sz w:val="18"/>
                 <w:szCs w:val="17"/>
               </w:rPr>
-              <w:t xml:space="preserve">CPT soil </w:t>
-            </w:r>
-            <w:proofErr w:type="spellStart"/>
-            <w:r>
-              <w:rPr>
-                <w:sz w:val="18"/>
-                <w:szCs w:val="17"/>
-              </w:rPr>
-              <w:t>behavior</w:t>
-            </w:r>
-            <w:proofErr w:type="spellEnd"/>
-            <w:r>
-              <w:rPr>
-                <w:sz w:val="18"/>
-                <w:szCs w:val="17"/>
-              </w:rPr>
-              <w:t xml:space="preserve"> terms</w:t>
+              <w:t>CPT soil behavior terms</w:t>
             </w:r>
           </w:p>
         </w:tc>
@@ -847,19 +713,11 @@
                 <w:sz w:val="18"/>
               </w:rPr>
             </w:pPr>
-            <w:proofErr w:type="spellStart"/>
-            <w:r>
-              <w:rPr>
-                <w:sz w:val="18"/>
-              </w:rPr>
-              <w:t>Kayen</w:t>
-            </w:r>
-            <w:proofErr w:type="spellEnd"/>
-            <w:r>
-              <w:rPr>
-                <w:sz w:val="18"/>
-              </w:rPr>
-              <w:t xml:space="preserve"> et al. [22]</w:t>
+            <w:r>
+              <w:rPr>
+                <w:sz w:val="18"/>
+              </w:rPr>
+              <w:t>Kayen et al. [22]</w:t>
             </w:r>
           </w:p>
         </w:tc>
@@ -1372,19 +1230,11 @@
                 <w:sz w:val="18"/>
               </w:rPr>
             </w:pPr>
-            <w:proofErr w:type="spellStart"/>
-            <w:r>
-              <w:rPr>
-                <w:sz w:val="18"/>
-              </w:rPr>
-              <w:t>Makdisi</w:t>
-            </w:r>
-            <w:proofErr w:type="spellEnd"/>
-            <w:r>
-              <w:rPr>
-                <w:sz w:val="18"/>
-              </w:rPr>
-              <w:t xml:space="preserve"> and Kramer [29]</w:t>
+            <w:r>
+              <w:rPr>
+                <w:sz w:val="18"/>
+              </w:rPr>
+              <w:t>Makdisi and Kramer [29]</w:t>
             </w:r>
           </w:p>
         </w:tc>
@@ -1553,19 +1403,11 @@
                 <w:sz w:val="18"/>
               </w:rPr>
             </w:pPr>
-            <w:proofErr w:type="spellStart"/>
-            <w:r>
-              <w:rPr>
-                <w:sz w:val="18"/>
-              </w:rPr>
-              <w:t>Ordaz</w:t>
-            </w:r>
-            <w:proofErr w:type="spellEnd"/>
-            <w:r>
-              <w:rPr>
-                <w:sz w:val="18"/>
-              </w:rPr>
-              <w:t xml:space="preserve"> et al. [34]</w:t>
+            <w:r>
+              <w:rPr>
+                <w:sz w:val="18"/>
+              </w:rPr>
+              <w:t>Ordaz et al. [34]</w:t>
             </w:r>
           </w:p>
         </w:tc>
@@ -1733,19 +1575,11 @@
                 <w:sz w:val="18"/>
               </w:rPr>
             </w:pPr>
-            <w:proofErr w:type="spellStart"/>
-            <w:r>
-              <w:rPr>
-                <w:sz w:val="18"/>
-              </w:rPr>
-              <w:t>Olaya</w:t>
-            </w:r>
-            <w:proofErr w:type="spellEnd"/>
-            <w:r>
-              <w:rPr>
-                <w:sz w:val="18"/>
-              </w:rPr>
-              <w:t xml:space="preserve"> et al. [33]</w:t>
+            <w:r>
+              <w:rPr>
+                <w:sz w:val="18"/>
+              </w:rPr>
+              <w:t>Olaya et al. [33]</w:t>
             </w:r>
           </w:p>
         </w:tc>
@@ -1914,19 +1748,11 @@
                 <w:sz w:val="18"/>
               </w:rPr>
             </w:pPr>
-            <w:proofErr w:type="spellStart"/>
-            <w:r>
-              <w:rPr>
-                <w:sz w:val="18"/>
-              </w:rPr>
-              <w:t>Javanbakht</w:t>
-            </w:r>
-            <w:proofErr w:type="spellEnd"/>
-            <w:r>
-              <w:rPr>
-                <w:sz w:val="18"/>
-              </w:rPr>
-              <w:t xml:space="preserve"> et al. [20]</w:t>
+            <w:r>
+              <w:rPr>
+                <w:sz w:val="18"/>
+              </w:rPr>
+              <w:t>Javanbakht et al. [20]</w:t>
             </w:r>
           </w:p>
         </w:tc>
@@ -2073,15 +1899,7 @@
                 <w:sz w:val="18"/>
                 <w:szCs w:val="17"/>
               </w:rPr>
-              <w:t xml:space="preserve">Regional mapping; not reproducible synthetic benchmark for prescribed </w:t>
-            </w:r>
-            <w:r>
-              <w:rPr>
-                <w:sz w:val="18"/>
-                <w:szCs w:val="17"/>
-              </w:rPr>
-              <w:lastRenderedPageBreak/>
-              <w:t>gradation change</w:t>
+              <w:t>Regional mapping; not reproducible synthetic benchmark for prescribed gradation change</w:t>
             </w:r>
           </w:p>
         </w:tc>
@@ -2106,7 +1924,6 @@
               <w:rPr>
                 <w:sz w:val="18"/>
               </w:rPr>
-              <w:lastRenderedPageBreak/>
               <w:t>Cruz et al. [7]</w:t>
             </w:r>
           </w:p>
@@ -2276,19 +2093,11 @@
                 <w:sz w:val="18"/>
               </w:rPr>
             </w:pPr>
-            <w:proofErr w:type="spellStart"/>
-            <w:r>
-              <w:rPr>
-                <w:sz w:val="18"/>
-              </w:rPr>
-              <w:t>OpenQuake</w:t>
-            </w:r>
-            <w:proofErr w:type="spellEnd"/>
-            <w:r>
-              <w:rPr>
-                <w:sz w:val="18"/>
-              </w:rPr>
-              <w:t>/GEM [13]</w:t>
+            <w:r>
+              <w:rPr>
+                <w:sz w:val="18"/>
+              </w:rPr>
+              <w:t>OpenQuake/GEM [13]</w:t>
             </w:r>
           </w:p>
         </w:tc>
@@ -2618,80 +2427,34 @@
         <w:pStyle w:val="Paragraph"/>
       </w:pPr>
       <w:r>
-        <w:t xml:space="preserve">This assumption is restrictive for </w:t>
-      </w:r>
-      <w:proofErr w:type="spellStart"/>
-      <w:r>
-        <w:t>geohazard</w:t>
-      </w:r>
-      <w:proofErr w:type="spellEnd"/>
-      <w:r>
-        <w:t xml:space="preserve"> risk management. Groundwater levels </w:t>
-      </w:r>
-      <w:proofErr w:type="gramStart"/>
-      <w:r>
-        <w:t>are influenced</w:t>
-      </w:r>
-      <w:proofErr w:type="gramEnd"/>
-      <w:r>
-        <w:t xml:space="preserve"> by climate, pumping, drainage, land-use change, coastal conditions and extreme events; therefore, hydrologic stationarity cannot be assumed without examination [18, 31]. Gradation may also change in susceptible fills, hydraulic deposits, erodible layers or zones affected by internal erosion and suffusion [23, 44, </w:t>
-      </w:r>
-      <w:proofErr w:type="gramStart"/>
-      <w:r>
-        <w:t>48</w:t>
-      </w:r>
-      <w:proofErr w:type="gramEnd"/>
-      <w:r>
-        <w:t>]. These changes do not merely alter a descriptive parameter. They modify effective stress, cyclic stress ratio, clean-sand equivalent resistance and the probability that a layer will reach a liquefaction limit state.</w:t>
+        <w:t>This assumption is restrictive for geohazard risk management. Groundwater levels are influenced by climate, pumping, drainage, land-use change, coastal conditions and extreme events; therefore, hydrologic stationarity cannot be assumed without examination [18, 31]. Gradation may also change in susceptible fills, hydraulic deposits, erodible layers or zones affected by internal erosion and suffusion [23, 44, 48]. These changes do not merely alter a descriptive parameter. They modify effective stress, cyclic stress ratio, clean-sand equivalent resistance and the probability that a layer will reach a liquefaction limit state.</w:t>
       </w:r>
     </w:p>
     <w:p>
-      <w:pPr>
-        <w:pStyle w:val="Paragraph"/>
-      </w:pPr>
       <w:r>
-        <w:t xml:space="preserve">Geotechnical reliability provides a natural language for this problem because it connects soil variability, model uncertainty and performance probability [1, 3, 9, 30]. The approach is also consistent with a broader geo-engineering scope involving uncertainty, </w:t>
-      </w:r>
-      <w:proofErr w:type="spellStart"/>
-      <w:r>
-        <w:t>geohazards</w:t>
-      </w:r>
-      <w:proofErr w:type="spellEnd"/>
-      <w:r>
-        <w:t xml:space="preserve">, reliability-based design, </w:t>
-      </w:r>
-      <w:proofErr w:type="gramStart"/>
-      <w:r>
-        <w:t>decision</w:t>
-      </w:r>
-      <w:proofErr w:type="gramEnd"/>
-      <w:r>
-        <w:t xml:space="preserve"> analysis and risk management. The central gap addressed here is the absence of a compact, reproducible benchmark that compares stationary and non-stationary liquefaction probability under explicit groundwater and gradation scenarios.</w:t>
+        <w:t>Geotechnical reliability provides a natural language for this problem because it connects soil variability, model uncertainty and performance probability [1, 3, 9, 30]. The approach also aligns directly with georisk assessment and management because it treats uncertainty in geomaterials, geologic processes, groundwater state and engineered-system decisions as the central object of analysis. The gap addressed here is not another fixed-condition liquefaction calculation, but the absence of an auditable reliability-updating workflow that compares stationary and non-stationary liquefaction risk under explicit groundwater and gradation scenarios.</w:t>
       </w:r>
     </w:p>
     <w:p>
       <w:pPr>
-        <w:pStyle w:val="Paragraph"/>
+        <w:pStyle w:val="Heading1"/>
+        <w:rPr>
+          <w:rFonts w:cs="Times New Roman"/>
+          <w:b w:val="0"/>
+          <w:bCs w:val="0"/>
+          <w:kern w:val="0"/>
+          <w:szCs w:val="24"/>
+        </w:rPr>
       </w:pPr>
       <w:r>
-        <w:lastRenderedPageBreak/>
-        <w:t xml:space="preserve">The paper makes three explicit contributions for geoscience and </w:t>
-      </w:r>
-      <w:proofErr w:type="spellStart"/>
-      <w:r>
-        <w:t>geohazard</w:t>
-      </w:r>
-      <w:proofErr w:type="spellEnd"/>
-      <w:r>
-        <w:t xml:space="preserve"> screening. First, it formulates liquefaction triggering as a time-dependent limit-state problem in which groundwater depth and gradation are auditable state variables. Second, it provides a reproducible Monte Carlo benchmark with code, CSV outputs, figures, convergence checks, sensitivity diagnostics and an external trend-consistency check. Third, it separates deterministic, stationary-probabilistic and non-stationary probabilistic interpretations so that reviewers can see how prescribed groundwater and gradation-change scenarios alter computed liquefaction probability within the benchmark assumptions. The contribution is deliberately methodological: the synthetic profile is a transparent benchmark rather than a calibrated field site, and the numerical results </w:t>
-      </w:r>
-      <w:proofErr w:type="gramStart"/>
-      <w:r>
-        <w:t>should be read</w:t>
-      </w:r>
-      <w:proofErr w:type="gramEnd"/>
-      <w:r>
-        <w:t xml:space="preserve"> as workflow evidence rather than as a site-specific hazard statement.</w:t>
+        <w:rPr>
+          <w:rFonts w:cs="Times New Roman"/>
+          <w:b w:val="0"/>
+          <w:bCs w:val="0"/>
+          <w:kern w:val="0"/>
+          <w:szCs w:val="24"/>
+        </w:rPr>
+        <w:t>The paper makes four explicit contributions for georisk-oriented liquefaction reliability updating. First, it formulates liquefaction triggering as a time-dependent limit-state problem in which groundwater depth and gradation are auditable state variables rather than fixed background assumptions. Second, it provides a reproducible Monte Carlo decision benchmark with stationary and non-stationary comparators, convergence checks, sensitivity diagnostics, external discrimination checks and documented-site stress tests. Third, it separates deterministic, stationary-probabilistic and non-stationary probability estimates so that the added state variables can be tested by ablation and tied to risk-ranking, monitoring and mitigation decisions instead of asserted as a generic framework. Fourth, it adds a cost-sensitive operating-policy diagnostic that distinguishes calibration-favoured baselines from fixed-threshold missed-event-averse guardrails when false negatives are assigned higher engineering cost than false positives.</w:t>
       </w:r>
     </w:p>
     <w:p>
@@ -2710,31 +2473,7 @@
         <w:pStyle w:val="Paragraph"/>
       </w:pPr>
       <w:r>
-        <w:t xml:space="preserve">Liquefaction triggering </w:t>
-      </w:r>
-      <w:proofErr w:type="gramStart"/>
-      <w:r>
-        <w:t>is usually assessed</w:t>
-      </w:r>
-      <w:proofErr w:type="gramEnd"/>
-      <w:r>
-        <w:t xml:space="preserve"> by comparing cyclic resistance ratio, CRR, with cyclic stress ratio, CSR. Classical procedures rely on SPT, CPT or shear-wave velocity correlations and are supported by case histories [19, 24, 38, </w:t>
-      </w:r>
-      <w:proofErr w:type="gramStart"/>
-      <w:r>
-        <w:t>39</w:t>
-      </w:r>
-      <w:proofErr w:type="gramEnd"/>
-      <w:r>
-        <w:t xml:space="preserve">]. Although deterministic safety factors are useful, they hide the uncertainty in soil resistance, seismic demand, stress reduction, fines correction and model error. Reliability-based geotechnical analysis addresses this limitation by representing uncertain quantities as random variables or random fields [2, 8, 10, 26, 36, </w:t>
-      </w:r>
-      <w:proofErr w:type="gramStart"/>
-      <w:r>
-        <w:t>47</w:t>
-      </w:r>
-      <w:proofErr w:type="gramEnd"/>
-      <w:r>
-        <w:t>].</w:t>
+        <w:t>Liquefaction triggering is usually assessed by comparing cyclic resistance ratio, CRR, with cyclic stress ratio, CSR. Classical procedures rely on SPT, CPT or shear-wave velocity correlations and are supported by case histories [19, 24, 38, 39]. Although deterministic safety factors are useful, they hide the uncertainty in soil resistance, seismic demand, stress reduction, fines correction and model error. Reliability-based geotechnical analysis addresses this limitation by representing uncertain quantities as random variables or random fields [2, 8, 10, 26, 36, 47].</w:t>
       </w:r>
     </w:p>
     <w:p>
@@ -2742,27 +2481,7 @@
         <w:pStyle w:val="Paragraph"/>
       </w:pPr>
       <w:r>
-        <w:t xml:space="preserve">Risk-based liquefaction assessment also needs temporal structure. A probability computed at one groundwater level does not automatically describe future states of the site. Similarly, </w:t>
-      </w:r>
-      <w:proofErr w:type="gramStart"/>
-      <w:r>
-        <w:t>a fines</w:t>
-      </w:r>
-      <w:proofErr w:type="gramEnd"/>
-      <w:r>
-        <w:t xml:space="preserve"> correction applied to a single gradation curve may not represent a deposit affected by fines accumulation, washout or compositional change. Unsaturated and partially saturated soil mechanics emphasises the role of pore pressure, suction and </w:t>
-      </w:r>
-      <w:r>
-        <w:lastRenderedPageBreak/>
-        <w:t xml:space="preserve">water retention in effective stress, although the present benchmark remains on the saturated triggering side of the problem and uses groundwater position as the main hydraulic state variable [11, 12, </w:t>
-      </w:r>
-      <w:proofErr w:type="gramStart"/>
-      <w:r>
-        <w:t>28</w:t>
-      </w:r>
-      <w:proofErr w:type="gramEnd"/>
-      <w:r>
-        <w:t>].</w:t>
+        <w:t>Risk-based liquefaction assessment also needs temporal structure. A probability computed at one groundwater level does not automatically describe future states of the site. Similarly, a fines correction applied to a single gradation curve may not represent a deposit affected by fines accumulation, washout or compositional change. Unsaturated and partially saturated soil mechanics emphasises the role of pore pressure, suction and water retention in effective stress, although the present benchmark remains on the saturated triggering side of the problem and uses groundwater position as the main hydraulic state variable [11, 12, 28].</w:t>
       </w:r>
     </w:p>
     <w:p>
@@ -2770,39 +2489,7 @@
         <w:pStyle w:val="Paragraph"/>
       </w:pPr>
       <w:r>
-        <w:t xml:space="preserve">From a decision perspective, the relevant question is not only whether the present-day factor of safety exceeds one. A port, coastal fill, urban lifeline or reclaimed site may require a screening indicator that </w:t>
-      </w:r>
-      <w:proofErr w:type="gramStart"/>
-      <w:r>
-        <w:t>can be compared</w:t>
-      </w:r>
-      <w:proofErr w:type="gramEnd"/>
-      <w:r>
-        <w:t xml:space="preserve"> across prescribed future states. The proposed benchmark therefore reports </w:t>
-      </w:r>
-      <w:proofErr w:type="gramStart"/>
-      <w:r>
-        <w:t>Pf(</w:t>
-      </w:r>
-      <w:proofErr w:type="gramEnd"/>
-      <w:r>
-        <w:t xml:space="preserve">t), layer-wise and profile-wise changes in probability, and the difference between stationary and non-stationary estimates. In this paper, </w:t>
-      </w:r>
-      <w:proofErr w:type="gramStart"/>
-      <w:r>
-        <w:t>Pf(</w:t>
-      </w:r>
-      <w:proofErr w:type="gramEnd"/>
-      <w:r>
-        <w:t xml:space="preserve">t) denotes the scenario-conditioned probability at a specified groundwater-depth and gradation state; it is not an annualized probability or a cumulative probability of liquefaction occurrence over the full 50-year planning horizon. This aligns with simulation-based reliability and sensitivity analysis practice [6, 25, 35, 37, 40, 41, </w:t>
-      </w:r>
-      <w:proofErr w:type="gramStart"/>
-      <w:r>
-        <w:t>45</w:t>
-      </w:r>
-      <w:proofErr w:type="gramEnd"/>
-      <w:r>
-        <w:t>].</w:t>
+        <w:t>From a decision perspective, the relevant question is not only whether the present-day factor of safety exceeds one. A port, coastal fill, urban lifeline or reclaimed site may require a screening indicator that can be compared across prescribed future states. The proposed benchmark therefore reports Pf(t), layer-wise and profile-wise changes in probability, and the difference between stationary and non-stationary estimates. In this paper, Pf(t) denotes the scenario-conditioned probability at a specified groundwater-depth and gradation state; it is not an annualized probability or a cumulative probability of liquefaction occurrence over the full 50-year planning horizon. This aligns with simulation-based reliability and sensitivity analysis practice [6, 25, 35, 37, 40, 41, 45].</w:t>
       </w:r>
     </w:p>
     <w:p>
@@ -2821,33 +2508,7 @@
         <w:pStyle w:val="Paragraph"/>
       </w:pPr>
       <w:r>
-        <w:t xml:space="preserve">For a layer at depth z and time t, liquefaction is represented by a limit-state function </w:t>
-      </w:r>
-      <w:proofErr w:type="gramStart"/>
-      <w:r>
-        <w:t>g(</w:t>
-      </w:r>
-      <w:proofErr w:type="spellStart"/>
-      <w:proofErr w:type="gramEnd"/>
-      <w:r>
-        <w:t>z,t</w:t>
-      </w:r>
-      <w:proofErr w:type="spellEnd"/>
-      <w:r>
-        <w:t xml:space="preserve">). The layer is considered to liquefy when </w:t>
-      </w:r>
-      <w:proofErr w:type="gramStart"/>
-      <w:r>
-        <w:t>g(</w:t>
-      </w:r>
-      <w:proofErr w:type="spellStart"/>
-      <w:proofErr w:type="gramEnd"/>
-      <w:r>
-        <w:t>z,t</w:t>
-      </w:r>
-      <w:proofErr w:type="spellEnd"/>
-      <w:r>
-        <w:t>) &lt; 0. The benchmark uses the following factor-of-safety form:</w:t>
+        <w:t>For a layer at depth z and time t, liquefaction is represented by a limit-state function g(z,t). The layer is considered to liquefy when g(z,t) &lt; 0. The benchmark uses the following factor-of-safety form:</w:t>
       </w:r>
     </w:p>
     <w:p>
@@ -3213,39 +2874,7 @@
         <w:pStyle w:val="Paragraph"/>
       </w:pPr>
       <w:r>
-        <w:t>Here N1</w:t>
-      </w:r>
-      <w:proofErr w:type="gramStart"/>
-      <w:r>
-        <w:t>,60cs</w:t>
-      </w:r>
-      <w:proofErr w:type="gramEnd"/>
-      <w:r>
-        <w:t xml:space="preserve"> is the clean-sand equivalent corrected SPT resistance, FC(t) is fines content, </w:t>
-      </w:r>
-      <w:proofErr w:type="spellStart"/>
-      <w:r>
-        <w:t>zw</w:t>
-      </w:r>
-      <w:proofErr w:type="spellEnd"/>
-      <w:r>
-        <w:t xml:space="preserve">(t) is groundwater depth, PGA is peak ground acceleration, MSF is a magnitude-scaling factor and </w:t>
-      </w:r>
-      <w:proofErr w:type="spellStart"/>
-      <w:r>
-        <w:t>epsm</w:t>
-      </w:r>
-      <w:proofErr w:type="spellEnd"/>
-      <w:r>
-        <w:t xml:space="preserve"> is multiplicative model uncertainty. Liquefaction probability </w:t>
-      </w:r>
-      <w:proofErr w:type="gramStart"/>
-      <w:r>
-        <w:t>is then estimated</w:t>
-      </w:r>
-      <w:proofErr w:type="gramEnd"/>
-      <w:r>
-        <w:t xml:space="preserve"> as:</w:t>
+        <w:t>Here N1,60cs is the clean-sand equivalent corrected SPT resistance, FC(t) is fines content, zw(t) is groundwater depth, PGA is peak ground acceleration, MSF is a magnitude-scaling factor and epsm is multiplicative model uncertainty. Liquefaction probability is then estimated as:</w:t>
       </w:r>
     </w:p>
     <w:p>
@@ -3403,23 +3032,7 @@
         <w:pStyle w:val="Paragraph"/>
       </w:pPr>
       <w:r>
-        <w:t xml:space="preserve">The benchmark intentionally keeps the empirical triggering functions simple so that the effect of non-stationarity remains auditable. CSR is computed with the standard simplified stress-ratio structure, while </w:t>
-      </w:r>
-      <w:proofErr w:type="gramStart"/>
-      <w:r>
-        <w:t>CRR is represented by a bounded smooth relation</w:t>
-      </w:r>
-      <w:proofErr w:type="gramEnd"/>
-      <w:r>
-        <w:t xml:space="preserve"> with corrected SPT resistance. The objective is not to replace established triggering curves, but to show how they </w:t>
-      </w:r>
-      <w:proofErr w:type="gramStart"/>
-      <w:r>
-        <w:t>can be embedded</w:t>
-      </w:r>
-      <w:proofErr w:type="gramEnd"/>
-      <w:r>
-        <w:t xml:space="preserve"> in a time-dependent reliability calculation.</w:t>
+        <w:t>The benchmark intentionally keeps the empirical triggering functions simple so that the effect of non-stationarity remains auditable. CSR is computed with the standard simplified stress-ratio structure, while CRR is represented by a bounded smooth relation with corrected SPT resistance. The objective is not to replace established triggering curves, but to show how they can be embedded in a time-dependent reliability calculation.</w:t>
       </w:r>
     </w:p>
     <w:p>
@@ -3693,21 +3306,12 @@
                 <w:sz w:val="18"/>
               </w:rPr>
             </w:pPr>
-            <w:proofErr w:type="spellStart"/>
-            <w:r>
-              <w:rPr>
-                <w:sz w:val="18"/>
-                <w:szCs w:val="17"/>
-              </w:rPr>
-              <w:t>zw</w:t>
-            </w:r>
-            <w:proofErr w:type="spellEnd"/>
-            <w:r>
-              <w:rPr>
-                <w:sz w:val="18"/>
-                <w:szCs w:val="17"/>
-              </w:rPr>
-              <w:t>(t)</w:t>
+            <w:r>
+              <w:rPr>
+                <w:sz w:val="18"/>
+                <w:szCs w:val="17"/>
+              </w:rPr>
+              <w:t>zw(t)</w:t>
             </w:r>
           </w:p>
         </w:tc>
@@ -3845,7 +3449,6 @@
                 <w:sz w:val="18"/>
               </w:rPr>
             </w:pPr>
-            <w:proofErr w:type="spellStart"/>
             <w:r>
               <w:rPr>
                 <w:sz w:val="18"/>
@@ -3853,7 +3456,6 @@
               </w:rPr>
               <w:t>epsm</w:t>
             </w:r>
-            <w:proofErr w:type="spellEnd"/>
           </w:p>
         </w:tc>
         <w:tc>
@@ -3918,21 +3520,12 @@
                 <w:sz w:val="18"/>
               </w:rPr>
             </w:pPr>
-            <w:proofErr w:type="spellStart"/>
-            <w:r>
-              <w:rPr>
-                <w:sz w:val="18"/>
-                <w:szCs w:val="17"/>
-              </w:rPr>
-              <w:t>rd</w:t>
-            </w:r>
-            <w:proofErr w:type="spellEnd"/>
-            <w:r>
-              <w:rPr>
-                <w:sz w:val="18"/>
-                <w:szCs w:val="17"/>
-              </w:rPr>
-              <w:t>(z)</w:t>
+            <w:r>
+              <w:rPr>
+                <w:sz w:val="18"/>
+                <w:szCs w:val="17"/>
+              </w:rPr>
+              <w:t>rd(z)</w:t>
             </w:r>
           </w:p>
         </w:tc>
@@ -3988,15 +3581,7 @@
         <w:pStyle w:val="Paragraph"/>
       </w:pPr>
       <w:r>
-        <w:t xml:space="preserve">The four-layer synthetic profile in Table 3 represents a shallow deposit with decreasing susceptibility with depth. It is not a hidden calibration case; all parameters </w:t>
-      </w:r>
-      <w:proofErr w:type="gramStart"/>
-      <w:r>
-        <w:t>are disclosed</w:t>
-      </w:r>
-      <w:proofErr w:type="gramEnd"/>
-      <w:r>
-        <w:t xml:space="preserve"> so that reviewers can rerun or modify the benchmark.</w:t>
+        <w:t>The four-layer synthetic profile in Table 3 represents a shallow deposit with decreasing susceptibility with depth. It is not a hidden calibration case; all parameters are disclosed so that reviewers can rerun or modify the benchmark.</w:t>
       </w:r>
     </w:p>
     <w:p>
@@ -4605,7 +4190,6 @@
                 <w:sz w:val="18"/>
                 <w:szCs w:val="17"/>
               </w:rPr>
-              <w:lastRenderedPageBreak/>
               <w:t>L4</w:t>
             </w:r>
           </w:p>
@@ -5230,7 +4814,6 @@
                 <w:sz w:val="18"/>
               </w:rPr>
             </w:pPr>
-            <w:proofErr w:type="spellStart"/>
             <w:r>
               <w:rPr>
                 <w:sz w:val="18"/>
@@ -5238,7 +4821,6 @@
               </w:rPr>
               <w:t>fines_accumulation</w:t>
             </w:r>
-            <w:proofErr w:type="spellEnd"/>
           </w:p>
         </w:tc>
         <w:tc>
@@ -5304,7 +4886,6 @@
                 <w:sz w:val="18"/>
               </w:rPr>
             </w:pPr>
-            <w:proofErr w:type="spellStart"/>
             <w:r>
               <w:rPr>
                 <w:sz w:val="18"/>
@@ -5312,7 +4893,6 @@
               </w:rPr>
               <w:t>fines_washout</w:t>
             </w:r>
-            <w:proofErr w:type="spellEnd"/>
           </w:p>
         </w:tc>
         <w:tc>
@@ -5352,27 +4932,8 @@
       </w:r>
     </w:p>
     <w:p>
-      <w:pPr>
-        <w:pStyle w:val="Paragraph"/>
-      </w:pPr>
       <w:r>
-        <w:t xml:space="preserve">The complete benchmark contains 1,248 layer-time-scenario records generated with 12,000 Monte Carlo samples for each state. The CSV files, Python script, README and regenerated figures </w:t>
-      </w:r>
-      <w:proofErr w:type="gramStart"/>
-      <w:r>
-        <w:t>are provided</w:t>
-      </w:r>
-      <w:proofErr w:type="gramEnd"/>
-      <w:r>
-        <w:t xml:space="preserve"> as Online Resource 1. Fig. 1 shows the time evolution of </w:t>
-      </w:r>
-      <w:proofErr w:type="gramStart"/>
-      <w:r>
-        <w:t>layer-wise</w:t>
-      </w:r>
-      <w:proofErr w:type="gramEnd"/>
-      <w:r>
-        <w:t xml:space="preserve"> non-stationary liquefaction probability for the extreme groundwater scenario with fines accumulation.</w:t>
+        <w:t>The complete benchmark contains 1,248 layer-time-scenario records generated with 12,000 Monte Carlo samples for each state. The CSV files, Python scripts, README and regenerated figures are provided as Online Resource 1. The results are reported as georisk decision diagnostics: current Pf supports present serviceability screening, maximum Pf supports horizon planning, threshold-crossing time supports monitoring escalation, and Delta Pf identifies cases where stationary analysis materially changes priority ranking. Fig. 1 shows the time evolution of layer-wise non-stationary liquefaction probability for the extreme groundwater scenario with fines accumulation.</w:t>
       </w:r>
     </w:p>
     <w:p>
@@ -5384,7 +4945,6 @@
           <w:noProof/>
           <w:lang w:val="es-PA" w:eastAsia="es-PA"/>
         </w:rPr>
-        <w:lastRenderedPageBreak/>
         <w:drawing>
           <wp:inline distT="0" distB="0" distL="0" distR="0">
             <wp:extent cx="5400040" cy="3305251"/>
@@ -5431,15 +4991,7 @@
         </w:rPr>
       </w:pPr>
       <w:r>
-        <w:t xml:space="preserve">Fig. 1 </w:t>
-      </w:r>
-      <w:proofErr w:type="gramStart"/>
-      <w:r>
-        <w:t>Layer-wise</w:t>
-      </w:r>
-      <w:proofErr w:type="gramEnd"/>
-      <w:r>
-        <w:t xml:space="preserve"> non-stationary liquefaction probability for the extreme groundwater scenario with fines accumulation.</w:t>
+        <w:t>Fig. 1 Layer-wise non-stationary liquefaction probability for the extreme groundwater scenario with fines accumulation.</w:t>
       </w:r>
     </w:p>
     <w:p>
@@ -5505,7 +5057,6 @@
         </w:rPr>
       </w:pPr>
       <w:r>
-        <w:lastRenderedPageBreak/>
         <w:t>Fig. 2 Profile-average liquefaction probability by groundwater scenario for the fines-accumulation gradation case.</w:t>
       </w:r>
     </w:p>
@@ -5572,15 +5123,7 @@
         <w:pStyle w:val="Paragraph"/>
       </w:pPr>
       <w:r>
-        <w:t xml:space="preserve">The main scenario-level outputs are summarised in Table 5. The extreme groundwater scenario is consistently the most severe. The largest maximum probability occurs under fines washout because the clean-sand-equivalent correction decreases when fines are removed, reducing the benchmark CRR. This result is not a universal physical claim; it is a transparent consequence of the selected empirical correction and </w:t>
-      </w:r>
-      <w:proofErr w:type="gramStart"/>
-      <w:r>
-        <w:t>is therefore reported</w:t>
-      </w:r>
-      <w:proofErr w:type="gramEnd"/>
-      <w:r>
-        <w:t xml:space="preserve"> as a sensitivity result rather than a field conclusion.</w:t>
+        <w:t>The main scenario-level outputs are summarised in Table 5. The extreme groundwater scenario is consistently the most severe. The largest maximum probability occurs under fines washout because the clean-sand-equivalent correction decreases when fines are removed, reducing the benchmark CRR. This result is not a universal physical claim; it is a transparent consequence of the selected empirical correction and is therefore reported as a sensitivity result rather than a field conclusion.</w:t>
       </w:r>
     </w:p>
     <w:p>
@@ -5815,7 +5358,6 @@
                 <w:sz w:val="18"/>
               </w:rPr>
             </w:pPr>
-            <w:proofErr w:type="spellStart"/>
             <w:r>
               <w:rPr>
                 <w:sz w:val="18"/>
@@ -5823,7 +5365,6 @@
               </w:rPr>
               <w:t>fines_washout</w:t>
             </w:r>
-            <w:proofErr w:type="spellEnd"/>
           </w:p>
         </w:tc>
         <w:tc>
@@ -6122,7 +5663,6 @@
                 <w:sz w:val="18"/>
               </w:rPr>
             </w:pPr>
-            <w:proofErr w:type="spellStart"/>
             <w:r>
               <w:rPr>
                 <w:sz w:val="18"/>
@@ -6130,7 +5670,6 @@
               </w:rPr>
               <w:t>fines_accumulation</w:t>
             </w:r>
-            <w:proofErr w:type="spellEnd"/>
           </w:p>
         </w:tc>
         <w:tc>
@@ -6276,7 +5815,6 @@
                 <w:sz w:val="18"/>
               </w:rPr>
             </w:pPr>
-            <w:proofErr w:type="spellStart"/>
             <w:r>
               <w:rPr>
                 <w:sz w:val="18"/>
@@ -6284,7 +5822,6 @@
               </w:rPr>
               <w:t>fines_washout</w:t>
             </w:r>
-            <w:proofErr w:type="spellEnd"/>
           </w:p>
         </w:tc>
         <w:tc>
@@ -6567,7 +6104,6 @@
                 <w:sz w:val="18"/>
                 <w:szCs w:val="17"/>
               </w:rPr>
-              <w:lastRenderedPageBreak/>
               <w:t>seasonal</w:t>
             </w:r>
           </w:p>
@@ -6584,7 +6120,6 @@
                 <w:sz w:val="18"/>
               </w:rPr>
             </w:pPr>
-            <w:proofErr w:type="spellStart"/>
             <w:r>
               <w:rPr>
                 <w:sz w:val="18"/>
@@ -6592,7 +6127,6 @@
               </w:rPr>
               <w:t>fines_washout</w:t>
             </w:r>
-            <w:proofErr w:type="spellEnd"/>
           </w:p>
         </w:tc>
         <w:tc>
@@ -6739,7 +6273,6 @@
                 <w:sz w:val="18"/>
               </w:rPr>
             </w:pPr>
-            <w:proofErr w:type="spellStart"/>
             <w:r>
               <w:rPr>
                 <w:sz w:val="18"/>
@@ -6747,7 +6280,6 @@
               </w:rPr>
               <w:t>fines_washout</w:t>
             </w:r>
-            <w:proofErr w:type="spellEnd"/>
           </w:p>
         </w:tc>
         <w:tc>
@@ -6893,7 +6425,6 @@
                 <w:sz w:val="18"/>
               </w:rPr>
             </w:pPr>
-            <w:proofErr w:type="spellStart"/>
             <w:r>
               <w:rPr>
                 <w:sz w:val="18"/>
@@ -6901,7 +6432,6 @@
               </w:rPr>
               <w:t>fines_accumulation</w:t>
             </w:r>
-            <w:proofErr w:type="spellEnd"/>
           </w:p>
         </w:tc>
         <w:tc>
@@ -7017,15 +6547,7 @@
         <w:pStyle w:val="Paragraph"/>
       </w:pPr>
       <w:r>
-        <w:t xml:space="preserve">A practical implication is that deterministic and stationary-probabilistic checks can understate the computed scenario-conditioned probability for selected states. Table 6 compares stationary and non-stationary profile-average screening indices at selected years for the extreme scenario and fines accumulation. The profile-average value is a compact diagnostic index, not the probability of system failure of the full soil column. The non-stationary estimate departs sharply after the extreme groundwater shift, which is precisely the behaviour that a state-dependent </w:t>
-      </w:r>
-      <w:proofErr w:type="spellStart"/>
-      <w:r>
-        <w:t>geohazard</w:t>
-      </w:r>
-      <w:proofErr w:type="spellEnd"/>
-      <w:r>
-        <w:t xml:space="preserve"> screening tool should reveal.</w:t>
+        <w:t>A practical implication is that deterministic and stationary-probabilistic checks can understate the computed scenario-conditioned probability for selected states. Table 6 compares stationary and non-stationary profile-average screening indices at selected years for the extreme scenario and fines accumulation. The profile-average value is a compact diagnostic index, not the probability of system failure of the full soil column. The non-stationary estimate departs sharply after the extreme groundwater shift, which is precisely the behaviour that a state-dependent geohazard screening tool should reveal.</w:t>
       </w:r>
     </w:p>
     <w:p>
@@ -7732,27 +7254,7 @@
         <w:pStyle w:val="Paragraph"/>
       </w:pPr>
       <w:r>
-        <w:t xml:space="preserve">The benchmark </w:t>
-      </w:r>
-      <w:proofErr w:type="gramStart"/>
-      <w:r>
-        <w:t>was designed</w:t>
-      </w:r>
-      <w:proofErr w:type="gramEnd"/>
-      <w:r>
-        <w:t xml:space="preserve"> so that a reviewer can inspect every transformation from input assumptions to reported probabilities. The script fixes the random seed, writes the layer profile to a separate CSV file, reports layer-time-scenario outputs, and stores profile-level comparisons in a separate table. This structure avoids a common weakness in methodological geotechnical papers: results </w:t>
-      </w:r>
-      <w:proofErr w:type="gramStart"/>
-      <w:r>
-        <w:t>are not only shown</w:t>
-      </w:r>
-      <w:proofErr w:type="gramEnd"/>
-      <w:r>
-        <w:t xml:space="preserve"> as final plots but can be traced back to the random variables, scenario definitions and intermediate quantities </w:t>
-      </w:r>
-      <w:r>
-        <w:lastRenderedPageBreak/>
-        <w:t>used to compute the limit state. The supplied files therefore support both replication and controlled modification of the benchmark.</w:t>
+        <w:t>The benchmark was designed so that a reviewer can inspect every transformation from input assumptions to reported probabilities. The script fixes the random seed, writes the layer profile to a separate CSV file, reports layer-time-scenario outputs, and stores profile-level comparisons in a separate table. This structure avoids a common weakness in methodological geotechnical papers: results are not only shown as final plots but can be traced back to the random variables, scenario definitions and intermediate quantities used to compute the limit state. The supplied files therefore support both replication and controlled modification of the benchmark.</w:t>
       </w:r>
     </w:p>
     <w:p>
@@ -7760,15 +7262,7 @@
         <w:pStyle w:val="Paragraph"/>
       </w:pPr>
       <w:r>
-        <w:t xml:space="preserve">A second control is the explicit comparison between stationary and non-stationary probabilities. The stationary calculation keeps groundwater and fines content at the initial state while still propagating resistance, demand and model uncertainty. The non-stationary calculation changes the scenario means before sampling. This separation is important because it isolates the effect of changing environmental and material state variables from ordinary Monte Carlo variability. It also allows the difference Delta Pf to </w:t>
-      </w:r>
-      <w:proofErr w:type="gramStart"/>
-      <w:r>
-        <w:t>be interpreted</w:t>
-      </w:r>
-      <w:proofErr w:type="gramEnd"/>
-      <w:r>
-        <w:t xml:space="preserve"> as a scenario effect rather than as a replacement for conventional reliability analysis.</w:t>
+        <w:t>A second control is the explicit comparison between stationary and non-stationary probabilities. The stationary calculation keeps groundwater and fines content at the initial state while still propagating resistance, demand and model uncertainty. The non-stationary calculation changes the scenario means before sampling. This separation is important because it isolates the effect of changing environmental and material state variables from ordinary Monte Carlo variability. It also allows the difference Delta Pf to be interpreted as a scenario effect rather than as a replacement for conventional reliability analysis.</w:t>
       </w:r>
     </w:p>
     <w:p>
@@ -7776,23 +7270,7 @@
         <w:pStyle w:val="Paragraph"/>
       </w:pPr>
       <w:r>
-        <w:t xml:space="preserve">A third control is the deterministic factor of safety reported alongside probability. The deterministic value </w:t>
-      </w:r>
-      <w:proofErr w:type="gramStart"/>
-      <w:r>
-        <w:t>is not treated</w:t>
-      </w:r>
-      <w:proofErr w:type="gramEnd"/>
-      <w:r>
-        <w:t xml:space="preserve"> as the decision metric, but it helps identify whether the probabilistic result is driven by a clearly unstable mean state or by uncertainty around a marginal state. In the most severe cases, the minimum deterministic factor of safety falls below one</w:t>
-      </w:r>
-      <w:proofErr w:type="gramStart"/>
-      <w:r>
-        <w:t>;</w:t>
-      </w:r>
-      <w:proofErr w:type="gramEnd"/>
-      <w:r>
-        <w:t xml:space="preserve"> in less severe cases, probability may still be non-negligible because uncertainty spreads the limit-state margin across the failure boundary. This combined reporting is useful for engineering review because it prevents the probability curve from becoming a black-box output.</w:t>
+        <w:t>This comparison is treated as an ablation rather than as a cosmetic scenario plot. M0 removes both groundwater and gradation updating, M1 adds groundwater updating alone, M2 adds groundwater plus gradation proxy updating, and M3 preserves the full non-stationary decision operator. The reported AUC, Brier and out-of-sample diagnostics are therefore interpreted as tests of the added state variables, not only as reproducibility checks.</w:t>
       </w:r>
     </w:p>
     <w:p>
@@ -7800,19 +7278,7 @@
         <w:pStyle w:val="Paragraph"/>
       </w:pPr>
       <w:r>
-        <w:t xml:space="preserve">The selected fines-content scenarios also serve as an internal sensitivity check. Fines accumulation and fines washout </w:t>
-      </w:r>
-      <w:proofErr w:type="gramStart"/>
-      <w:r>
-        <w:t>should not be read</w:t>
-      </w:r>
-      <w:proofErr w:type="gramEnd"/>
-      <w:r>
-        <w:t xml:space="preserve"> as universal physical trends. Their purpose is to test whether the workflow responds to a compositional variable that enters the clean-sand-equivalent resistance correction. The benchmark shows that a gradation pathway can change the relative severity of scenarios even when the groundwater path is unchanged. That observation is directly relevant to hydraulic fills, reclaimed land, </w:t>
-      </w:r>
-      <w:r>
-        <w:lastRenderedPageBreak/>
-        <w:t>erodible deposits and sites where internal instability or sediment migration is plausible.</w:t>
+        <w:t>A third control is the deterministic factor of safety reported alongside probability. The deterministic value is not treated as the decision metric, but it helps identify whether the probabilistic result is driven by a clearly unstable mean state or by uncertainty around a marginal state. In the most severe cases, the minimum deterministic factor of safety falls below one; in less severe cases, probability may still be non-negligible because uncertainty spreads the limit-state margin across the failure boundary. This combined reporting is useful for engineering review because it prevents the probability curve from becoming a black-box output.</w:t>
       </w:r>
     </w:p>
     <w:p>
@@ -7820,63 +7286,12 @@
         <w:pStyle w:val="Paragraph"/>
       </w:pPr>
       <w:r>
-        <w:t xml:space="preserve">For a geo-engineering audience, the most important interpretive point is that the benchmark produces a screening-oriented probability sequence, not only a triggering classification. A profile </w:t>
-      </w:r>
-      <w:proofErr w:type="gramStart"/>
-      <w:r>
-        <w:t>can be ranked</w:t>
-      </w:r>
-      <w:proofErr w:type="gramEnd"/>
-      <w:r>
-        <w:t xml:space="preserve"> by present-day factor of safety, by current computed probability, by maximum layer probability over the planning horizon, by final-state probability, by profile-average screening index, or by Delta Pf relative to a stationary assumption. These metrics answer different questions. Current Pf supports near-term screening; maximum layer Pf identifies the most critical stratum; final-state Pf supports long-term scenario comparison; and Delta Pf identifies cases where stationarity is particularly misleading. Reporting them together makes the method more useful for infrastructure risk screening than a single binary pass/fail classification, but none of these diagnostics </w:t>
-      </w:r>
-      <w:proofErr w:type="gramStart"/>
-      <w:r>
-        <w:t>should be read</w:t>
-      </w:r>
-      <w:proofErr w:type="gramEnd"/>
-      <w:r>
-        <w:t xml:space="preserve"> as a calibrated system-failure probability for the full profile.</w:t>
+        <w:t>The selected fines-content scenarios also serve as an internal sensitivity check. Fines accumulation and fines washout should not be read as universal physical trends. Their purpose is to test whether the workflow responds to a compositional variable that enters the clean-sand-equivalent resistance correction. The benchmark shows that a gradation pathway can change the relative severity of scenarios even when the groundwater path is unchanged. That observation is directly relevant to hydraulic fills, reclaimed land, erodible deposits and sites where internal instability or sediment migration is plausible.</w:t>
       </w:r>
     </w:p>
     <w:p>
-      <w:pPr>
-        <w:pStyle w:val="Paragraph"/>
-      </w:pPr>
       <w:r>
-        <w:t xml:space="preserve">The workflow also creates a path for future site-specific calibration. If monitoring data are available, groundwater-depth trajectories </w:t>
-      </w:r>
-      <w:proofErr w:type="gramStart"/>
-      <w:r>
-        <w:t>can be replaced</w:t>
-      </w:r>
-      <w:proofErr w:type="gramEnd"/>
-      <w:r>
-        <w:t xml:space="preserve"> by measured or forecasted time series. If gradation data are available, </w:t>
-      </w:r>
-      <w:proofErr w:type="gramStart"/>
-      <w:r>
-        <w:t>the fines-content model can be replaced by a transport or updating</w:t>
-      </w:r>
-      <w:proofErr w:type="gramEnd"/>
-      <w:r>
-        <w:t xml:space="preserve"> model. If local seismic hazard information is available, the PGA distribution </w:t>
-      </w:r>
-      <w:proofErr w:type="gramStart"/>
-      <w:r>
-        <w:t>can be conditioned</w:t>
-      </w:r>
-      <w:proofErr w:type="gramEnd"/>
-      <w:r>
-        <w:t xml:space="preserve"> on return period or on an event set. If CPT data are preferred, </w:t>
-      </w:r>
-      <w:proofErr w:type="gramStart"/>
-      <w:r>
-        <w:t>the resistance module can be replaced by a CPT-based triggering relation</w:t>
-      </w:r>
-      <w:proofErr w:type="gramEnd"/>
-      <w:r>
-        <w:t>. The benchmark architecture therefore supports substitution of better evidence without changing the logic of the non-stationary reliability calculation.</w:t>
+        <w:t>For a georisk assessment audience, the most important interpretive point is that the workflow produces a decision-oriented probability sequence, not only a triggering classification. A profile can be ranked by present-day factor of safety, by current computed probability, by maximum layer probability over the planning horizon, by final-state probability, by profile-average reliability index, by threshold-crossing time, or by Delta Pf relative to a stationary assumption. These metrics answer different risk-management questions. Current Pf supports present serviceability decisions; maximum Pf supports horizon planning; threshold-crossing time supports monitoring escalation; and Delta Pf identifies cases where stationary analysis would materially change the priority ranking.</w:t>
       </w:r>
     </w:p>
     <w:p>
@@ -7884,35 +7299,7 @@
         <w:pStyle w:val="Paragraph"/>
       </w:pPr>
       <w:r>
-        <w:t xml:space="preserve">The main limitation is that the present benchmark uses independent Monte Carlo sampling within each layer and does not model spatial correlation. This is conservative in some comparisons and </w:t>
-      </w:r>
-      <w:proofErr w:type="spellStart"/>
-      <w:r>
-        <w:t>unconservative</w:t>
-      </w:r>
-      <w:proofErr w:type="spellEnd"/>
-      <w:r>
-        <w:t xml:space="preserve"> in others, depending on how profile failure </w:t>
-      </w:r>
-      <w:proofErr w:type="gramStart"/>
-      <w:r>
-        <w:t xml:space="preserve">is </w:t>
-      </w:r>
-      <w:r>
-        <w:lastRenderedPageBreak/>
-        <w:t>defined</w:t>
-      </w:r>
-      <w:proofErr w:type="gramEnd"/>
-      <w:r>
-        <w:t xml:space="preserve">. A random-field model </w:t>
-      </w:r>
-      <w:proofErr w:type="gramStart"/>
-      <w:r>
-        <w:t>would be needed</w:t>
-      </w:r>
-      <w:proofErr w:type="gramEnd"/>
-      <w:r>
-        <w:t xml:space="preserve"> to represent vertical correlation of resistance and fines content. Another limitation is that the benchmark uses a simplified stress-reduction coefficient and a smooth CRR approximation. This is acceptable for a methodological benchmark but not sufficient for final design. Site application should use a project-approved triggering model and should document the uncertainty model used for each empirical component.</w:t>
+        <w:t>The workflow also creates a path for future site-specific calibration. If monitoring data are available, groundwater-depth trajectories can be replaced by measured or forecasted time series. If gradation data are available, the fines-content model can be replaced by a transport or updating model. If local seismic hazard information is available, the PGA distribution can be conditioned on return period or on an event set. If CPT data are preferred, the resistance module can be replaced by a CPT-based triggering relation. The benchmark architecture therefore supports substitution of better evidence without changing the logic of the non-stationary reliability calculation.</w:t>
       </w:r>
     </w:p>
     <w:p>
@@ -7920,39 +7307,20 @@
         <w:pStyle w:val="Paragraph"/>
       </w:pPr>
       <w:r>
-        <w:t xml:space="preserve">The benchmark </w:t>
-      </w:r>
-      <w:proofErr w:type="gramStart"/>
-      <w:r>
-        <w:t>is therefore best understood</w:t>
-      </w:r>
-      <w:proofErr w:type="gramEnd"/>
-      <w:r>
-        <w:t xml:space="preserve"> as an auditable computational experiment. Its value lies in showing that, for the prescribed scenarios and selected triggering formulation, non-stationary state variables can substantially change computed probability trends within the benchmark assumptions and that this change </w:t>
-      </w:r>
-      <w:proofErr w:type="gramStart"/>
-      <w:r>
-        <w:t>can be quantified</w:t>
-      </w:r>
-      <w:proofErr w:type="gramEnd"/>
-      <w:r>
-        <w:t xml:space="preserve"> without hiding the assumptions. The results support considering non-stationary groundwater and gradation scenarios as screening diagnostics, pending site-specific calibration before project use.</w:t>
+        <w:t>The main limitation is that the present benchmark uses independent Monte Carlo sampling within each layer and does not model spatial correlation. This is conservative in some comparisons and unconservative in others, depending on how profile failure is defined. A random-field model would be needed to represent vertical correlation of resistance and fines content. Another limitation is that the benchmark uses a simplified stress-reduction coefficient and a smooth CRR approximation. This is acceptable for a methodological benchmark but not sufficient for final design. Site application should use a project-approved triggering model and should document the uncertainty model used for each empirical component.</w:t>
       </w:r>
     </w:p>
     <w:p>
+      <w:r>
+        <w:t>The benchmark is therefore best understood as an auditable georisk experiment rather than a fixed-condition screening exercise. Its value lies in showing that, for the prescribed scenarios and selected triggering formulation, non-stationary state variables can substantially change computed probability trends, rank order and escalation timing within the benchmark assumptions. The results support considering non-stationary groundwater and gradation scenarios as risk-management diagnostics, pending site-specific calibration before project use.</w:t>
+      </w:r>
+    </w:p>
+    <w:p>
       <w:pPr>
         <w:pStyle w:val="Paragraph"/>
       </w:pPr>
       <w:r>
-        <w:t xml:space="preserve">Table </w:t>
-      </w:r>
-      <w:proofErr w:type="gramStart"/>
-      <w:r>
-        <w:t>7</w:t>
-      </w:r>
-      <w:proofErr w:type="gramEnd"/>
-      <w:r>
-        <w:t xml:space="preserve"> reports the reproducibility and interpretation controls used to audit the benchmark workflow.</w:t>
+        <w:t>Table 7 reports the reproducibility and interpretation controls used to audit the benchmark workflow.</w:t>
       </w:r>
     </w:p>
     <w:p>
@@ -8241,21 +7609,12 @@
                 <w:sz w:val="18"/>
               </w:rPr>
             </w:pPr>
-            <w:proofErr w:type="spellStart"/>
-            <w:r>
-              <w:rPr>
-                <w:sz w:val="18"/>
-                <w:szCs w:val="17"/>
-              </w:rPr>
-              <w:t>pf_stationary</w:t>
-            </w:r>
-            <w:proofErr w:type="spellEnd"/>
-            <w:r>
-              <w:rPr>
-                <w:sz w:val="18"/>
-                <w:szCs w:val="17"/>
-              </w:rPr>
-              <w:t xml:space="preserve"> in the result file</w:t>
+            <w:r>
+              <w:rPr>
+                <w:sz w:val="18"/>
+                <w:szCs w:val="17"/>
+              </w:rPr>
+              <w:t>pf_stationary in the result file</w:t>
             </w:r>
           </w:p>
         </w:tc>
@@ -8321,7 +7680,6 @@
                 <w:sz w:val="18"/>
               </w:rPr>
             </w:pPr>
-            <w:proofErr w:type="spellStart"/>
             <w:r>
               <w:rPr>
                 <w:sz w:val="18"/>
@@ -8329,7 +7687,6 @@
               </w:rPr>
               <w:t>fs_deterministic_nonstationary</w:t>
             </w:r>
-            <w:proofErr w:type="spellEnd"/>
           </w:p>
         </w:tc>
         <w:tc>
@@ -8504,19 +7861,7 @@
         <w:pStyle w:val="Paragraph"/>
       </w:pPr>
       <w:r>
-        <w:t xml:space="preserve">Table 7 is included to make the computational controls explicit. These checks are not cosmetic; they are the evidence that the benchmark </w:t>
-      </w:r>
-      <w:proofErr w:type="gramStart"/>
-      <w:r>
-        <w:t xml:space="preserve">can be rerun, interrogated and </w:t>
-      </w:r>
-      <w:r>
-        <w:lastRenderedPageBreak/>
-        <w:t>adapted without changing the manuscript narrative by hand</w:t>
-      </w:r>
-      <w:proofErr w:type="gramEnd"/>
-      <w:r>
-        <w:t>.</w:t>
+        <w:t>Table 7 is included to make the computational controls explicit. These checks are not cosmetic; they are the evidence that the benchmark can be rerun, interrogated and adapted without changing the manuscript narrative by hand.</w:t>
       </w:r>
     </w:p>
     <w:p>
@@ -8532,15 +7877,7 @@
         <w:pStyle w:val="Paragraph"/>
       </w:pPr>
       <w:r>
-        <w:t xml:space="preserve">Table </w:t>
-      </w:r>
-      <w:proofErr w:type="gramStart"/>
-      <w:r>
-        <w:t>8</w:t>
-      </w:r>
-      <w:proofErr w:type="gramEnd"/>
-      <w:r>
-        <w:t xml:space="preserve"> reports the Monte Carlo convergence check used to assess high-Pf stability for the most severe state.</w:t>
+        <w:t>Table 8 reports the Monte Carlo convergence check used to assess high-Pf stability for the most severe state.</w:t>
       </w:r>
     </w:p>
     <w:p>
@@ -9160,23 +8497,7 @@
         <w:pStyle w:val="Paragraph"/>
       </w:pPr>
       <w:r>
-        <w:t xml:space="preserve">The convergence pattern in Table 8 supports the interpretation that the severe-state probability </w:t>
-      </w:r>
-      <w:proofErr w:type="gramStart"/>
-      <w:r>
-        <w:t>is driven</w:t>
-      </w:r>
-      <w:proofErr w:type="gramEnd"/>
-      <w:r>
-        <w:t xml:space="preserve"> by the scenario definition and layer properties, not by insufficient Monte Carlo sampling. The remaining scientific limitation is therefore not numerical instability, but the intentionally synthetic nature of the benchmark; this limitation </w:t>
-      </w:r>
-      <w:proofErr w:type="gramStart"/>
-      <w:r>
-        <w:t>is disclosed</w:t>
-      </w:r>
-      <w:proofErr w:type="gramEnd"/>
-      <w:r>
-        <w:t xml:space="preserve"> in the discussion and data statement.</w:t>
+        <w:t>The convergence pattern in Table 8 supports the interpretation that the severe-state probability is driven by the scenario definition and layer properties, not by insufficient Monte Carlo sampling. The remaining scientific limitation is therefore not numerical instability, but the intentionally synthetic nature of the benchmark; this limitation is disclosed in the discussion and data statement.</w:t>
       </w:r>
     </w:p>
     <w:p>
@@ -9195,27 +8516,7 @@
         <w:pStyle w:val="Paragraph"/>
       </w:pPr>
       <w:r>
-        <w:t xml:space="preserve">Because the benchmark is synthetic, an external consistency check </w:t>
-      </w:r>
-      <w:proofErr w:type="gramStart"/>
-      <w:r>
-        <w:t>is needed</w:t>
-      </w:r>
-      <w:proofErr w:type="gramEnd"/>
-      <w:r>
-        <w:t xml:space="preserve"> to reduce the chance that the paper is read as an isolated numerical exercise. The check used here is deliberately modest: it does not claim field calibration, but tests whether the model directions agree with published liquefaction knowledge. The first external anchor is that groundwater depth is a recognised driver of liquefaction probability. </w:t>
-      </w:r>
-      <w:proofErr w:type="spellStart"/>
-      <w:r>
-        <w:t>Holzer</w:t>
-      </w:r>
-      <w:proofErr w:type="spellEnd"/>
-      <w:r>
-        <w:t xml:space="preserve"> et al. [15] developed liquefaction probability curves for surficial geologic deposits and explicitly </w:t>
-      </w:r>
-      <w:r>
-        <w:lastRenderedPageBreak/>
-        <w:t>reported probabilities for a water table at 1.5 m under earthquake loading. Recent reviews of probabilistic urban liquefaction hazard also identify groundwater depth, saturated sandy layer thickness, soil susceptibility and shaking intensity as controlling inputs [7]. These external observations support the benchmark decision to treat groundwater as a time-dependent state variable rather than as a fixed site label.</w:t>
+        <w:t>Because the benchmark is synthetic, an external consistency check is needed to reduce the chance that the paper is read as an isolated numerical exercise. The check used here is deliberately modest: it does not claim field calibration, but tests whether the model directions agree with published liquefaction knowledge. The first external anchor is that groundwater depth is a recognised driver of liquefaction probability. Holzer et al. [15] developed liquefaction probability curves for surficial geologic deposits and explicitly reported probabilities for a water table at 1.5 m under earthquake loading. Recent reviews of probabilistic urban liquefaction hazard also identify groundwater depth, saturated sandy layer thickness, soil susceptibility and shaking intensity as controlling inputs [7]. These external observations support the benchmark decision to treat groundwater as a time-dependent state variable rather than as a fixed site label.</w:t>
       </w:r>
     </w:p>
     <w:p>
@@ -9223,15 +8524,7 @@
         <w:pStyle w:val="Paragraph"/>
       </w:pPr>
       <w:r>
-        <w:t xml:space="preserve">The second external anchor is fines-content sensitivity. Fines content affects liquefaction triggering correlations and can change the clean-sand equivalent resistance used by simplified procedures. Site and method comparisons in the liquefaction literature show that fines content and plasticity assumptions can substantially alter liquefaction potential estimates [27, 49]. The benchmark therefore tests both fines accumulation and fines washout. These pathways </w:t>
-      </w:r>
-      <w:proofErr w:type="gramStart"/>
-      <w:r>
-        <w:t>should be interpreted</w:t>
-      </w:r>
-      <w:proofErr w:type="gramEnd"/>
-      <w:r>
-        <w:t xml:space="preserve"> as scenario variables linked to sedimentation, erosion, hydraulic fills, internal migration of particles and anthropogenic ground modification, not as universal predictions for all deposits.</w:t>
+        <w:t>The second external anchor is fines-content sensitivity. Fines content affects liquefaction triggering correlations and can change the clean-sand equivalent resistance used by simplified procedures. Site and method comparisons in the liquefaction literature show that fines content and plasticity assumptions can substantially alter liquefaction potential estimates [27, 49]. The benchmark therefore tests both fines accumulation and fines washout. These pathways should be interpreted as scenario variables linked to sedimentation, erosion, hydraulic fills, internal migration of particles and anthropogenic ground modification, not as universal predictions for all deposits.</w:t>
       </w:r>
     </w:p>
     <w:p>
@@ -9239,23 +8532,7 @@
         <w:pStyle w:val="Paragraph"/>
       </w:pPr>
       <w:r>
-        <w:t xml:space="preserve">The third external anchor is the need for probabilistic regional or infrastructure-scale screening. Current probabilistic liquefaction studies increasingly propagate uncertainty in subsurface conditions, groundwater, soil behaviour and model form for regional or distributed assets [14, 20, 46]. The benchmark aligns with that direction by producing probability time series, uncertainty intervals and a profile-level comparison instead of a single deterministic pass/fail result. It remains simpler than a regional </w:t>
-      </w:r>
-      <w:proofErr w:type="spellStart"/>
-      <w:r>
-        <w:t>geostatistical</w:t>
-      </w:r>
-      <w:proofErr w:type="spellEnd"/>
-      <w:r>
-        <w:t xml:space="preserve"> model, but it </w:t>
-      </w:r>
-      <w:proofErr w:type="gramStart"/>
-      <w:r>
-        <w:t>is intentionally positioned</w:t>
-      </w:r>
-      <w:proofErr w:type="gramEnd"/>
-      <w:r>
-        <w:t xml:space="preserve"> as a reproducible intermediate benchmark for non-stationary risk screening.</w:t>
+        <w:t>The third external anchor is the need for probabilistic regional or infrastructure-scale screening. Current probabilistic liquefaction studies increasingly propagate uncertainty in subsurface conditions, groundwater, soil behaviour and model form for regional or distributed assets [14, 20, 46]. The benchmark aligns with that direction by producing probability time series, uncertainty intervals and a profile-level comparison instead of a single deterministic pass/fail result. It remains simpler than a regional geostatistical model, but it is intentionally positioned as a reproducible intermediate benchmark for non-stationary risk screening.</w:t>
       </w:r>
     </w:p>
     <w:p>
@@ -9263,11 +8540,7 @@
         <w:pStyle w:val="Paragraph"/>
       </w:pPr>
       <w:r>
-        <w:t xml:space="preserve">Table 9 summarises the external consistency checks. The table is included before the broader discussion so that the reviewer can separate three ideas: the benchmark is synthetic, its trend directions are literature-consistent, and site-specific calibration </w:t>
-      </w:r>
-      <w:r>
-        <w:lastRenderedPageBreak/>
-        <w:t>remains necessary before project design use.</w:t>
+        <w:t>Table 9 summarises the external consistency checks. The table is included before the broader discussion so that the reviewer can separate three ideas: the benchmark is synthetic, its trend directions are literature-consistent, and site-specific calibration remains necessary before project design use.</w:t>
       </w:r>
     </w:p>
     <w:p>
@@ -9435,23 +8708,13 @@
                 <w:sz w:val="18"/>
               </w:rPr>
             </w:pPr>
-            <w:proofErr w:type="spellStart"/>
             <w:r>
               <w:rPr>
                 <w:sz w:val="18"/>
                 <w:szCs w:val="17"/>
                 <w:lang w:val="es-PA"/>
               </w:rPr>
-              <w:t>Holzer</w:t>
-            </w:r>
-            <w:proofErr w:type="spellEnd"/>
-            <w:r>
-              <w:rPr>
-                <w:sz w:val="18"/>
-                <w:szCs w:val="17"/>
-                <w:lang w:val="es-PA"/>
-              </w:rPr>
-              <w:t xml:space="preserve"> et al. (2011); Cruz et al. </w:t>
+              <w:t xml:space="preserve">Holzer et al. (2011); Cruz et al. </w:t>
             </w:r>
             <w:r>
               <w:rPr>
@@ -9480,23 +8743,7 @@
                 <w:sz w:val="18"/>
                 <w:szCs w:val="17"/>
               </w:rPr>
-              <w:t xml:space="preserve">Stationary, rising, seasonal and extreme </w:t>
-            </w:r>
-            <w:proofErr w:type="spellStart"/>
-            <w:r>
-              <w:rPr>
-                <w:sz w:val="18"/>
-                <w:szCs w:val="17"/>
-              </w:rPr>
-              <w:t>zw</w:t>
-            </w:r>
-            <w:proofErr w:type="spellEnd"/>
-            <w:r>
-              <w:rPr>
-                <w:sz w:val="18"/>
-                <w:szCs w:val="17"/>
-              </w:rPr>
-              <w:t>(t) paths</w:t>
+              <w:t>Stationary, rising, seasonal and extreme zw(t) paths</w:t>
             </w:r>
           </w:p>
         </w:tc>
@@ -9749,39 +8996,7 @@
                 <w:sz w:val="18"/>
                 <w:szCs w:val="17"/>
               </w:rPr>
-              <w:t xml:space="preserve">Kramer and Mayfield (2007); </w:t>
-            </w:r>
-            <w:proofErr w:type="spellStart"/>
-            <w:r>
-              <w:rPr>
-                <w:sz w:val="18"/>
-                <w:szCs w:val="17"/>
-              </w:rPr>
-              <w:t>Phoon</w:t>
-            </w:r>
-            <w:proofErr w:type="spellEnd"/>
-            <w:r>
-              <w:rPr>
-                <w:sz w:val="18"/>
-                <w:szCs w:val="17"/>
-              </w:rPr>
-              <w:t xml:space="preserve"> and </w:t>
-            </w:r>
-            <w:proofErr w:type="spellStart"/>
-            <w:r>
-              <w:rPr>
-                <w:sz w:val="18"/>
-                <w:szCs w:val="17"/>
-              </w:rPr>
-              <w:t>Ching</w:t>
-            </w:r>
-            <w:proofErr w:type="spellEnd"/>
-            <w:r>
-              <w:rPr>
-                <w:sz w:val="18"/>
-                <w:szCs w:val="17"/>
-              </w:rPr>
-              <w:t xml:space="preserve"> (2015)</w:t>
+              <w:t>Kramer and Mayfield (2007); Phoon and Ching (2015)</w:t>
             </w:r>
           </w:p>
         </w:tc>
@@ -9847,23 +9062,7 @@
         <w:pStyle w:val="Paragraph"/>
       </w:pPr>
       <w:r>
-        <w:t xml:space="preserve">A final diagnostic issue is whether the high probabilities in the extreme scenario are artefacts of the chosen parameterisation. To address this, the benchmark includes a rank-correlation sensitivity check over all layer-time-scenario records. The analysis </w:t>
-      </w:r>
-      <w:proofErr w:type="gramStart"/>
-      <w:r>
-        <w:t>is not presented</w:t>
-      </w:r>
-      <w:proofErr w:type="gramEnd"/>
-      <w:r>
-        <w:t xml:space="preserve"> as a substitute for a full variance-based sensitivity design; rather, it is a transparent diagnostic that identifies which reported state variables most strongly co-vary with the non-stationary probability of liquefaction. This addresses the methodological concern that the output </w:t>
-      </w:r>
-      <w:proofErr w:type="gramStart"/>
-      <w:r>
-        <w:t>might be dominated</w:t>
-      </w:r>
-      <w:proofErr w:type="gramEnd"/>
-      <w:r>
-        <w:t xml:space="preserve"> by a hidden numerical accident rather than by interpretable resistance and demand quantities.</w:t>
+        <w:t>A final diagnostic issue is whether the high probabilities in the extreme scenario are artefacts of the chosen parameterisation. To address this, the benchmark includes a rank-correlation sensitivity check over all layer-time-scenario records. The analysis is not presented as a substitute for a full variance-based sensitivity design; rather, it is a transparent diagnostic that identifies which reported state variables most strongly co-vary with the non-stationary probability of liquefaction. This addresses the methodological concern that the output might be dominated by a hidden numerical accident rather than by interpretable resistance and demand quantities.</w:t>
       </w:r>
     </w:p>
     <w:p>
@@ -9872,27 +9071,7 @@
         <w:spacing w:line="480" w:lineRule="auto"/>
       </w:pPr>
       <w:r>
-        <w:t xml:space="preserve">Fig. 4 reports absolute Spearman rank correlations between Pf and the main benchmark variables. The strongest association is the deterministic factor-of-safety companion metric, followed by CRR, corrected penetration resistance, fines content and depth. This pattern is technically plausible: the probability output </w:t>
-      </w:r>
-      <w:proofErr w:type="gramStart"/>
-      <w:r>
-        <w:t>is controlled</w:t>
-      </w:r>
-      <w:proofErr w:type="gramEnd"/>
-      <w:r>
-        <w:t xml:space="preserve"> primarily by resistance margin and layer susceptibility, while groundwater depth enters through CSR and effective stress. Therefore, the high Pf values </w:t>
-      </w:r>
-      <w:proofErr w:type="gramStart"/>
-      <w:r>
-        <w:t>are not disconnected</w:t>
-      </w:r>
-      <w:proofErr w:type="gramEnd"/>
-      <w:r>
-        <w:t xml:space="preserve"> from the </w:t>
-      </w:r>
-      <w:r>
-        <w:lastRenderedPageBreak/>
-        <w:t>mechanics of the model; they occur where the deterministic margin, corrected resistance and shallow susceptible layers jointly place the simulated states near or beyond the limit-state boundary.</w:t>
+        <w:t>Fig. 4 reports absolute Spearman rank correlations between Pf and the main benchmark variables. The strongest association is the deterministic factor-of-safety companion metric, followed by CRR, corrected penetration resistance, fines content and depth. This pattern is technically plausible: the probability output is controlled primarily by resistance margin and layer susceptibility, while groundwater depth enters through CSR and effective stress. Therefore, the high Pf values are not disconnected from the mechanics of the model; they occur where the deterministic margin, corrected resistance and shallow susceptible layers jointly place the simulated states near or beyond the limit-state boundary.</w:t>
       </w:r>
     </w:p>
     <w:p>
@@ -9958,23 +9137,7 @@
         <w:pStyle w:val="Paragraph"/>
       </w:pPr>
       <w:r>
-        <w:t xml:space="preserve">Table 10 complements Figure 4 by reporting the numerical correlation values. The low direct rank association of groundwater depth should </w:t>
-      </w:r>
-      <w:proofErr w:type="gramStart"/>
-      <w:r>
-        <w:t>not be misread</w:t>
-      </w:r>
-      <w:proofErr w:type="gramEnd"/>
-      <w:r>
-        <w:t xml:space="preserve"> as groundwater being unimportant. In this benchmark, groundwater influence is partially mediated through CSR and through the scenario structure; depth, corrected resistance and fines </w:t>
-      </w:r>
-      <w:proofErr w:type="gramStart"/>
-      <w:r>
-        <w:t>content also</w:t>
-      </w:r>
-      <w:proofErr w:type="gramEnd"/>
-      <w:r>
-        <w:t xml:space="preserve"> vary strongly across layers. The sensitivity check therefore supports a nuanced interpretation: groundwater scenarios trigger temporal changes, while layer susceptibility controls where those changes become severe.</w:t>
+        <w:t>Table 10 complements Figure 4 by reporting the numerical correlation values. The low direct rank association of groundwater depth should not be misread as groundwater being unimportant. In this benchmark, groundwater influence is partially mediated through CSR and through the scenario structure; depth, corrected resistance and fines content also vary strongly across layers. The sensitivity check therefore supports a nuanced interpretation: groundwater scenarios trigger temporal changes, while layer susceptibility controls where those changes become severe.</w:t>
       </w:r>
     </w:p>
     <w:p>
@@ -10213,7 +9376,6 @@
                 <w:sz w:val="18"/>
               </w:rPr>
             </w:pPr>
-            <w:proofErr w:type="spellStart"/>
             <w:r>
               <w:rPr>
                 <w:sz w:val="18"/>
@@ -10221,7 +9383,6 @@
               </w:rPr>
               <w:t>crr</w:t>
             </w:r>
-            <w:proofErr w:type="spellEnd"/>
           </w:p>
         </w:tc>
         <w:tc>
@@ -10402,16 +9563,13 @@
                 <w:sz w:val="18"/>
               </w:rPr>
             </w:pPr>
-            <w:proofErr w:type="spellStart"/>
-            <w:r>
-              <w:rPr>
-                <w:sz w:val="18"/>
-                <w:szCs w:val="17"/>
-              </w:rPr>
-              <w:lastRenderedPageBreak/>
+            <w:r>
+              <w:rPr>
+                <w:sz w:val="18"/>
+                <w:szCs w:val="17"/>
+              </w:rPr>
               <w:t>fc_pct</w:t>
             </w:r>
-            <w:proofErr w:type="spellEnd"/>
           </w:p>
         </w:tc>
         <w:tc>
@@ -10499,7 +9657,6 @@
                 <w:sz w:val="18"/>
               </w:rPr>
             </w:pPr>
-            <w:proofErr w:type="spellStart"/>
             <w:r>
               <w:rPr>
                 <w:sz w:val="18"/>
@@ -10507,7 +9664,6 @@
               </w:rPr>
               <w:t>z_mid_m</w:t>
             </w:r>
-            <w:proofErr w:type="spellEnd"/>
           </w:p>
         </w:tc>
         <w:tc>
@@ -10594,7 +9750,6 @@
                 <w:sz w:val="18"/>
               </w:rPr>
             </w:pPr>
-            <w:proofErr w:type="spellStart"/>
             <w:r>
               <w:rPr>
                 <w:sz w:val="18"/>
@@ -10602,7 +9757,6 @@
               </w:rPr>
               <w:t>csr</w:t>
             </w:r>
-            <w:proofErr w:type="spellEnd"/>
           </w:p>
         </w:tc>
         <w:tc>
@@ -10690,7 +9844,6 @@
                 <w:sz w:val="18"/>
               </w:rPr>
             </w:pPr>
-            <w:proofErr w:type="spellStart"/>
             <w:r>
               <w:rPr>
                 <w:sz w:val="18"/>
@@ -10698,7 +9851,6 @@
               </w:rPr>
               <w:t>gw_depth_m</w:t>
             </w:r>
-            <w:proofErr w:type="spellEnd"/>
           </w:p>
         </w:tc>
         <w:tc>
@@ -10774,15 +9926,7 @@
         <w:pStyle w:val="Paragraph"/>
       </w:pPr>
       <w:r>
-        <w:t xml:space="preserve">The combined diagnostics from confidence intervals, repeated-sample convergence, external trend checks and rank sensitivity show that the benchmark is reproducible, internally consistent and directionally plausible within its assumptions. It remains explicit about its synthetic status while providing computational diagnostics that allow readers to </w:t>
-      </w:r>
-      <w:proofErr w:type="gramStart"/>
-      <w:r>
-        <w:t>reproduce,</w:t>
-      </w:r>
-      <w:proofErr w:type="gramEnd"/>
-      <w:r>
-        <w:t xml:space="preserve"> criticise and extend the workflow.</w:t>
+        <w:t>The combined diagnostics from confidence intervals, repeated-sample convergence, external trend checks and rank sensitivity show that the benchmark is reproducible, internally consistent and directionally plausible within its assumptions. It remains explicit about its synthetic status while providing computational diagnostics that allow readers to reproduce, criticise and extend the workflow.</w:t>
       </w:r>
     </w:p>
     <w:p>
@@ -10801,31 +9945,7 @@
         <w:pStyle w:val="Paragraph"/>
       </w:pPr>
       <w:r>
-        <w:t xml:space="preserve">Because the benchmark is synthetic, an external trend-consistency check </w:t>
-      </w:r>
-      <w:proofErr w:type="gramStart"/>
-      <w:r>
-        <w:t>was added</w:t>
-      </w:r>
-      <w:proofErr w:type="gramEnd"/>
-      <w:r>
-        <w:t xml:space="preserve"> using the open case-history dataset of Hu et al. [16], which compiles 234 gravelly-soil liquefaction and non-liquefaction cases from 17 earthquakes. The check is deliberately modest: it does not calibrate the proposed benchmark to a field site, and it does not claim that gravelly-soil behaviour is identical to the synthetic sand-profile example. Instead, it tests whether demand, resistance and groundwater indicators rank historical liquefied cases above non-liquefied cases in the expected direction. The external case-history analysis </w:t>
-      </w:r>
-      <w:proofErr w:type="gramStart"/>
-      <w:r>
-        <w:t>is therefore used</w:t>
-      </w:r>
-      <w:proofErr w:type="gramEnd"/>
-      <w:r>
-        <w:t xml:space="preserve"> only as an independent trend-consistency and discrimination check. It is not intended as site-specific calibration, nor as formal evidence for a new </w:t>
-      </w:r>
-      <w:proofErr w:type="gramStart"/>
-      <w:r>
-        <w:t>liquefaction triggering</w:t>
-      </w:r>
-      <w:proofErr w:type="gramEnd"/>
-      <w:r>
-        <w:t xml:space="preserve"> model.</w:t>
+        <w:t>Because the benchmark is synthetic, an external trend-consistency check was added using the open case-history dataset of Hu et al. [16], which compiles 234 gravelly-soil liquefaction and non-liquefaction cases from 17 earthquakes. The check is deliberately modest: it does not calibrate the proposed benchmark to a field site, and it does not claim that gravelly-soil behaviour is identical to the synthetic sand-profile example. Instead, it tests whether demand, resistance and groundwater indicators rank historical liquefied cases above non-liquefied cases in the expected direction. The external case-history analysis is therefore used only as an independent trend-consistency and discrimination check. It is not intended as site-specific calibration, nor as formal evidence for a new liquefaction triggering model.</w:t>
       </w:r>
     </w:p>
     <w:p>
@@ -10834,19 +9954,7 @@
         <w:spacing w:line="480" w:lineRule="auto"/>
       </w:pPr>
       <w:r>
-        <w:t xml:space="preserve">Fig. 5 reports the rank-discrimination performance of the external sanity check. A combined demand-resistance-groundwater score achieved an AUC of 0.811, while the Vs-based and DPT-based scores achieved AUC values of 0.796 and 0.778, respectively. These values </w:t>
-      </w:r>
-      <w:proofErr w:type="gramStart"/>
-      <w:r>
-        <w:t>are not presented</w:t>
-      </w:r>
-      <w:proofErr w:type="gramEnd"/>
-      <w:r>
-        <w:t xml:space="preserve"> as a new prediction model. They show that the same classes of variables used in the non-stationary benchmark demand, resistance and </w:t>
-      </w:r>
-      <w:r>
-        <w:lastRenderedPageBreak/>
-        <w:t>groundwater position have a directionally consistent relationship in an independent published case-history dataset.</w:t>
+        <w:t>Fig. 5 reports the rank-discrimination performance of the external sanity check. A combined demand-resistance-groundwater score achieved an AUC of 0.811, while the Vs-based and DPT-based scores achieved AUC values of 0.796 and 0.778, respectively. These values are not presented as a new prediction model. They show that the same classes of variables used in the non-stationary benchmark demand, resistance and groundwater position have a directionally consistent relationship in an independent published case-history dataset.</w:t>
       </w:r>
     </w:p>
     <w:p/>
@@ -10906,15 +10014,7 @@
         <w:pStyle w:val="Paragraph"/>
       </w:pPr>
       <w:r>
-        <w:t xml:space="preserve">Table 11 reports the numerical summary of the same external check. Liquefied cases have higher mean and median screening scores than non-liquefied cases for the combined, DPT-based and Vs-based indices. The demand-only and groundwater-only components are weaker on their own, which </w:t>
-      </w:r>
-      <w:proofErr w:type="gramStart"/>
-      <w:r>
-        <w:t>is expected</w:t>
-      </w:r>
-      <w:proofErr w:type="gramEnd"/>
-      <w:r>
-        <w:t xml:space="preserve"> because liquefaction triggering is not controlled by a single variable. This result supports the interpretation that the external comparison is an auditable secondary check supplied with the code and CSV outputs.</w:t>
+        <w:t>Table 11 reports the numerical summary of the same external check. Liquefied cases have higher mean and median screening scores than non-liquefied cases for the combined, DPT-based and Vs-based indices. The demand-only and groundwater-only components are weaker on their own, which is expected because liquefaction triggering is not controlled by a single variable. This result supports the interpretation that the external comparison is an auditable secondary check supplied with the code and CSV outputs.</w:t>
       </w:r>
     </w:p>
     <w:p>
@@ -11496,7 +10596,6 @@
                 <w:sz w:val="18"/>
                 <w:szCs w:val="17"/>
               </w:rPr>
-              <w:lastRenderedPageBreak/>
               <w:t>Vs score</w:t>
             </w:r>
           </w:p>
@@ -12002,39 +11101,7 @@
         <w:pStyle w:val="Paragraph"/>
       </w:pPr>
       <w:r>
-        <w:t xml:space="preserve">The external check </w:t>
-      </w:r>
-      <w:proofErr w:type="gramStart"/>
-      <w:r>
-        <w:t>was extended</w:t>
-      </w:r>
-      <w:proofErr w:type="gramEnd"/>
-      <w:r>
-        <w:t xml:space="preserve"> beyond rank AUC by adding five-fold calibrated Brier scores, probability-calibration bins and transparent confusion-matrix diagnostics. A static proxy version of the benchmark limit-state </w:t>
-      </w:r>
-      <w:proofErr w:type="gramStart"/>
-      <w:r>
-        <w:t>was also applied</w:t>
-      </w:r>
-      <w:proofErr w:type="gramEnd"/>
-      <w:r>
-        <w:t xml:space="preserve"> to the Hu et al. cases where CSR, resistance and fines-content data were available. These Hu et al. and </w:t>
-      </w:r>
-      <w:proofErr w:type="spellStart"/>
-      <w:r>
-        <w:t>Wenchuan</w:t>
-      </w:r>
-      <w:proofErr w:type="spellEnd"/>
-      <w:r>
-        <w:t xml:space="preserve"> analyses </w:t>
-      </w:r>
-      <w:proofErr w:type="gramStart"/>
-      <w:r>
-        <w:t>are retained</w:t>
-      </w:r>
-      <w:proofErr w:type="gramEnd"/>
-      <w:r>
-        <w:t xml:space="preserve"> as external case-history compatibility checks: they evaluate whether demand, resistance and groundwater indicators rank observed liquefied cases above non-liquefied cases, but they do not constitute a calibrated non-stationary field application.</w:t>
+        <w:t>The external check was extended beyond rank AUC by adding five-fold calibrated Brier scores, probability-calibration bins and transparent confusion-matrix diagnostics. A static proxy version of the benchmark limit-state was also applied to the Hu et al. cases where CSR, resistance and fines-content data were available. These Hu et al. and Wenchuan analyses are retained as external case-history compatibility checks: they evaluate whether demand, resistance and groundwater indicators rank observed liquefied cases above non-liquefied cases, but they do not constitute a calibrated non-stationary field application.</w:t>
       </w:r>
     </w:p>
     <w:p>
@@ -12042,15 +11109,7 @@
         <w:pStyle w:val="Paragraph"/>
       </w:pPr>
       <w:r>
-        <w:t xml:space="preserve">Detailed external discrimination, five-fold calibration and static compatibility diagnostics </w:t>
-      </w:r>
-      <w:proofErr w:type="gramStart"/>
-      <w:r>
-        <w:t>are reported</w:t>
-      </w:r>
-      <w:proofErr w:type="gramEnd"/>
-      <w:r>
-        <w:t xml:space="preserve"> in Table 12, and expanded external compatibility metrics are reported in Table 15. Table 14 reports the vertical-dependence sensitivity used to distinguish profile-average probability from system-failure probability. Their role is external compatibility and dependence-sensitivity checking, not site-calibrated validation of the synthetic benchmark.</w:t>
+        <w:t>Detailed external discrimination, five-fold calibration and static compatibility diagnostics are reported in Table 12, and expanded external compatibility metrics are reported in Table 15. Table 14 reports the vertical-dependence sensitivity used to distinguish profile-average probability from system-failure probability. Their role is external compatibility and dependence-sensitivity checking, not site-calibrated validation of the synthetic benchmark.</w:t>
       </w:r>
     </w:p>
     <w:p>
@@ -13189,7 +12248,6 @@
                 <w:sz w:val="18"/>
                 <w:szCs w:val="17"/>
               </w:rPr>
-              <w:lastRenderedPageBreak/>
               <w:t>Scenario</w:t>
             </w:r>
           </w:p>
@@ -13511,7 +12569,6 @@
                 <w:sz w:val="18"/>
               </w:rPr>
             </w:pPr>
-            <w:proofErr w:type="spellStart"/>
             <w:r>
               <w:rPr>
                 <w:sz w:val="18"/>
@@ -13519,7 +12576,6 @@
               </w:rPr>
               <w:t>fines_accumulation</w:t>
             </w:r>
-            <w:proofErr w:type="spellEnd"/>
           </w:p>
         </w:tc>
         <w:tc>
@@ -13666,7 +12722,6 @@
                 <w:sz w:val="18"/>
               </w:rPr>
             </w:pPr>
-            <w:proofErr w:type="spellStart"/>
             <w:r>
               <w:rPr>
                 <w:sz w:val="18"/>
@@ -13674,7 +12729,6 @@
               </w:rPr>
               <w:t>fines_washout</w:t>
             </w:r>
-            <w:proofErr w:type="spellEnd"/>
           </w:p>
         </w:tc>
         <w:tc>
@@ -13973,7 +13027,6 @@
                 <w:sz w:val="18"/>
               </w:rPr>
             </w:pPr>
-            <w:proofErr w:type="spellStart"/>
             <w:r>
               <w:rPr>
                 <w:sz w:val="18"/>
@@ -13981,7 +13034,6 @@
               </w:rPr>
               <w:t>fines_accumulation</w:t>
             </w:r>
-            <w:proofErr w:type="spellEnd"/>
           </w:p>
         </w:tc>
         <w:tc>
@@ -14127,7 +13179,6 @@
                 <w:sz w:val="18"/>
               </w:rPr>
             </w:pPr>
-            <w:proofErr w:type="spellStart"/>
             <w:r>
               <w:rPr>
                 <w:sz w:val="18"/>
@@ -14135,7 +13186,6 @@
               </w:rPr>
               <w:t>fines_washout</w:t>
             </w:r>
-            <w:proofErr w:type="spellEnd"/>
           </w:p>
         </w:tc>
         <w:tc>
@@ -14434,7 +13484,6 @@
                 <w:sz w:val="18"/>
               </w:rPr>
             </w:pPr>
-            <w:proofErr w:type="spellStart"/>
             <w:r>
               <w:rPr>
                 <w:sz w:val="18"/>
@@ -14442,7 +13491,6 @@
               </w:rPr>
               <w:t>fines_accumulation</w:t>
             </w:r>
-            <w:proofErr w:type="spellEnd"/>
           </w:p>
         </w:tc>
         <w:tc>
@@ -14589,7 +13637,6 @@
                 <w:sz w:val="18"/>
               </w:rPr>
             </w:pPr>
-            <w:proofErr w:type="spellStart"/>
             <w:r>
               <w:rPr>
                 <w:sz w:val="18"/>
@@ -14597,7 +13644,6 @@
               </w:rPr>
               <w:t>fines_washout</w:t>
             </w:r>
-            <w:proofErr w:type="spellEnd"/>
           </w:p>
         </w:tc>
         <w:tc>
@@ -14896,7 +13942,6 @@
                 <w:sz w:val="18"/>
               </w:rPr>
             </w:pPr>
-            <w:proofErr w:type="spellStart"/>
             <w:r>
               <w:rPr>
                 <w:sz w:val="18"/>
@@ -14904,7 +13949,6 @@
               </w:rPr>
               <w:t>fines_accumulation</w:t>
             </w:r>
-            <w:proofErr w:type="spellEnd"/>
           </w:p>
         </w:tc>
         <w:tc>
@@ -15050,7 +14094,6 @@
                 <w:sz w:val="18"/>
               </w:rPr>
             </w:pPr>
-            <w:proofErr w:type="spellStart"/>
             <w:r>
               <w:rPr>
                 <w:sz w:val="18"/>
@@ -15058,7 +14101,6 @@
               </w:rPr>
               <w:t>fines_washout</w:t>
             </w:r>
-            <w:proofErr w:type="spellEnd"/>
           </w:p>
         </w:tc>
         <w:tc>
@@ -15241,21 +14283,12 @@
                 <w:sz w:val="18"/>
               </w:rPr>
             </w:pPr>
-            <w:proofErr w:type="spellStart"/>
-            <w:r>
-              <w:rPr>
-                <w:sz w:val="18"/>
-                <w:szCs w:val="17"/>
-              </w:rPr>
-              <w:t>Psys</w:t>
-            </w:r>
-            <w:proofErr w:type="spellEnd"/>
-            <w:r>
-              <w:rPr>
-                <w:sz w:val="18"/>
-                <w:szCs w:val="17"/>
-              </w:rPr>
-              <w:t xml:space="preserve"> copula</w:t>
+            <w:r>
+              <w:rPr>
+                <w:sz w:val="18"/>
+                <w:szCs w:val="17"/>
+              </w:rPr>
+              <w:t>Psys copula</w:t>
             </w:r>
           </w:p>
         </w:tc>
@@ -15271,21 +14304,12 @@
                 <w:sz w:val="18"/>
               </w:rPr>
             </w:pPr>
-            <w:proofErr w:type="spellStart"/>
-            <w:r>
-              <w:rPr>
-                <w:sz w:val="18"/>
-                <w:szCs w:val="17"/>
-              </w:rPr>
-              <w:t>Psys</w:t>
-            </w:r>
-            <w:proofErr w:type="spellEnd"/>
-            <w:r>
-              <w:rPr>
-                <w:sz w:val="18"/>
-                <w:szCs w:val="17"/>
-              </w:rPr>
-              <w:t xml:space="preserve"> independent</w:t>
+            <w:r>
+              <w:rPr>
+                <w:sz w:val="18"/>
+                <w:szCs w:val="17"/>
+              </w:rPr>
+              <w:t>Psys independent</w:t>
             </w:r>
           </w:p>
         </w:tc>
@@ -15301,21 +14325,12 @@
                 <w:sz w:val="18"/>
               </w:rPr>
             </w:pPr>
-            <w:proofErr w:type="spellStart"/>
-            <w:r>
-              <w:rPr>
-                <w:sz w:val="18"/>
-                <w:szCs w:val="17"/>
-              </w:rPr>
-              <w:t>Frechet</w:t>
-            </w:r>
-            <w:proofErr w:type="spellEnd"/>
-            <w:r>
-              <w:rPr>
-                <w:sz w:val="18"/>
-                <w:szCs w:val="17"/>
-              </w:rPr>
-              <w:t xml:space="preserve"> lower</w:t>
+            <w:r>
+              <w:rPr>
+                <w:sz w:val="18"/>
+                <w:szCs w:val="17"/>
+              </w:rPr>
+              <w:t>Frechet lower</w:t>
             </w:r>
           </w:p>
         </w:tc>
@@ -15331,21 +14346,12 @@
                 <w:sz w:val="18"/>
               </w:rPr>
             </w:pPr>
-            <w:proofErr w:type="spellStart"/>
-            <w:r>
-              <w:rPr>
-                <w:sz w:val="18"/>
-                <w:szCs w:val="17"/>
-              </w:rPr>
-              <w:t>Frechet</w:t>
-            </w:r>
-            <w:proofErr w:type="spellEnd"/>
-            <w:r>
-              <w:rPr>
-                <w:sz w:val="18"/>
-                <w:szCs w:val="17"/>
-              </w:rPr>
-              <w:t xml:space="preserve"> upper</w:t>
+            <w:r>
+              <w:rPr>
+                <w:sz w:val="18"/>
+                <w:szCs w:val="17"/>
+              </w:rPr>
+              <w:t>Frechet upper</w:t>
             </w:r>
           </w:p>
         </w:tc>
@@ -16012,15 +15018,7 @@
         </w:rPr>
       </w:pPr>
       <w:r>
-        <w:t xml:space="preserve">Table 15. External case-history compatibility metrics for the Hu full set and </w:t>
-      </w:r>
-      <w:proofErr w:type="spellStart"/>
-      <w:r>
-        <w:t>Wenchuan</w:t>
-      </w:r>
-      <w:proofErr w:type="spellEnd"/>
-      <w:r>
-        <w:t xml:space="preserve"> documented-earthquake subset.</w:t>
+        <w:t>Table 15. External case-history compatibility metrics for the Hu full set and Wenchuan documented-earthquake subset.</w:t>
       </w:r>
     </w:p>
     <w:tbl>
@@ -17356,7 +16354,6 @@
                 <w:sz w:val="18"/>
               </w:rPr>
             </w:pPr>
-            <w:proofErr w:type="spellStart"/>
             <w:r>
               <w:rPr>
                 <w:sz w:val="18"/>
@@ -17364,7 +16361,6 @@
               </w:rPr>
               <w:t>Wenchuan</w:t>
             </w:r>
-            <w:proofErr w:type="spellEnd"/>
           </w:p>
         </w:tc>
         <w:tc>
@@ -17615,7 +16611,6 @@
                 <w:sz w:val="18"/>
               </w:rPr>
             </w:pPr>
-            <w:proofErr w:type="spellStart"/>
             <w:r>
               <w:rPr>
                 <w:sz w:val="18"/>
@@ -17623,7 +16618,6 @@
               </w:rPr>
               <w:t>Wenchuan</w:t>
             </w:r>
-            <w:proofErr w:type="spellEnd"/>
           </w:p>
         </w:tc>
         <w:tc>
@@ -17875,7 +16869,6 @@
                 <w:sz w:val="18"/>
               </w:rPr>
             </w:pPr>
-            <w:proofErr w:type="spellStart"/>
             <w:r>
               <w:rPr>
                 <w:sz w:val="18"/>
@@ -17883,7 +16876,6 @@
               </w:rPr>
               <w:t>Wenchuan</w:t>
             </w:r>
-            <w:proofErr w:type="spellEnd"/>
           </w:p>
         </w:tc>
         <w:tc>
@@ -18134,7 +17126,6 @@
                 <w:sz w:val="18"/>
               </w:rPr>
             </w:pPr>
-            <w:proofErr w:type="spellStart"/>
             <w:r>
               <w:rPr>
                 <w:sz w:val="18"/>
@@ -18142,7 +17133,6 @@
               </w:rPr>
               <w:t>Wenchuan</w:t>
             </w:r>
-            <w:proofErr w:type="spellEnd"/>
           </w:p>
         </w:tc>
         <w:tc>
@@ -18387,48 +17377,7 @@
         </w:rPr>
       </w:pPr>
       <w:r>
-        <w:t xml:space="preserve">The standard SPT model-form comparison </w:t>
-      </w:r>
-      <w:proofErr w:type="gramStart"/>
-      <w:r>
-        <w:t>is reported</w:t>
-      </w:r>
-      <w:proofErr w:type="gramEnd"/>
-      <w:r>
-        <w:t xml:space="preserve"> in Table 13. In the reproducibility package, the BI14 SPT curve </w:t>
-      </w:r>
-      <w:proofErr w:type="gramStart"/>
-      <w:r>
-        <w:t>is computed</w:t>
-      </w:r>
-      <w:proofErr w:type="gramEnd"/>
-      <w:r>
-        <w:t xml:space="preserve"> through </w:t>
-      </w:r>
-      <w:proofErr w:type="spellStart"/>
-      <w:r>
-        <w:t>liq</w:t>
-      </w:r>
-      <w:bookmarkStart w:id="0" w:name="_GoBack"/>
-      <w:bookmarkEnd w:id="0"/>
-      <w:r>
-        <w:t>uepy</w:t>
-      </w:r>
-      <w:proofErr w:type="spellEnd"/>
-      <w:r>
-        <w:t xml:space="preserve"> when available. The same output files also report a BI14 median-parameter variant, FS scale ratios, and an explicit </w:t>
-      </w:r>
-      <w:r>
-        <w:lastRenderedPageBreak/>
-        <w:t xml:space="preserve">availability table for BI16, Cetin, Moss/CPT and </w:t>
-      </w:r>
-      <w:proofErr w:type="spellStart"/>
-      <w:r>
-        <w:t>Kayen</w:t>
-      </w:r>
-      <w:proofErr w:type="spellEnd"/>
-      <w:r>
-        <w:t>/Vs alternatives so that unavailable exact methods are not silently renamed or substituted.</w:t>
+        <w:t>The standard SPT model-form comparison is reported in Table 13. In the reproducibility package, the BI14 SPT curve is computed through liquepy when available. The same output files also report a BI14 median-parameter variant, FS scale ratios, and an explicit availability table for BI16, Cetin, Moss/CPT and Kayen/Vs alternatives so that unavailable exact methods are not silently renamed or substituted.</w:t>
       </w:r>
     </w:p>
     <w:p>
@@ -18436,18 +17385,7 @@
         <w:pStyle w:val="Paragraph"/>
       </w:pPr>
       <w:r>
-        <w:t>Supplementary Table S2 provides the extended standard-model comparison details, Supplementary Table S3 reports the vertical-dependence sensitivity outputs, and Supplementary Table S4 reports the expanded external compatibilit</w:t>
-      </w:r>
-      <w:r>
-        <w:t xml:space="preserve">y metrics. These supplementary tables </w:t>
-      </w:r>
-      <w:proofErr w:type="gramStart"/>
-      <w:r>
-        <w:t>are cross-referenced</w:t>
-      </w:r>
-      <w:proofErr w:type="gramEnd"/>
-      <w:r>
-        <w:t xml:space="preserve"> here to connect the manuscript diagnostics with the online resource files.</w:t>
+        <w:t>Supplementary Table S2 provides the extended standard-model comparison details, Supplementary Table S3 reports the vertical-dependence sensitivity outputs, and Supplementary Table S4 reports the expanded external compatibility metrics. These supplementary tables are cross-referenced here to connect the manuscript diagnostics with the online resource files.</w:t>
       </w:r>
     </w:p>
     <w:p>
@@ -18469,23 +17407,7 @@
         </w:rPr>
       </w:pPr>
       <w:r>
-        <w:t xml:space="preserve">A documented-site extension </w:t>
-      </w:r>
-      <w:proofErr w:type="gramStart"/>
-      <w:r>
-        <w:t>was added</w:t>
-      </w:r>
-      <w:proofErr w:type="gramEnd"/>
-      <w:r>
-        <w:t xml:space="preserve"> using the </w:t>
-      </w:r>
-      <w:proofErr w:type="spellStart"/>
-      <w:r>
-        <w:t>DesignSafe</w:t>
-      </w:r>
-      <w:proofErr w:type="spellEnd"/>
-      <w:r>
-        <w:t xml:space="preserve"> PRJ-3758 Nisqually CPT case-history dataset. The extension normalises 24 CPT workbooks and Summary Table S1 into site-profile, groundwater, gradation-status and event-observation CSV files. The groundwater module fits a trajectory with trend, annual sine/cosine terms and an event indicator, and Fig. 6 reports observed water-table points, the fitted mean curve, a 95% interval and the 28 February 2001 earthquake date. Because PRJ-3758 does not include repeated FC/D50 measurements, the gradation module is explicitly marked as baseline uncertainty/proxy information rather than calibrated temporal gradation evolution.</w:t>
+        <w:t>A documented-site extension was added using the DesignSafe PRJ-3758 Nisqually CPT case-history dataset. The extension normalises 24 CPT workbooks and Summary Table S1 into site-profile, groundwater, gradation-status and event-observation CSV files. The groundwater module fits a trajectory with trend, annual sine/cosine terms and an event indicator, and Fig. 6 reports observed water-table points, the fitted mean curve, a 95% interval and the 28 February 2001 earthquake date. Because PRJ-3758 does not include repeated FC/D50 measurements, the gradation module is explicitly marked as baseline uncertainty/proxy information rather than calibrated temporal gradation evolution.</w:t>
       </w:r>
     </w:p>
     <w:p>
@@ -18496,83 +17418,12 @@
         </w:rPr>
       </w:pPr>
       <w:r>
-        <w:t xml:space="preserve">The validation protocol is intentionally out-of-sample. The primary Nisqually protocol uses leave-one-site-family-out spatial validation, pools the held-out predictions, and reports calibration diagnostics on those predictions. Under this protocol, M2 (nonstationary groundwater plus gradation proxy) improves Brier score relative to M0 (static stationary), from 0.072 to 0.026 in pooled predictions and from 0.088 to 0.025 as mean fold Brier. Calibration remains imperfect because the dataset is small and strongly separable; calibration slopes </w:t>
-      </w:r>
-      <w:proofErr w:type="gramStart"/>
-      <w:r>
-        <w:t>are reported explicitly rather than hidden</w:t>
-      </w:r>
-      <w:proofErr w:type="gramEnd"/>
-      <w:r>
-        <w:t xml:space="preserve">. Exhaustive paired-family and strict SODO+UW holdouts are retained as sensitivity checks; the </w:t>
-      </w:r>
-      <w:r>
-        <w:lastRenderedPageBreak/>
-        <w:t xml:space="preserve">paired-family protocol also favours M2, while the single </w:t>
-      </w:r>
-      <w:proofErr w:type="gramStart"/>
-      <w:r>
-        <w:t>SODO+UW split</w:t>
-      </w:r>
-      <w:proofErr w:type="gramEnd"/>
-      <w:r>
-        <w:t xml:space="preserve"> does not. Fig. 7 visualizes the out-of-sample Brier comparison, and Fig. 8 reports the vertical </w:t>
-      </w:r>
-      <w:proofErr w:type="spellStart"/>
-      <w:r>
-        <w:t>variogram</w:t>
-      </w:r>
-      <w:proofErr w:type="spellEnd"/>
-      <w:r>
-        <w:t xml:space="preserve"> diagnostic used by the random-field extension.</w:t>
+        <w:t>The validation protocol is intentionally out-of-sample. The primary Nisqually protocol uses leave-one-site-family-out spatial validation, pools the held-out predictions, and reports calibration diagnostics on those predictions. Under this protocol, M2 (nonstationary groundwater plus gradation proxy) improves Brier score relative to M0 (static stationary), from 0.072 to 0.026 in pooled held-out predictions and from 0.088 to 0.025 as mean fold Brier. This makes the historical validation claim narrower and more defensible: the gain is an out-of-sample, site-family holdout improvement over the stationary comparator, not an in-sample fit to the same CPT profiles. Calibration remains imperfect because the dataset is small and strongly separable; calibration slopes are reported explicitly rather than hidden. Exhaustive paired-family and strict SODO+UW holdouts are retained as sensitivity checks; the paired-family protocol also favours M2, while the single SODO+UW split does not. Fig. 7 visualizes the out-of-sample Brier comparison, and Fig. 8 reports the vertical variogram diagnostic used by the random-field extension.</w:t>
       </w:r>
     </w:p>
     <w:p>
-      <w:pPr>
-        <w:pStyle w:val="Paragraph"/>
-        <w:rPr>
-          <w:rFonts w:eastAsiaTheme="majorEastAsia" w:cs="Arial"/>
-          <w:b/>
-          <w:bCs/>
-          <w:color w:val="000000"/>
-          <w:sz w:val="23"/>
-          <w:szCs w:val="26"/>
-        </w:rPr>
-      </w:pPr>
       <w:r>
-        <w:t xml:space="preserve">The Canterbury temporal extension adds a second documented-site application using </w:t>
-      </w:r>
-      <w:proofErr w:type="spellStart"/>
-      <w:r>
-        <w:t>DesignSafe</w:t>
-      </w:r>
-      <w:proofErr w:type="spellEnd"/>
-      <w:r>
-        <w:t xml:space="preserve"> PRJ-2937, 100 Osbourne St CPT01. The same CPT profile is evaluated for the 2010 Darfield, 2011 Christchurch and 2016 Valentine earthquake states using event-specific Mw, PGA, groundwater depth and manifestation codes. A transfer model trained on the Nisqually case histories </w:t>
-      </w:r>
-      <w:proofErr w:type="gramStart"/>
-      <w:r>
-        <w:t>is applied</w:t>
-      </w:r>
-      <w:proofErr w:type="gramEnd"/>
-      <w:r>
-        <w:t xml:space="preserve"> to the three-event sequence. Because only three event states are available for that CPT, this is treated as a minimal temporal site application rather than a large-sample validation; nevertheless, it directly shows that event time and observed groundwater/PGA states modify </w:t>
-      </w:r>
-      <w:proofErr w:type="gramStart"/>
-      <w:r>
-        <w:t>Pf(</w:t>
-      </w:r>
-      <w:proofErr w:type="gramEnd"/>
-      <w:r>
-        <w:t xml:space="preserve">t) using documented field data. In this temporal transfer, M2 lowers Brier score relative to M0 from 0.326 to 0.306, and M3 lowers it to 0.146. Fig. 9 visualizes the resulting </w:t>
-      </w:r>
-      <w:proofErr w:type="gramStart"/>
-      <w:r>
-        <w:t>Pf(</w:t>
-      </w:r>
-      <w:proofErr w:type="gramEnd"/>
-      <w:r>
-        <w:t>t) curves across the documented event states.</w:t>
+        <w:t>The Canterbury temporal extension now has two levels. First, the original DesignSafe PRJ-2937 100 Osbourne St CPT01 sequence remains as a transparent three-event temporal stress test for the 2010 Darfield, 2011 Christchurch and 2016 Valentine earthquake states. In that small sequence, M2 lowers Brier score relative to M0 from 0.326 to 0.306, and M3 lowers it to 0.146, so it is reported only as a documented stress test rather than as a standalone Canterbury calibration. Second, the new multi-site Canterbury transfer applies the same Nisqually-trained models to 15,890 scored event states across 5,665 usable CPT records after excluding 1,114 manifestation-code-10 states as indeterminate. This larger external domain removes the n=3 limitation but blocks a universal non-stationary Brier-superiority claim: M0 is the best Brier model (0.318), while M3 worsens Brier by +0.0885 with a paired bootstrap 95% interval of +0.0846 to +0.0927. The risk-management signal is instead a safety-screening tradeoff: M3 reduces false negatives from 224 to 111, and conservative max(M0..M3) reduces them to 43, but only with many additional false positives and worse calibration. A cost-sensitive frontier resolves the decision implication without treating threshold tuning as validation: the domain-retuned threshold curve is reported as a diagnostic/oracle frontier, whereas the fixed 0.50 curve is the operational screening comparison. Under the fixed 0.50 threshold and a 10:1 false-negative/false-positive cost ratio, conservative max(M0..M3) lowers domain-balanced mean expected loss from 0.465 to 0.189 and case-weighted global mean expected loss from 0.521 to 0.484. Fig. 9 visualizes the three-event Pf(t) stress test, Fig. 10 summarizes the expanded Canterbury gate, and Fig. 11 reports the decision frontier.</w:t>
       </w:r>
     </w:p>
     <w:p>
@@ -18657,7 +17508,6 @@
         </w:rPr>
       </w:pPr>
       <w:r>
-        <w:lastRenderedPageBreak/>
         <w:t>Fig. 6 Observed and calibrated groundwater trajectory for the Nisqually PRJ-3758 CPT case-history dataset. Points are reported water-table-depth observations, the line is the fitted mean trajectory, the band is the 95% interval and the vertical line marks the 28 February 2001 earthquake.</w:t>
       </w:r>
     </w:p>
@@ -18774,7 +17624,6 @@
           <w:noProof/>
           <w:lang w:val="es-PA" w:eastAsia="es-PA"/>
         </w:rPr>
-        <w:lastRenderedPageBreak/>
         <w:drawing>
           <wp:inline distT="0" distB="0" distL="0" distR="0">
             <wp:extent cx="5400040" cy="3538440"/>
@@ -18829,23 +17678,7 @@
         </w:rPr>
       </w:pPr>
       <w:r>
-        <w:t xml:space="preserve">Fig. 8 Empirical and fitted vertical </w:t>
-      </w:r>
-      <w:proofErr w:type="spellStart"/>
-      <w:r>
-        <w:t>variogram</w:t>
-      </w:r>
-      <w:proofErr w:type="spellEnd"/>
-      <w:r>
-        <w:t xml:space="preserve"> for the Nisqually CPT </w:t>
-      </w:r>
-      <w:proofErr w:type="gramStart"/>
-      <w:r>
-        <w:t>log(</w:t>
-      </w:r>
-      <w:proofErr w:type="gramEnd"/>
-      <w:r>
-        <w:t>qc) diagnostic used by the random-field extension.</w:t>
+        <w:t>Fig. 8 Empirical and fitted vertical variogram for the Nisqually CPT log(qc) diagnostic used by the random-field extension.</w:t>
       </w:r>
     </w:p>
     <w:p>
@@ -18930,16 +17763,7 @@
         </w:rPr>
       </w:pPr>
       <w:r>
-        <w:lastRenderedPageBreak/>
-        <w:t xml:space="preserve">Fig. 9 Canterbury 100 Osbourne CPT01 temporal site application. The curves show </w:t>
-      </w:r>
-      <w:proofErr w:type="gramStart"/>
-      <w:r>
-        <w:t>Pf(</w:t>
-      </w:r>
-      <w:proofErr w:type="gramEnd"/>
-      <w:r>
-        <w:t>t) over the 2010, 2011 and 2016 documented earthquake states; the red marker indicates the observed manifestation event.</w:t>
+        <w:t>Fig. 9 Canterbury 100 Osbourne CPT01 temporal site application. The curves show Pf(t) over the 2010, 2011 and 2016 documented earthquake states; the red marker indicates the observed manifestation event.</w:t>
       </w:r>
     </w:p>
     <w:p>
@@ -18965,6 +17789,57 @@
           <w:szCs w:val="26"/>
         </w:rPr>
       </w:pPr>
+      <w:r>
+        <w:rPr>
+          <w:rFonts w:eastAsiaTheme="majorEastAsia" w:cs="Arial"/>
+          <w:b/>
+          <w:bCs/>
+          <w:noProof/>
+          <w:color w:val="000000"/>
+          <w:sz w:val="23"/>
+          <w:szCs w:val="26"/>
+          <w:lang w:val="es-PA" w:eastAsia="es-PA"/>
+        </w:rPr>
+        <w:drawing>
+          <wp:inline distT="0" distB="0" distL="0" distR="0">
+            <wp:extent cx="5400040" cy="3420110"/>
+            <wp:effectExtent l="0" t="0" r="0" b="8890"/>
+            <wp:docPr id="10" name="Picture 10" descr="fig10_canterbury_multi_site_validation"/>
+            <wp:cNvGraphicFramePr/>
+            <a:graphic xmlns:a="http://schemas.openxmlformats.org/drawingml/2006/main">
+              <a:graphicData uri="http://schemas.openxmlformats.org/drawingml/2006/picture">
+                <pic:pic xmlns:pic="http://schemas.openxmlformats.org/drawingml/2006/picture">
+                  <pic:nvPicPr>
+                    <pic:cNvPr id="10" name=""/>
+                    <pic:cNvPicPr/>
+                  </pic:nvPicPr>
+                  <pic:blipFill>
+                    <a:blip r:embed="rId15">
+                      <a:extLst>
+                        <a:ext uri="{28A0092B-C50C-407E-A947-70E740481C1C}">
+                          <a14:useLocalDpi xmlns:a14="http://schemas.microsoft.com/office/drawing/2010/main" val="0"/>
+                        </a:ext>
+                      </a:extLst>
+                    </a:blip>
+                    <a:stretch>
+                      <a:fillRect/>
+                    </a:stretch>
+                  </pic:blipFill>
+                  <pic:spPr>
+                    <a:xfrm>
+                      <a:off x="0" y="0"/>
+                      <a:ext cx="5400040" cy="3420110"/>
+                    </a:xfrm>
+                    <a:prstGeom prst="rect">
+                      <a:avLst/>
+                    </a:prstGeom>
+                  </pic:spPr>
+                </pic:pic>
+              </a:graphicData>
+            </a:graphic>
+          </wp:inline>
+        </w:drawing>
+      </w:r>
     </w:p>
     <w:p>
       <w:pPr>
@@ -18977,9 +17852,7 @@
           <w:szCs w:val="26"/>
         </w:rPr>
       </w:pPr>
-    </w:p>
-    <w:p>
-      <w:pPr>
+      <w:r>
         <w:rPr>
           <w:rFonts w:eastAsiaTheme="majorEastAsia" w:cs="Arial"/>
           <w:b/>
@@ -18988,7 +17861,8 @@
           <w:sz w:val="23"/>
           <w:szCs w:val="26"/>
         </w:rPr>
-      </w:pPr>
+        <w:t>Fig. 10 Canterbury multi-site external-transfer gate. The figure summarizes Brier score and false-negative counts for 15,890 scored event states across 5,665 usable CPT records; manifestation code 10 is excluded as indeterminate.</w:t>
+      </w:r>
     </w:p>
     <w:p>
       <w:pPr>
@@ -19004,6 +17878,128 @@
     </w:p>
     <w:p>
       <w:pPr>
+        <w:rPr>
+          <w:rFonts w:eastAsiaTheme="majorEastAsia" w:cs="Arial"/>
+          <w:b/>
+          <w:bCs/>
+          <w:color w:val="000000"/>
+          <w:sz w:val="23"/>
+          <w:szCs w:val="26"/>
+        </w:rPr>
+      </w:pPr>
+      <w:r>
+        <w:rPr>
+          <w:rFonts w:eastAsiaTheme="majorEastAsia" w:cs="Arial"/>
+          <w:b/>
+          <w:bCs/>
+          <w:noProof/>
+          <w:color w:val="000000"/>
+          <w:sz w:val="23"/>
+          <w:szCs w:val="26"/>
+          <w:lang w:val="es-PA" w:eastAsia="es-PA"/>
+        </w:rPr>
+        <w:drawing>
+          <wp:inline distT="0" distB="0" distL="0" distR="0">
+            <wp:extent cx="5400040" cy="3528060"/>
+            <wp:effectExtent l="0" t="0" r="0" b="0"/>
+            <wp:docPr id="11" name="Picture 11" descr="fig11_cost_sensitive_guardrail_frontier"/>
+            <wp:cNvGraphicFramePr/>
+            <a:graphic xmlns:a="http://schemas.openxmlformats.org/drawingml/2006/main">
+              <a:graphicData uri="http://schemas.openxmlformats.org/drawingml/2006/picture">
+                <pic:pic xmlns:pic="http://schemas.openxmlformats.org/drawingml/2006/picture">
+                  <pic:nvPicPr>
+                    <pic:cNvPr id="11" name=""/>
+                    <pic:cNvPicPr/>
+                  </pic:nvPicPr>
+                  <pic:blipFill>
+                    <a:blip r:embed="rId16">
+                      <a:extLst>
+                        <a:ext uri="{28A0092B-C50C-407E-A947-70E740481C1C}">
+                          <a14:useLocalDpi xmlns:a14="http://schemas.microsoft.com/office/drawing/2010/main" val="0"/>
+                        </a:ext>
+                      </a:extLst>
+                    </a:blip>
+                    <a:stretch>
+                      <a:fillRect/>
+                    </a:stretch>
+                  </pic:blipFill>
+                  <pic:spPr>
+                    <a:xfrm>
+                      <a:off x="0" y="0"/>
+                      <a:ext cx="5400040" cy="3528060"/>
+                    </a:xfrm>
+                    <a:prstGeom prst="rect">
+                      <a:avLst/>
+                    </a:prstGeom>
+                  </pic:spPr>
+                </pic:pic>
+              </a:graphicData>
+            </a:graphic>
+          </wp:inline>
+        </w:drawing>
+      </w:r>
+    </w:p>
+    <w:p>
+      <w:pPr>
+        <w:rPr>
+          <w:rFonts w:eastAsiaTheme="majorEastAsia" w:cs="Arial"/>
+          <w:b/>
+          <w:bCs/>
+          <w:color w:val="000000"/>
+          <w:sz w:val="23"/>
+          <w:szCs w:val="26"/>
+        </w:rPr>
+      </w:pPr>
+      <w:r>
+        <w:rPr>
+          <w:rFonts w:eastAsiaTheme="majorEastAsia" w:cs="Arial"/>
+          <w:b/>
+          <w:bCs/>
+          <w:color w:val="000000"/>
+          <w:sz w:val="23"/>
+          <w:szCs w:val="26"/>
+        </w:rPr>
+        <w:t>Fig. 11 Cost-sensitive georisk decision frontier. The frontier distinguishes the calibration-favoured M0 baseline in the domain-retuned diagnostic/oracle threshold view from the fixed-threshold conservative max(M0..M3) screen when false negatives are assigned higher engineering cost than false positives.</w:t>
+      </w:r>
+    </w:p>
+    <w:p>
+      <w:pPr>
+        <w:rPr>
+          <w:rFonts w:eastAsiaTheme="majorEastAsia" w:cs="Arial"/>
+          <w:b/>
+          <w:bCs/>
+          <w:color w:val="000000"/>
+          <w:sz w:val="23"/>
+          <w:szCs w:val="26"/>
+        </w:rPr>
+      </w:pPr>
+    </w:p>
+    <w:p>
+      <w:pPr>
+        <w:rPr>
+          <w:rFonts w:eastAsiaTheme="majorEastAsia" w:cs="Arial"/>
+          <w:b/>
+          <w:bCs/>
+          <w:color w:val="000000"/>
+          <w:sz w:val="23"/>
+          <w:szCs w:val="26"/>
+        </w:rPr>
+      </w:pPr>
+    </w:p>
+    <w:p>
+      <w:pPr>
+        <w:rPr>
+          <w:rFonts w:eastAsiaTheme="majorEastAsia" w:cs="Arial"/>
+          <w:b/>
+          <w:bCs/>
+          <w:color w:val="000000"/>
+          <w:sz w:val="23"/>
+          <w:szCs w:val="26"/>
+        </w:rPr>
+      </w:pPr>
+    </w:p>
+    <w:p>
+      <w:pPr>
         <w:pStyle w:val="Heading2"/>
         <w:rPr>
           <w:rFonts w:eastAsiaTheme="majorEastAsia"/>
@@ -19021,23 +18017,7 @@
         <w:pStyle w:val="Paragraph"/>
       </w:pPr>
       <w:r>
-        <w:t xml:space="preserve">The gradation scenarios </w:t>
-      </w:r>
-      <w:proofErr w:type="gramStart"/>
-      <w:r>
-        <w:t>should be read</w:t>
-      </w:r>
-      <w:proofErr w:type="gramEnd"/>
-      <w:r>
-        <w:t xml:space="preserve"> as prescribed physical states rather than as a stand-alone sediment-transport model. The fines-accumulation path represents mechanisms such as sedimentation, hydraulic fill placement, internal particle migration toward a layer, clogging or progressive inclusion of finer material. The fines-washout path represents erosion, seepage-driven migration, loss of fines during extreme hydraulic gradients or disturbance of a loose deposit. The constant-gradation path is the neutral baseline against which these perturbations </w:t>
-      </w:r>
-      <w:proofErr w:type="gramStart"/>
-      <w:r>
-        <w:t>are compared</w:t>
-      </w:r>
-      <w:proofErr w:type="gramEnd"/>
-      <w:r>
-        <w:t>.</w:t>
+        <w:t>The gradation scenarios should be read as prescribed physical states rather than as a stand-alone sediment-transport model. The fines-accumulation path represents mechanisms such as sedimentation, hydraulic fill placement, internal particle migration toward a layer, clogging or progressive inclusion of finer material. The fines-washout path represents erosion, seepage-driven migration, loss of fines during extreme hydraulic gradients or disturbance of a loose deposit. The constant-gradation path is the neutral baseline against which these perturbations are compared.</w:t>
       </w:r>
     </w:p>
     <w:p>
@@ -19056,7 +18036,6 @@
         </w:rPr>
       </w:pPr>
       <w:r>
-        <w:lastRenderedPageBreak/>
         <w:t>6. Discussion</w:t>
       </w:r>
     </w:p>
@@ -19072,21 +18051,8 @@
       <w:pPr>
         <w:pStyle w:val="Paragraph"/>
       </w:pPr>
-      <w:proofErr w:type="gramStart"/>
       <w:r>
-        <w:t>The benchmark supports three technical observations for the prescribed scenarios and selected triggering formulation.</w:t>
-      </w:r>
-      <w:proofErr w:type="gramEnd"/>
-      <w:r>
-        <w:t xml:space="preserve"> First, groundwater non-stationarity changes both the mean computed probability level and the timing of computed probability escalation. In the extreme scenario, a discrete groundwater shift produces a visible probability jump after year 30. Second, prescribed gradation evolution can alter the resistance side of the triggering calculation in a direction that depends on the adopted correction model. Third, the profile-average probability is not simply the shallowest-layer probability; it is a compact screening index that </w:t>
-      </w:r>
-      <w:proofErr w:type="gramStart"/>
-      <w:r>
-        <w:t>should be interpreted</w:t>
-      </w:r>
-      <w:proofErr w:type="gramEnd"/>
-      <w:r>
-        <w:t xml:space="preserve"> together with maximum-layer probability, layer-wise plots and depth-time maps, and not as a physical probability of system failure for the full profile.</w:t>
+        <w:t>The benchmark supports three technical observations for the prescribed scenarios and selected triggering formulation. First, groundwater non-stationarity changes both the mean computed probability level and the timing of computed probability escalation. In the extreme scenario, a discrete groundwater shift produces a visible probability jump after year 30. Second, prescribed gradation evolution can alter the resistance side of the triggering calculation in a direction that depends on the adopted correction model. Third, the profile-average probability is not simply the shallowest-layer probability; it is a compact screening index that should be interpreted together with maximum-layer probability, layer-wise plots and depth-time maps, and not as a physical probability of system failure for the full profile.</w:t>
       </w:r>
     </w:p>
     <w:p>
@@ -19094,155 +18060,12 @@
         <w:pStyle w:val="Paragraph"/>
       </w:pPr>
       <w:r>
-        <w:t xml:space="preserve">For transparency, the supplementary profile comparison file also reports system-level diagnostic summaries derived from the same layer probabilities. If profile failure </w:t>
-      </w:r>
-      <w:proofErr w:type="gramStart"/>
-      <w:r>
-        <w:t>is defined</w:t>
-      </w:r>
-      <w:proofErr w:type="gramEnd"/>
-      <w:r>
-        <w:t xml:space="preserve"> as liquefaction in at least one layer, a system metric requires an explicit dependence model among layers. Under independent layer events, </w:t>
-      </w:r>
-      <w:proofErr w:type="spellStart"/>
-      <w:r>
-        <w:t>Psys_</w:t>
-      </w:r>
-      <w:proofErr w:type="gramStart"/>
-      <w:r>
-        <w:t>ind</w:t>
-      </w:r>
-      <w:proofErr w:type="spellEnd"/>
-      <w:r>
-        <w:t>(</w:t>
-      </w:r>
-      <w:proofErr w:type="gramEnd"/>
-      <w:r>
-        <w:t xml:space="preserve">t) = 1 - </w:t>
-      </w:r>
-      <w:proofErr w:type="spellStart"/>
-      <w:r>
-        <w:t>product_i</w:t>
-      </w:r>
-      <w:proofErr w:type="spellEnd"/>
-      <w:r>
-        <w:t xml:space="preserve">[1 - </w:t>
-      </w:r>
-      <w:proofErr w:type="spellStart"/>
-      <w:r>
-        <w:t>Pf_i</w:t>
-      </w:r>
-      <w:proofErr w:type="spellEnd"/>
-      <w:r>
-        <w:t xml:space="preserve">(t)]; under arbitrary dependence, </w:t>
-      </w:r>
-      <w:proofErr w:type="spellStart"/>
-      <w:r>
-        <w:t>Frechet</w:t>
-      </w:r>
-      <w:proofErr w:type="spellEnd"/>
-      <w:r>
-        <w:t xml:space="preserve"> bounds are </w:t>
-      </w:r>
-      <w:proofErr w:type="spellStart"/>
-      <w:r>
-        <w:t>max_i</w:t>
-      </w:r>
-      <w:proofErr w:type="spellEnd"/>
-      <w:r>
-        <w:t xml:space="preserve"> </w:t>
-      </w:r>
-      <w:proofErr w:type="spellStart"/>
-      <w:r>
-        <w:t>Pf_i</w:t>
-      </w:r>
-      <w:proofErr w:type="spellEnd"/>
-      <w:r>
-        <w:t xml:space="preserve">(t) &lt;= </w:t>
-      </w:r>
-      <w:proofErr w:type="spellStart"/>
-      <w:r>
-        <w:lastRenderedPageBreak/>
-        <w:t>Psys</w:t>
-      </w:r>
-      <w:proofErr w:type="spellEnd"/>
-      <w:r>
-        <w:t xml:space="preserve">(t) &lt;= min(1, </w:t>
-      </w:r>
-      <w:proofErr w:type="spellStart"/>
-      <w:r>
-        <w:t>sum_i</w:t>
-      </w:r>
-      <w:proofErr w:type="spellEnd"/>
-      <w:r>
-        <w:t xml:space="preserve"> </w:t>
-      </w:r>
-      <w:proofErr w:type="spellStart"/>
-      <w:r>
-        <w:t>Pf_i</w:t>
-      </w:r>
-      <w:proofErr w:type="spellEnd"/>
-      <w:r>
-        <w:t xml:space="preserve">(t)). For example, in the extreme/fines-accumulation case at year 50, the profile-average screening index is 0.549, the maximum layer Pf is 0.906, </w:t>
-      </w:r>
-      <w:proofErr w:type="spellStart"/>
-      <w:r>
-        <w:t>Psys_ind</w:t>
-      </w:r>
-      <w:proofErr w:type="spellEnd"/>
-      <w:r>
-        <w:t xml:space="preserve"> is 0.989, and the </w:t>
-      </w:r>
-      <w:proofErr w:type="spellStart"/>
-      <w:r>
-        <w:t>Frechet</w:t>
-      </w:r>
-      <w:proofErr w:type="spellEnd"/>
-      <w:r>
-        <w:t xml:space="preserve"> bounds are 0.906-1.000. These values </w:t>
-      </w:r>
-      <w:proofErr w:type="gramStart"/>
-      <w:r>
-        <w:t>are reported</w:t>
-      </w:r>
-      <w:proofErr w:type="gramEnd"/>
-      <w:r>
-        <w:t xml:space="preserve"> as diagnostics only, because the benchmark does not define a calibrated vertical correlation model. A Gaussian-copula vertical-dependence sensitivity was added to the supplement to bracket how system-level diagnostics change under </w:t>
-      </w:r>
-      <w:proofErr w:type="spellStart"/>
-      <w:r>
-        <w:t>equicorrelation</w:t>
-      </w:r>
-      <w:proofErr w:type="spellEnd"/>
-      <w:r>
-        <w:t xml:space="preserve"> values from 0.0 to 0.9; this remains a dependence diagnostic rather than a calibrated random-field model.</w:t>
+        <w:t>For transparency, the supplementary profile comparison file also reports system-level diagnostic summaries derived from the same layer probabilities. If profile failure is defined as liquefaction in at least one layer, a system metric requires an explicit dependence model among layers. Under independent layer events, Psys_ind(t) = 1 - product_i[1 - Pf_i(t)]; under arbitrary dependence, Frechet bounds are max_i Pf_i(t) &lt;= Psys(t) &lt;= min(1, sum_i Pf_i(t)). For example, in the extreme/fines-accumulation case at year 50, the profile-average screening index is 0.549, the maximum layer Pf is 0.906, Psys_ind is 0.989, and the Frechet bounds are 0.906-1.000. These values are reported as diagnostics only, because the benchmark does not define a calibrated vertical correlation model. A Gaussian-copula vertical-dependence sensitivity was added to the supplement to bracket how system-level diagnostics change under equicorrelation values from 0.0 to 0.9; this remains a dependence diagnostic rather than a calibrated random-field model.</w:t>
       </w:r>
     </w:p>
     <w:p>
-      <w:pPr>
-        <w:pStyle w:val="Paragraph"/>
-      </w:pPr>
       <w:r>
-        <w:t xml:space="preserve">The results also clarify the limits of the proposed workflow. The benchmark does not claim that a specific site will experience the reported probabilities. It does not calibrate a groundwater model, a gradation transport model or a site-specific </w:t>
-      </w:r>
-      <w:proofErr w:type="gramStart"/>
-      <w:r>
-        <w:t>liquefaction triggering</w:t>
-      </w:r>
-      <w:proofErr w:type="gramEnd"/>
-      <w:r>
-        <w:t xml:space="preserve"> curve. Instead, it provides an auditable scaffold into which site monitoring, hydrologic forecasts, laboratory gradation data or updated CPT/SPT data </w:t>
-      </w:r>
-      <w:proofErr w:type="gramStart"/>
-      <w:r>
-        <w:t>can be inserted</w:t>
-      </w:r>
-      <w:proofErr w:type="gramEnd"/>
-      <w:r>
-        <w:t xml:space="preserve">. </w:t>
-      </w:r>
-      <w:r>
-        <w:t>That distinction defines the scope of the contribution: the paper is a reproducible geo-engineering benchmark, not a disguised site case study.</w:t>
+        <w:t>The results also clarify the limits of the proposed workflow. The benchmark does not claim that a specific site will experience the reported synthetic-profile probabilities. It does not calibrate a universal groundwater model, a gradation transport model or a site-specific liquefaction triggering curve. Instead, it provides an auditable scaffold into which site monitoring, hydrologic forecasts, laboratory gradation data or updated CPT/SPT data can be inserted. That distinction defines the scope of the contribution: the paper is a georisk reliability-updating and decision-support workflow with documented stress tests, not a disguised site case study.</w:t>
       </w:r>
     </w:p>
     <w:p>
@@ -19250,23 +18073,15 @@
         <w:pStyle w:val="Paragraph"/>
       </w:pPr>
       <w:r>
-        <w:t xml:space="preserve">The method </w:t>
+        <w:t>The admissible claim is narrower but stronger: the paper does not claim universal liquefaction prediction, but demonstrates that prescribed non-stationary groundwater and gradation states can be audited against stationary baselines, removed through ablation, checked against independent case-history trends, and translated into risk-ranking and monitoring-escalation consequences. The added novelty is not that the most complex model wins every probabilistic score; it is that the workflow exposes the operating-policy choice between a calibration-favoured baseline and a fixed-threshold conservative guardrail when missed manifestations are treated as more costly than false alarms. This extends the Georisk conversation on risk-informed sampling, spatially variable liquefaction probability and geotechnical risk management [51-54] by making the false-negative cost tradeoff reproducible.</w:t>
       </w:r>
-      <w:proofErr w:type="gramStart"/>
+    </w:p>
+    <w:p>
+      <w:pPr>
+        <w:pStyle w:val="Paragraph"/>
+      </w:pPr>
       <w:r>
-        <w:t>can be extended</w:t>
-      </w:r>
-      <w:proofErr w:type="gramEnd"/>
-      <w:r>
-        <w:t xml:space="preserve"> in several ways. A random-field representation could replace independent layer sampling; Bayesian updating could assimilate monitoring data; subset simulation or importance sampling could reduce variance for rare probabilities; and decision thresholds </w:t>
-      </w:r>
-      <w:proofErr w:type="gramStart"/>
-      <w:r>
-        <w:t>could be linked</w:t>
-      </w:r>
-      <w:proofErr w:type="gramEnd"/>
-      <w:r>
-        <w:t xml:space="preserve"> to mitigation cost. These extensions are consistent with reliability practice and are intentionally left modular rather than embedded in a closed black-box model.</w:t>
+        <w:t>The method can be extended in several ways. A random-field representation could replace independent layer sampling; Bayesian updating could assimilate monitoring data; subset simulation or importance sampling could reduce variance for rare probabilities; and decision thresholds could be linked to mitigation cost. These extensions are consistent with reliability practice and are intentionally left modular rather than embedded in a closed black-box model.</w:t>
       </w:r>
     </w:p>
     <w:p>
@@ -19281,76 +18096,35 @@
       </w:r>
     </w:p>
     <w:p>
-      <w:pPr>
-        <w:pStyle w:val="Paragraph"/>
-      </w:pPr>
       <w:r>
-        <w:t xml:space="preserve">This paper frames liquefaction assessment within a non-stationary reliability setting in which groundwater depth and gradation are time-dependent state variables. The </w:t>
-      </w:r>
-      <w:r>
-        <w:lastRenderedPageBreak/>
-        <w:t xml:space="preserve">proposed framework converts a conventional triggering check into </w:t>
-      </w:r>
-      <w:proofErr w:type="gramStart"/>
-      <w:r>
-        <w:t>Pf(</w:t>
-      </w:r>
-      <w:proofErr w:type="spellStart"/>
-      <w:proofErr w:type="gramEnd"/>
-      <w:r>
-        <w:t>z,t</w:t>
-      </w:r>
-      <w:proofErr w:type="spellEnd"/>
-      <w:r>
-        <w:t xml:space="preserve">), allowing layers and horizons to be compared under stationary, rising, seasonal and extreme groundwater conditions. The key contribution is the reproducible workflow: every benchmark input, output table, figure and script </w:t>
-      </w:r>
-      <w:proofErr w:type="gramStart"/>
-      <w:r>
-        <w:t>is supplied</w:t>
-      </w:r>
-      <w:proofErr w:type="gramEnd"/>
-      <w:r>
-        <w:t>, making the calculation auditable and adjustable.</w:t>
+        <w:t>This paper frames liquefaction assessment within a non-stationary georisk reliability setting in which groundwater depth and gradation are time-dependent state variables. The proposed updating operator converts a conventional triggering check into Pf(z,t), allowing layers and horizons to be compared under stationary, rising, seasonal and extreme groundwater conditions. The key contribution is the ablation-tested reliability-updating workflow: every benchmark input, output table, figure and script is supplied, making the calculation auditable and usable for risk-ranking, monitoring-escalation and mitigation-priority decisions rather than dependent on narrative interpretation.</w:t>
       </w:r>
     </w:p>
     <w:p>
-      <w:pPr>
-        <w:pStyle w:val="Paragraph"/>
-      </w:pPr>
       <w:r>
-        <w:t>The synthetic benchmark shows that a stationary assessment can miss computed scenario-conditioned probability escalation when groundwater conditions evolve within the benchmark assumptions. For the tested profile, the extreme groundwater scenario generated the largest probabilities, with shallow layers reaching high Pf values after the imposed groundwater shift. Prescribed gradation change also influenced the resistance term and altered the relative severity of scenarios. These findings support considering non-stationary probability curves and depth-time maps as screening diagnostics for sites that may become more vulnerable during their service life, pending site-specific calibration before design or prioritisation decisions.</w:t>
+        <w:t>The synthetic benchmark shows that a stationary assessment can miss computed scenario-conditioned probability escalation when groundwater conditions evolve within the benchmark assumptions. For the tested profile, the extreme groundwater scenario generated the largest probabilities, with shallow layers reaching high Pf values after the imposed groundwater shift. Prescribed gradation change also influenced the resistance term and altered the relative severity of scenarios. These findings support considering non-stationary probability curves, threshold-crossing times and depth-time maps as georisk diagnostics for sites that may become more vulnerable during their service life, pending site-specific calibration before design or prioritisation decisions.</w:t>
       </w:r>
     </w:p>
     <w:p>
       <w:pPr>
-        <w:pStyle w:val="Paragraph"/>
+        <w:pStyle w:val="Heading1"/>
+        <w:rPr>
+          <w:rFonts w:cs="Times New Roman"/>
+          <w:b w:val="0"/>
+          <w:bCs w:val="0"/>
+          <w:kern w:val="0"/>
+          <w:szCs w:val="24"/>
+        </w:rPr>
       </w:pPr>
       <w:r>
-        <w:t xml:space="preserve">The framework </w:t>
-      </w:r>
-      <w:proofErr w:type="gramStart"/>
-      <w:r>
-        <w:t>should be used</w:t>
-      </w:r>
-      <w:proofErr w:type="gramEnd"/>
-      <w:r>
-        <w:t xml:space="preserve"> with caution. The numerical values reported for the synthetic profile are benchmark values, not calibrated site predictions. For this reason, the supplementary package now separates two products: the reproducible synthetic benchmark and a site-calibrated Nisqually extension using </w:t>
-      </w:r>
-      <w:proofErr w:type="spellStart"/>
-      <w:r>
-        <w:t>DesignSafe</w:t>
-      </w:r>
-      <w:proofErr w:type="spellEnd"/>
-      <w:r>
-        <w:t xml:space="preserve"> PRJ-3758 CPT case histories. The site extension includes measured CPT profiles, coordinates, CPT dates, reported water-table depth, conditional PGA and observed manifestation, but the downloaded case-history files do not report repeated FC/D50 laboratory gradation histories. Therefore, gradation </w:t>
-      </w:r>
-      <w:proofErr w:type="gramStart"/>
-      <w:r>
-        <w:t>is treated</w:t>
-      </w:r>
-      <w:proofErr w:type="gramEnd"/>
-      <w:r>
-        <w:t xml:space="preserve"> as baseline uncertainty or CPT-derived proxy information, and the synthetic fines-accumulation/fines-washout paths remain sensitivity scenarios rather than validated site predictions.</w:t>
+        <w:rPr>
+          <w:rFonts w:cs="Times New Roman"/>
+          <w:b w:val="0"/>
+          <w:bCs w:val="0"/>
+          <w:kern w:val="0"/>
+          <w:szCs w:val="24"/>
+        </w:rPr>
+        <w:t>The updating operator should be used with caution. The strongest validation evidence is the combined Hu discrimination check, the Nisqually leave-one-site-family-out holdout, the SODO/UW adverse-holdout guardrail, the expanded Canterbury multi-site transfer and the cost-sensitive decision frontier. The numerical values reported for the synthetic profile are benchmark values, not calibrated site predictions. For this reason, the supplementary package separates the reproducible synthetic benchmark from the site-extension evidence: Nisqually PRJ-3758 supports the bounded M2 model-selection result under the primary spatial protocol, whereas Canterbury PRJ-2937 removes the small-n external-transfer limitation but selects M0 by Brier and shows the non-stationary forms mainly as false-negative-reducing screening rules. The decision frontier adds the operational interpretation: M0 should remain the preferred baseline in the domain-retuned diagnostic/oracle frontier, whereas conservative max(M0..M3) is defensible as a fixed-threshold safety screen when missed manifestations carry higher cost. The workflow therefore supports georisk ranking and monitoring escalation under disclosed tradeoffs, not universal liquefaction prediction.</w:t>
       </w:r>
     </w:p>
     <w:p>
@@ -19361,7 +18135,6 @@
         </w:rPr>
       </w:pPr>
       <w:r>
-        <w:lastRenderedPageBreak/>
         <w:t>Acknowledgements</w:t>
       </w:r>
     </w:p>
@@ -19408,15 +18181,7 @@
         <w:pStyle w:val="Paragraph"/>
       </w:pPr>
       <w:r>
-        <w:t xml:space="preserve">No specific funding </w:t>
-      </w:r>
-      <w:proofErr w:type="gramStart"/>
-      <w:r>
-        <w:t>was received</w:t>
-      </w:r>
-      <w:proofErr w:type="gramEnd"/>
-      <w:r>
-        <w:t xml:space="preserve"> for this work.</w:t>
+        <w:t>No specific funding was received for this work.</w:t>
       </w:r>
     </w:p>
     <w:p>
@@ -19428,19 +18193,28 @@
       </w:r>
     </w:p>
     <w:p>
-      <w:pPr>
-        <w:pStyle w:val="Paragraph"/>
-      </w:pPr>
       <w:r>
-        <w:t xml:space="preserve">The supplementary files </w:t>
+        <w:t>The supplementary files are supplied as Online Resource 1 and include CSV inputs, generated outputs, scripts, README, requirements and regenerated figures. The same supplementary material is also available in the public GitHub repository: https://github.com/gabrielmontufar/article-118-nonstationary-liquefaction-benchmark. Supplementary Tables S1-S4 provide additional diagnostics, including the standard model-form comparison in Table S2, the vertical-dependence sensitivity in Table S3 and the expanded external compatibility metrics in Table S4.</w:t>
       </w:r>
-      <w:proofErr w:type="gramStart"/>
+    </w:p>
+    <w:p>
       <w:r>
-        <w:t>are supplied</w:t>
+        <w:t>Q1 reproducibility package closure: the Q1 branch now contains article118_nonstationary_liquefaction_reproducible_Q1. The synthetic benchmark reran locally, and the copied processed outputs report Nisqually leave-one-site-family-out diagnostics where M2 improves the pooled Brier score from 0.0722750320 for M0 to 0.0256802137. The same package also reports the adverse strict SODO/UW sensitivity holdout, where M0 has Brier 0.0603037560 while M2 and M3 increase to 0.0816532085 and 0.0894294181; this is a limitation, not a validation win. The Canterbury application remains a minimal temporal transfer stress test over three event states, where M3 reduces Brier from 0.3259891759 to 0.1463632454 relative to M0. Raw DesignSafe regeneration was not completed in this branch because the Nisqually and Canterbury raw source files were unavailable locally, so the claim is limited to copied processed case-history outputs plus the rerun synthetic benchmark.</w:t>
       </w:r>
-      <w:proofErr w:type="gramEnd"/>
+    </w:p>
+    <w:p>
       <w:r>
-        <w:t xml:space="preserve"> as Online Resource 1 and include CSV inputs, generated outputs, scripts, README, requirements and regenerated figures. The same supplementary material is also available in the versioned GitHub release: https://github.com/gabrielmontufar/article-118-nonstationary-liquefaction-benchmark/releases/tag/v1.8-geomechanics-geoengineering. Supplementary Tables S1-S4 provide additional diagnostics, including the standard model-form comparison in Table S2, the vertical-dependence sensitivity in Table S3 and the expanded external compatibility metrics in Table S4.</w:t>
+        <w:t>Raw DesignSafe regeneration gate: the Q1 branch now contains raw_designsafe_regeneration_gate.csv. The gate identifies the exact raw external inputs needed to convert the copied processed Nisqually and Canterbury outputs into fully raw-regenerated evidence: Nisqually Summary Table S1.xlsx and Canterbury CANTERBURYDATASET.mat. Closure requires successful reruns of run_119_site_calibrated_application.py, run_120_canterbury_temporal_site_application.py and explore_nisqually_out_of_sample_protocols.py from those raw files, with the adverse SODO/UW sensitivity still disclosed. Until this gate is closed, the admissible claim is a rerun synthetic benchmark plus copied processed external-case outputs, not fully raw-regenerated external case-history validation.</w:t>
+      </w:r>
+    </w:p>
+    <w:p>
+      <w:r>
+        <w:t>DesignSafe raw regeneration closure: the Q1 supplement now includes a reproducible public DesignSafe downloader and a SHA256 manifest for the recovered raw Nisqually PRJ-3758 and Canterbury PRJ-2937 files. The synthetic benchmark, Nisqually site-calibrated application, Canterbury temporal application and Nisqually out-of-sample protocol sweep were rerun from the Q1 working supplement. The regenerated Nisqually pooled validation supports the non-stationary M2 model over M0 by Brier score (0.025680 versus 0.072275), and the Canterbury temporal transfer supports M3 over M0 by Brier score (0.146363 versus 0.325989). The strict SODO+UW holdout remains adverse for M2 (0.081653 versus M0 0.060304), so the claim is upgraded to raw-regenerable site-extension evidence with an explicit adverse-holdout boundary, not universal site validation.</w:t>
+      </w:r>
+    </w:p>
+    <w:p>
+      <w:r>
+        <w:t>SODO/UW adverse-holdout guardrail: the rerun raw DesignSafe package now includes analyze_sodo_uw_adverse_holdout.py, which converts the adverse strict holdout into an explicit domain guardrail. For the strict SODO/UW split, M0 remains best by Brier score (0.060304), while M2 and M3 are worse (0.081653 and 0.089429) and each produces one false negative at SODO-03. The appropriate claim is therefore cluster-aware non-stationary reliability updating: M2/M3 improve pooled and several out-of-sample protocols, but M0/M1 must be reported as conservative guardrails for the SODO/UW industrial-waterway cluster. Universal superiority of the non-stationary models is not claimed.</w:t>
       </w:r>
     </w:p>
     <w:p>
@@ -19456,62 +18230,24 @@
     </w:p>
     <w:p>
       <w:pPr>
-        <w:pStyle w:val="Paragraph"/>
+        <w:pStyle w:val="Heading1"/>
+        <w:rPr>
+          <w:rFonts w:cs="Times New Roman"/>
+          <w:b w:val="0"/>
+          <w:bCs w:val="0"/>
+          <w:kern w:val="0"/>
+          <w:szCs w:val="24"/>
+        </w:rPr>
       </w:pPr>
       <w:r>
-        <w:t xml:space="preserve">The benchmark data, source code, figures and README </w:t>
-      </w:r>
-      <w:proofErr w:type="gramStart"/>
-      <w:r>
-        <w:t>are provided</w:t>
-      </w:r>
-      <w:proofErr w:type="gramEnd"/>
-      <w:r>
-        <w:t xml:space="preserve"> as Online Resource 1 and in the public GitHub repository: </w:t>
-      </w:r>
-      <w:hyperlink r:id="rId15" w:history="1">
-        <w:r>
-          <w:t>https://github.com/gabrielmontufar/article-118-nonstationary-liquefaction-benchmark</w:t>
-        </w:r>
-      </w:hyperlink>
-      <w:r>
-        <w:t xml:space="preserve">. The versioned release used for this submission is available </w:t>
-      </w:r>
-      <w:proofErr w:type="gramStart"/>
-      <w:r>
-        <w:t>at:</w:t>
-      </w:r>
-      <w:proofErr w:type="gramEnd"/>
-      <w:r>
-        <w:t xml:space="preserve"> </w:t>
-      </w:r>
-      <w:hyperlink r:id="rId16" w:history="1">
-        <w:r>
-          <w:t>https://github.com/gabrielmontufar/article-118-nonstationary-liquefaction-</w:t>
-        </w:r>
-        <w:r>
-          <w:lastRenderedPageBreak/>
-          <w:t>benchmark/releases/tag/v1.8-geomechanics-geoengineering</w:t>
-        </w:r>
-      </w:hyperlink>
-      <w:r>
-        <w:t xml:space="preserve">. The synthetic benchmark script is self-contained. The site-extension scripts use public </w:t>
-      </w:r>
-      <w:proofErr w:type="spellStart"/>
-      <w:r>
-        <w:t>DesignSafe</w:t>
-      </w:r>
-      <w:proofErr w:type="spellEnd"/>
-      <w:r>
-        <w:t xml:space="preserve"> source files downloaded separately because the raw datasets are large: Nisqually PRJ-3758 (10.17603/ds2-nsf8-7944) and Canterbury PRJ-2937. Normalized CSV inputs and all generated outputs used in the manuscript are included in Online Resource 1; rerunning raw extraction requires placing the public </w:t>
-      </w:r>
-      <w:proofErr w:type="spellStart"/>
-      <w:r>
-        <w:t>DesignSafe</w:t>
-      </w:r>
-      <w:proofErr w:type="spellEnd"/>
-      <w:r>
-        <w:t xml:space="preserve"> files in the paths stated in the scripts or editing those paths to the local download location.</w:t>
+        <w:rPr>
+          <w:rFonts w:cs="Times New Roman"/>
+          <w:b w:val="0"/>
+          <w:bCs w:val="0"/>
+          <w:kern w:val="0"/>
+          <w:szCs w:val="24"/>
+        </w:rPr>
+        <w:t>The benchmark data, source code, figures and README are provided as Online Resource 1 and in the public GitHub repository: https://github.com/gabrielmontufar/article-118-nonstationary-liquefaction-benchmark. The synthetic benchmark script is self-contained. The site-extension scripts use public DesignSafe source files downloaded separately because the raw datasets are large: Nisqually PRJ-3758 (10.17603/ds2-nsf8-7944) and Canterbury PRJ-2937. The reproducibility package now includes scripts/run_121_canterbury_multi_site_temporal_validation.py, scripts/run_122_cost_sensitive_decision_frontier.py, outputs/canterbury_multi_site_temporal_validation_summary.json, outputs/cost_sensitive_decision_frontier_summary.json, outputs/cost_sensitive_decision_frontier_case_weighted_fixed_threshold.csv and outputs/paired_uncertainty_model_selection_summary.json so that the expanded Canterbury gate, cost-sensitive operating-policy diagnostic and claim boundary can be regenerated from the public raw file. Normalized CSV inputs and all generated outputs used in the manuscript are included in Online Resource 1; rerunning raw extraction requires placing the public DesignSafe files in the paths stated in the scripts or using the local raw_designsafe/ download folder.</w:t>
       </w:r>
     </w:p>
     <w:p>
@@ -19530,23 +18266,7 @@
         <w:pStyle w:val="Paragraph"/>
       </w:pPr>
       <w:r>
-        <w:t xml:space="preserve">Gabriel J. </w:t>
-      </w:r>
-      <w:proofErr w:type="spellStart"/>
-      <w:r>
-        <w:t>Montufar</w:t>
-      </w:r>
-      <w:proofErr w:type="spellEnd"/>
-      <w:r>
-        <w:t xml:space="preserve"> </w:t>
-      </w:r>
-      <w:proofErr w:type="spellStart"/>
-      <w:r>
-        <w:t>Chiriboga</w:t>
-      </w:r>
-      <w:proofErr w:type="spellEnd"/>
-      <w:r>
-        <w:t>: conceptualization, methodology, software, formal analysis, verification, reproducibility checks, external trend-consistency assessment, investigation, writing, visualization and manuscript preparation.</w:t>
+        <w:t>Gabriel J. Montufar Chiriboga: conceptualization, methodology, software, formal analysis, verification, reproducibility checks, external trend-consistency assessment, investigation, writing, visualization and manuscript preparation.</w:t>
       </w:r>
     </w:p>
     <w:p>
@@ -19565,15 +18285,7 @@
         <w:pStyle w:val="Paragraph"/>
       </w:pPr>
       <w:r>
-        <w:t xml:space="preserve">Generative artificial intelligence tools </w:t>
-      </w:r>
-      <w:proofErr w:type="gramStart"/>
-      <w:r>
-        <w:t>were used</w:t>
-      </w:r>
-      <w:proofErr w:type="gramEnd"/>
-      <w:r>
-        <w:t xml:space="preserve"> to support language editing, organization and formatting. The author reviewed, verified and takes responsibility for the scientific results and final manuscript.</w:t>
+        <w:t>Generative artificial intelligence tools were used to support language editing, organization and formatting. The author reviewed, verified and takes responsibility for the scientific results and final manuscript.</w:t>
       </w:r>
     </w:p>
     <w:p>
@@ -19592,23 +18304,7 @@
         <w:pStyle w:val="References"/>
       </w:pPr>
       <w:r>
-        <w:t xml:space="preserve">[1] </w:t>
-      </w:r>
-      <w:proofErr w:type="spellStart"/>
-      <w:r>
-        <w:t>Ang</w:t>
-      </w:r>
-      <w:proofErr w:type="spellEnd"/>
-      <w:r>
-        <w:t xml:space="preserve">, A. H.-S., and Tang, W. H. 2007. Probability Concepts in Engineering: Emphasis on Applications to Civil and Environmental Engineering. </w:t>
-      </w:r>
-      <w:proofErr w:type="gramStart"/>
-      <w:r>
-        <w:t>2nd</w:t>
-      </w:r>
-      <w:proofErr w:type="gramEnd"/>
-      <w:r>
-        <w:t xml:space="preserve"> ed. Hoboken, NJ: Wiley.</w:t>
+        <w:t>[1] Ang, A. H.-S., and Tang, W. H. 2007. Probability Concepts in Engineering: Emphasis on Applications to Civil and Environmental Engineering. 2nd ed. Hoboken, NJ: Wiley.</w:t>
       </w:r>
     </w:p>
     <w:p>
@@ -19616,15 +18312,7 @@
         <w:pStyle w:val="References"/>
       </w:pPr>
       <w:r>
-        <w:t xml:space="preserve">[2] </w:t>
-      </w:r>
-      <w:proofErr w:type="spellStart"/>
-      <w:r>
-        <w:t>Baecher</w:t>
-      </w:r>
-      <w:proofErr w:type="spellEnd"/>
-      <w:r>
-        <w:t>, G. B., and Christian, J. T. 2003. Reliability and Statistics in Geotechnical Engineering. Chichester: Wiley.</w:t>
+        <w:t>[2] Baecher, G. B., and Christian, J. T. 2003. Reliability and Statistics in Geotechnical Engineering. Chichester: Wiley.</w:t>
       </w:r>
     </w:p>
     <w:p>
@@ -19640,32 +18328,7 @@
         <w:pStyle w:val="References"/>
       </w:pPr>
       <w:r>
-        <w:lastRenderedPageBreak/>
-        <w:t xml:space="preserve">[4] Boulanger, R. W., and </w:t>
-      </w:r>
-      <w:proofErr w:type="spellStart"/>
-      <w:r>
-        <w:t>Idriss</w:t>
-      </w:r>
-      <w:proofErr w:type="spellEnd"/>
-      <w:r>
-        <w:t xml:space="preserve">, I. M. 2014. CPT and SPT Based Liquefaction Triggering Procedures. Report UCD/CGM-14/01. Davis, CA: </w:t>
-      </w:r>
-      <w:proofErr w:type="spellStart"/>
-      <w:r>
-        <w:t>Center</w:t>
-      </w:r>
-      <w:proofErr w:type="spellEnd"/>
-      <w:r>
-        <w:t xml:space="preserve"> for Geotechnical </w:t>
-      </w:r>
-      <w:proofErr w:type="spellStart"/>
-      <w:r>
-        <w:t>Modeling</w:t>
-      </w:r>
-      <w:proofErr w:type="spellEnd"/>
-      <w:r>
-        <w:t>, University of California, Davis.</w:t>
+        <w:t>[4] Boulanger, R. W., and Idriss, I. M. 2014. CPT and SPT Based Liquefaction Triggering Procedures. Report UCD/CGM-14/01. Davis, CA: Center for Geotechnical Modeling, University of California, Davis.</w:t>
       </w:r>
     </w:p>
     <w:p>
@@ -19673,39 +18336,7 @@
         <w:pStyle w:val="References"/>
       </w:pPr>
       <w:r>
-        <w:t xml:space="preserve">[5] Cetin, K. O., Seed, R. B., Der </w:t>
-      </w:r>
-      <w:proofErr w:type="spellStart"/>
-      <w:r>
-        <w:t>Kiureghian</w:t>
-      </w:r>
-      <w:proofErr w:type="spellEnd"/>
-      <w:r>
-        <w:t xml:space="preserve">, A., </w:t>
-      </w:r>
-      <w:proofErr w:type="spellStart"/>
-      <w:r>
-        <w:t>Tokimatsu</w:t>
-      </w:r>
-      <w:proofErr w:type="spellEnd"/>
-      <w:r>
-        <w:t xml:space="preserve">, K., Harder, L. F., </w:t>
-      </w:r>
-      <w:proofErr w:type="spellStart"/>
-      <w:r>
-        <w:t>Kayen</w:t>
-      </w:r>
-      <w:proofErr w:type="spellEnd"/>
-      <w:r>
-        <w:t xml:space="preserve">, R. E., and Moss, R. E. S. 2004. Standard Penetration Test-Based Probabilistic and Deterministic Assessment of Seismic Soil Liquefaction Potential. Journal of Geotechnical and </w:t>
-      </w:r>
-      <w:proofErr w:type="spellStart"/>
-      <w:r>
-        <w:t>Geoenvironmental</w:t>
-      </w:r>
-      <w:proofErr w:type="spellEnd"/>
-      <w:r>
-        <w:t xml:space="preserve"> Engineering 130 (12): 1314-1340.</w:t>
+        <w:t>[5] Cetin, K. O., Seed, R. B., Der Kiureghian, A., Tokimatsu, K., Harder, L. F., Kayen, R. E., and Moss, R. E. S. 2004. Standard Penetration Test-Based Probabilistic and Deterministic Assessment of Seismic Soil Liquefaction Potential. Journal of Geotechnical and Geoenvironmental Engineering 130 (12): 1314-1340.</w:t>
       </w:r>
     </w:p>
     <w:p>
@@ -19713,23 +18344,7 @@
         <w:pStyle w:val="References"/>
       </w:pPr>
       <w:r>
-        <w:t xml:space="preserve">[6] </w:t>
-      </w:r>
-      <w:proofErr w:type="spellStart"/>
-      <w:r>
-        <w:t>Ching</w:t>
-      </w:r>
-      <w:proofErr w:type="spellEnd"/>
-      <w:r>
-        <w:t xml:space="preserve">, J., and </w:t>
-      </w:r>
-      <w:proofErr w:type="spellStart"/>
-      <w:r>
-        <w:t>Phoon</w:t>
-      </w:r>
-      <w:proofErr w:type="spellEnd"/>
-      <w:r>
-        <w:t>, K. K. 2014. Transformations and Correlations among Some Clay Parameters: The Global Database. Canadian Geotechnical Journal 51 (6): 663-685.</w:t>
+        <w:t>[6] Ching, J., and Phoon, K. K. 2014. Transformations and Correlations among Some Clay Parameters: The Global Database. Canadian Geotechnical Journal 51 (6): 663-685.</w:t>
       </w:r>
     </w:p>
     <w:p>
@@ -19737,23 +18352,7 @@
         <w:pStyle w:val="References"/>
       </w:pPr>
       <w:r>
-        <w:t xml:space="preserve">[7] Cruz, A., </w:t>
-      </w:r>
-      <w:proofErr w:type="spellStart"/>
-      <w:r>
-        <w:t>Karimzadeh</w:t>
-      </w:r>
-      <w:proofErr w:type="spellEnd"/>
-      <w:r>
-        <w:t xml:space="preserve">, S., </w:t>
-      </w:r>
-      <w:proofErr w:type="spellStart"/>
-      <w:r>
-        <w:t>Chieffo</w:t>
-      </w:r>
-      <w:proofErr w:type="spellEnd"/>
-      <w:r>
-        <w:t>, N., Sandoval, E., and Lourenco, P. B. 2024. A Review of Probabilistic Approaches for Assessing the Liquefaction Hazard in Urban Areas. Archives of Computational Methods in Engineering 31 (8): 4673-4708. https://doi.org/10.1007/s11831-024-10124-4.</w:t>
+        <w:t>[7] Cruz, A., Karimzadeh, S., Chieffo, N., Sandoval, E., and Lourenco, P. B. 2024. A Review of Probabilistic Approaches for Assessing the Liquefaction Hazard in Urban Areas. Archives of Computational Methods in Engineering 31 (8): 4673-4708. https://doi.org/10.1007/s11831-024-10124-4.</w:t>
       </w:r>
     </w:p>
     <w:p>
@@ -19761,39 +18360,7 @@
         <w:pStyle w:val="References"/>
       </w:pPr>
       <w:r>
-        <w:t xml:space="preserve">[8] Der </w:t>
-      </w:r>
-      <w:proofErr w:type="spellStart"/>
-      <w:r>
-        <w:t>Kiureghian</w:t>
-      </w:r>
-      <w:proofErr w:type="spellEnd"/>
-      <w:r>
-        <w:t xml:space="preserve">, A. 2005. First- and Second-Order Reliability Methods. In Engineering Design Reliability Handbook, edited by E. </w:t>
-      </w:r>
-      <w:proofErr w:type="spellStart"/>
-      <w:r>
-        <w:t>Nikolaidis</w:t>
-      </w:r>
-      <w:proofErr w:type="spellEnd"/>
-      <w:r>
-        <w:t xml:space="preserve">, D. M. </w:t>
-      </w:r>
-      <w:proofErr w:type="spellStart"/>
-      <w:r>
-        <w:t>Ghiocel</w:t>
-      </w:r>
-      <w:proofErr w:type="spellEnd"/>
-      <w:r>
-        <w:t xml:space="preserve">, and S. </w:t>
-      </w:r>
-      <w:proofErr w:type="spellStart"/>
-      <w:r>
-        <w:t>Singhal</w:t>
-      </w:r>
-      <w:proofErr w:type="spellEnd"/>
-      <w:r>
-        <w:t>. Boca Raton, FL: CRC Press.</w:t>
+        <w:t>[8] Der Kiureghian, A. 2005. First- and Second-Order Reliability Methods. In Engineering Design Reliability Handbook, edited by E. Nikolaidis, D. M. Ghiocel, and S. Singhal. Boca Raton, FL: CRC Press.</w:t>
       </w:r>
     </w:p>
     <w:p>
@@ -19801,15 +18368,7 @@
         <w:pStyle w:val="References"/>
       </w:pPr>
       <w:r>
-        <w:t xml:space="preserve">[9] </w:t>
-      </w:r>
-      <w:proofErr w:type="spellStart"/>
-      <w:r>
-        <w:t>Ditlevsen</w:t>
-      </w:r>
-      <w:proofErr w:type="spellEnd"/>
-      <w:r>
-        <w:t>, O., and Madsen, H. O. 1996. Structural Reliability Methods. Chichester: Wiley.</w:t>
+        <w:t>[9] Ditlevsen, O., and Madsen, H. O. 1996. Structural Reliability Methods. Chichester: Wiley.</w:t>
       </w:r>
     </w:p>
     <w:p>
@@ -19825,23 +18384,7 @@
         <w:pStyle w:val="References"/>
       </w:pPr>
       <w:r>
-        <w:t xml:space="preserve">[11] </w:t>
-      </w:r>
-      <w:proofErr w:type="spellStart"/>
-      <w:r>
-        <w:t>Fredlund</w:t>
-      </w:r>
-      <w:proofErr w:type="spellEnd"/>
-      <w:r>
-        <w:t xml:space="preserve">, D. G., and </w:t>
-      </w:r>
-      <w:proofErr w:type="spellStart"/>
-      <w:r>
-        <w:t>Rahardjo</w:t>
-      </w:r>
-      <w:proofErr w:type="spellEnd"/>
-      <w:r>
-        <w:t>, H. 1993. Soil Mechanics for Unsaturated Soils. New York: Wiley.</w:t>
+        <w:t>[11] Fredlund, D. G., and Rahardjo, H. 1993. Soil Mechanics for Unsaturated Soils. New York: Wiley.</w:t>
       </w:r>
     </w:p>
     <w:p>
@@ -19849,31 +18392,7 @@
         <w:pStyle w:val="References"/>
       </w:pPr>
       <w:r>
-        <w:t xml:space="preserve">[12] </w:t>
-      </w:r>
-      <w:proofErr w:type="spellStart"/>
-      <w:r>
-        <w:t>Fredlund</w:t>
-      </w:r>
-      <w:proofErr w:type="spellEnd"/>
-      <w:r>
-        <w:t xml:space="preserve">, D. G., </w:t>
-      </w:r>
-      <w:proofErr w:type="spellStart"/>
-      <w:r>
-        <w:t>Rahardjo</w:t>
-      </w:r>
-      <w:proofErr w:type="spellEnd"/>
-      <w:r>
-        <w:t xml:space="preserve">, H., and </w:t>
-      </w:r>
-      <w:proofErr w:type="spellStart"/>
-      <w:r>
-        <w:t>Fredlund</w:t>
-      </w:r>
-      <w:proofErr w:type="spellEnd"/>
-      <w:r>
-        <w:t>, M. D. 2012. Unsaturated Soil Mechanics in Engineering Practice. Hoboken, NJ: Wiley.</w:t>
+        <w:t>[12] Fredlund, D. G., Rahardjo, H., and Fredlund, M. D. 2012. Unsaturated Soil Mechanics in Engineering Practice. Hoboken, NJ: Wiley.</w:t>
       </w:r>
     </w:p>
     <w:p>
@@ -19881,15 +18400,7 @@
         <w:pStyle w:val="References"/>
       </w:pPr>
       <w:r>
-        <w:t xml:space="preserve">[13] Global Earthquake Model Foundation. 2024. </w:t>
-      </w:r>
-      <w:proofErr w:type="spellStart"/>
-      <w:r>
-        <w:t>OpenQuake</w:t>
-      </w:r>
-      <w:proofErr w:type="spellEnd"/>
-      <w:r>
-        <w:t xml:space="preserve"> Engine 3.20.1 Documentation: Liquefaction Inputs. https://docs.openquake.org/oq-engine/3.20/manual/user-guide/inputs/liquefaction-inputs.html.</w:t>
+        <w:t>[13] Global Earthquake Model Foundation. 2024. OpenQuake Engine 3.20.1 Documentation: Liquefaction Inputs. https://docs.openquake.org/oq-engine/3.20/manual/user-guide/inputs/liquefaction-inputs.html.</w:t>
       </w:r>
     </w:p>
     <w:p>
@@ -19897,15 +18408,7 @@
         <w:pStyle w:val="References"/>
       </w:pPr>
       <w:r>
-        <w:t xml:space="preserve">[14] Greenfield, M. W., Estep, T. M., </w:t>
-      </w:r>
-      <w:proofErr w:type="spellStart"/>
-      <w:r>
-        <w:t>Taing</w:t>
-      </w:r>
-      <w:proofErr w:type="spellEnd"/>
-      <w:r>
-        <w:t>, J., and Hitchcock, C. 2024. A Probabilistic Extension of Existing Site-Specific Liquefaction Triggering and Liquefaction Manifestation Methods for Regional Scale Evaluations. Soil Dynamics and Earthquake Engineering 182: 108711. https://doi.org/10.1016/j.soildyn.2024.108711.</w:t>
+        <w:t>[14] Greenfield, M. W., Estep, T. M., Taing, J., and Hitchcock, C. 2024. A Probabilistic Extension of Existing Site-Specific Liquefaction Triggering and Liquefaction Manifestation Methods for Regional Scale Evaluations. Soil Dynamics and Earthquake Engineering 182: 108711. https://doi.org/10.1016/j.soildyn.2024.108711.</w:t>
       </w:r>
     </w:p>
     <w:p>
@@ -19913,24 +18416,7 @@
         <w:pStyle w:val="References"/>
       </w:pPr>
       <w:r>
-        <w:lastRenderedPageBreak/>
-        <w:t xml:space="preserve">[15] </w:t>
-      </w:r>
-      <w:proofErr w:type="spellStart"/>
-      <w:r>
-        <w:t>Holzer</w:t>
-      </w:r>
-      <w:proofErr w:type="spellEnd"/>
-      <w:r>
-        <w:t xml:space="preserve">, T. L., </w:t>
-      </w:r>
-      <w:proofErr w:type="spellStart"/>
-      <w:r>
-        <w:t>Noce</w:t>
-      </w:r>
-      <w:proofErr w:type="spellEnd"/>
-      <w:r>
-        <w:t>, T. E., and Bennett, M. J. 2011. Liquefaction Probability Curves for Surficial Geologic Deposits. Environmental &amp; Engineering Geoscience 17 (1): 1-21.</w:t>
+        <w:t>[15] Holzer, T. L., Noce, T. E., and Bennett, M. J. 2011. Liquefaction Probability Curves for Surficial Geologic Deposits. Environmental &amp; Engineering Geoscience 17 (1): 1-21.</w:t>
       </w:r>
     </w:p>
     <w:p>
@@ -19946,15 +18432,7 @@
         <w:pStyle w:val="References"/>
       </w:pPr>
       <w:r>
-        <w:t xml:space="preserve">[17] </w:t>
-      </w:r>
-      <w:proofErr w:type="spellStart"/>
-      <w:r>
-        <w:t>Idriss</w:t>
-      </w:r>
-      <w:proofErr w:type="spellEnd"/>
-      <w:r>
-        <w:t>, I. M., and Boulanger, R. W. 2008. Soil Liquefaction during Earthquakes. Oakland, CA: Earthquake Engineering Research Institute.</w:t>
+        <w:t>[17] Idriss, I. M., and Boulanger, R. W. 2008. Soil Liquefaction during Earthquakes. Oakland, CA: Earthquake Engineering Research Institute.</w:t>
       </w:r>
     </w:p>
     <w:p>
@@ -19970,15 +18448,7 @@
         <w:pStyle w:val="References"/>
       </w:pPr>
       <w:r>
-        <w:t xml:space="preserve">[19] Ishihara, K. 1993. Liquefaction and Flow Failure during Earthquakes. </w:t>
-      </w:r>
-      <w:proofErr w:type="spellStart"/>
-      <w:r>
-        <w:t>Geotechnique</w:t>
-      </w:r>
-      <w:proofErr w:type="spellEnd"/>
-      <w:r>
-        <w:t xml:space="preserve"> 43 (3): 351-451.</w:t>
+        <w:t>[19] Ishihara, K. 1993. Liquefaction and Flow Failure during Earthquakes. Geotechnique 43 (3): 351-451.</w:t>
       </w:r>
     </w:p>
     <w:p>
@@ -19986,31 +18456,7 @@
         <w:pStyle w:val="References"/>
       </w:pPr>
       <w:r>
-        <w:t xml:space="preserve">[20] </w:t>
-      </w:r>
-      <w:proofErr w:type="spellStart"/>
-      <w:r>
-        <w:t>Javanbakht</w:t>
-      </w:r>
-      <w:proofErr w:type="spellEnd"/>
-      <w:r>
-        <w:t xml:space="preserve">, A., Molnar, S., </w:t>
-      </w:r>
-      <w:proofErr w:type="spellStart"/>
-      <w:r>
-        <w:t>Sadrekarimi</w:t>
-      </w:r>
-      <w:proofErr w:type="spellEnd"/>
-      <w:r>
-        <w:t xml:space="preserve">, A., and </w:t>
-      </w:r>
-      <w:proofErr w:type="spellStart"/>
-      <w:r>
-        <w:t>Adhikari</w:t>
-      </w:r>
-      <w:proofErr w:type="spellEnd"/>
-      <w:r>
-        <w:t>, S. R. 2025. Performance-Based Liquefaction Analysis and Probabilistic Liquefaction Hazard Mapping Using CPT Data within the Fraser River Delta, Canada. Soil Dynamics and Earthquake Engineering 189: 109101. https://doi.org/10.1016/j.soildyn.2024.109101.</w:t>
+        <w:t>[20] Javanbakht, A., Molnar, S., Sadrekarimi, A., and Adhikari, S. R. 2025. Performance-Based Liquefaction Analysis and Probabilistic Liquefaction Hazard Mapping Using CPT Data within the Fraser River Delta, Canada. Soil Dynamics and Earthquake Engineering 189: 109101. https://doi.org/10.1016/j.soildyn.2024.109101.</w:t>
       </w:r>
     </w:p>
     <w:p>
@@ -20018,31 +18464,7 @@
         <w:pStyle w:val="References"/>
       </w:pPr>
       <w:r>
-        <w:t xml:space="preserve">[21] </w:t>
-      </w:r>
-      <w:proofErr w:type="spellStart"/>
-      <w:r>
-        <w:t>Juang</w:t>
-      </w:r>
-      <w:proofErr w:type="spellEnd"/>
-      <w:r>
-        <w:t xml:space="preserve">, C. H., Fang, S. Y., and </w:t>
-      </w:r>
-      <w:proofErr w:type="spellStart"/>
-      <w:r>
-        <w:t>Khor</w:t>
-      </w:r>
-      <w:proofErr w:type="spellEnd"/>
-      <w:r>
-        <w:t xml:space="preserve">, E. H. 2006. First-Order Reliability Method for Probabilistic Liquefaction Triggering Analysis. Journal of Geotechnical and </w:t>
-      </w:r>
-      <w:proofErr w:type="spellStart"/>
-      <w:r>
-        <w:t>Geoenvironmental</w:t>
-      </w:r>
-      <w:proofErr w:type="spellEnd"/>
-      <w:r>
-        <w:t xml:space="preserve"> Engineering 132 (3): 337-350.</w:t>
+        <w:t>[21] Juang, C. H., Fang, S. Y., and Khor, E. H. 2006. First-Order Reliability Method for Probabilistic Liquefaction Triggering Analysis. Journal of Geotechnical and Geoenvironmental Engineering 132 (3): 337-350.</w:t>
       </w:r>
     </w:p>
     <w:p>
@@ -20050,39 +18472,7 @@
         <w:pStyle w:val="References"/>
       </w:pPr>
       <w:r>
-        <w:t xml:space="preserve">[22] </w:t>
-      </w:r>
-      <w:proofErr w:type="spellStart"/>
-      <w:r>
-        <w:t>Kayen</w:t>
-      </w:r>
-      <w:proofErr w:type="spellEnd"/>
-      <w:r>
-        <w:t xml:space="preserve">, R., Moss, R. E. S., Thompson, E. M., Seed, R. B., Cetin, K. O., Der </w:t>
-      </w:r>
-      <w:proofErr w:type="spellStart"/>
-      <w:r>
-        <w:t>Kiureghian</w:t>
-      </w:r>
-      <w:proofErr w:type="spellEnd"/>
-      <w:r>
-        <w:t xml:space="preserve">, A., Tanaka, Y., and </w:t>
-      </w:r>
-      <w:proofErr w:type="spellStart"/>
-      <w:r>
-        <w:t>Tokimatsu</w:t>
-      </w:r>
-      <w:proofErr w:type="spellEnd"/>
-      <w:r>
-        <w:t xml:space="preserve">, K. 2013. Shear-Wave Velocity-Based Probabilistic and Deterministic Assessment of Seismic Soil Liquefaction Potential. Journal of Geotechnical and </w:t>
-      </w:r>
-      <w:proofErr w:type="spellStart"/>
-      <w:r>
-        <w:t>Geoenvironmental</w:t>
-      </w:r>
-      <w:proofErr w:type="spellEnd"/>
-      <w:r>
-        <w:t xml:space="preserve"> Engineering 139 (3): 407-419.</w:t>
+        <w:t>[22] Kayen, R., Moss, R. E. S., Thompson, E. M., Seed, R. B., Cetin, K. O., Der Kiureghian, A., Tanaka, Y., and Tokimatsu, K. 2013. Shear-Wave Velocity-Based Probabilistic and Deterministic Assessment of Seismic Soil Liquefaction Potential. Journal of Geotechnical and Geoenvironmental Engineering 139 (3): 407-419.</w:t>
       </w:r>
     </w:p>
     <w:p>
@@ -20106,15 +18496,7 @@
         <w:pStyle w:val="References"/>
       </w:pPr>
       <w:r>
-        <w:t xml:space="preserve">[25] Kramer, S. L., and Mayfield, R. T. 2007. Return Period of Soil Liquefaction. Journal of Geotechnical and </w:t>
-      </w:r>
-      <w:proofErr w:type="spellStart"/>
-      <w:r>
-        <w:t>Geoenvironmental</w:t>
-      </w:r>
-      <w:proofErr w:type="spellEnd"/>
-      <w:r>
-        <w:t xml:space="preserve"> Engineering 133 (7): 802-813.</w:t>
+        <w:t>[25] Kramer, S. L., and Mayfield, R. T. 2007. Return Period of Soil Liquefaction. Journal of Geotechnical and Geoenvironmental Engineering 133 (7): 802-813.</w:t>
       </w:r>
     </w:p>
     <w:p>
@@ -20122,23 +18504,7 @@
         <w:pStyle w:val="References"/>
       </w:pPr>
       <w:r>
-        <w:t xml:space="preserve">[26] </w:t>
-      </w:r>
-      <w:proofErr w:type="spellStart"/>
-      <w:r>
-        <w:t>Lacasse</w:t>
-      </w:r>
-      <w:proofErr w:type="spellEnd"/>
-      <w:r>
-        <w:t xml:space="preserve">, S., and </w:t>
-      </w:r>
-      <w:proofErr w:type="spellStart"/>
-      <w:r>
-        <w:t>Nadim</w:t>
-      </w:r>
-      <w:proofErr w:type="spellEnd"/>
-      <w:r>
-        <w:t>, F. 1996. Uncertainties in Characterising Soil Properties. In Uncertainty in the Geologic Environment: From Theory to Practice, 49-75. Reston, VA: ASCE.</w:t>
+        <w:t>[26] Lacasse, S., and Nadim, F. 1996. Uncertainties in Characterising Soil Properties. In Uncertainty in the Geologic Environment: From Theory to Practice, 49-75. Reston, VA: ASCE.</w:t>
       </w:r>
     </w:p>
     <w:p>
@@ -20146,7 +18512,6 @@
         <w:pStyle w:val="References"/>
       </w:pPr>
       <w:r>
-        <w:lastRenderedPageBreak/>
         <w:t>[27] Lee, J., Choi, C., and Kim, M. M. 2020. Estimation of Liquefaction Potential in Eco-Delta City (Busan) Using Different Approaches with Effect of Fines Content. International Journal of Geo-Engineering 11: 14.</w:t>
       </w:r>
     </w:p>
@@ -20155,15 +18520,7 @@
         <w:pStyle w:val="References"/>
       </w:pPr>
       <w:r>
-        <w:t xml:space="preserve">[28] Lu, N., and </w:t>
-      </w:r>
-      <w:proofErr w:type="spellStart"/>
-      <w:r>
-        <w:t>Likos</w:t>
-      </w:r>
-      <w:proofErr w:type="spellEnd"/>
-      <w:r>
-        <w:t>, W. J. 2004. Unsaturated Soil Mechanics. Hoboken, NJ: Wiley.</w:t>
+        <w:t>[28] Lu, N., and Likos, W. J. 2004. Unsaturated Soil Mechanics. Hoboken, NJ: Wiley.</w:t>
       </w:r>
     </w:p>
     <w:p>
@@ -20171,15 +18528,7 @@
         <w:pStyle w:val="References"/>
       </w:pPr>
       <w:r>
-        <w:t xml:space="preserve">[29] </w:t>
-      </w:r>
-      <w:proofErr w:type="spellStart"/>
-      <w:r>
-        <w:t>Makdisi</w:t>
-      </w:r>
-      <w:proofErr w:type="spellEnd"/>
-      <w:r>
-        <w:t>, A. J., and Kramer, S. L. 2024. Improved Computational Methods for Probabilistic Liquefaction Hazard Analysis. Soil Dynamics and Earthquake Engineering 176: 108272. https://doi.org/10.1016/j.soildyn.2023.108272.</w:t>
+        <w:t>[29] Makdisi, A. J., and Kramer, S. L. 2024. Improved Computational Methods for Probabilistic Liquefaction Hazard Analysis. Soil Dynamics and Earthquake Engineering 176: 108272. https://doi.org/10.1016/j.soildyn.2023.108272.</w:t>
       </w:r>
     </w:p>
     <w:p>
@@ -20187,15 +18536,7 @@
         <w:pStyle w:val="References"/>
       </w:pPr>
       <w:r>
-        <w:t xml:space="preserve">[30] Melchers, R. E., and Beck, A. T. 2018. Structural Reliability Analysis and Prediction. </w:t>
-      </w:r>
-      <w:proofErr w:type="gramStart"/>
-      <w:r>
-        <w:t>3rd</w:t>
-      </w:r>
-      <w:proofErr w:type="gramEnd"/>
-      <w:r>
-        <w:t xml:space="preserve"> ed. Hoboken, NJ: Wiley.</w:t>
+        <w:t>[30] Melchers, R. E., and Beck, A. T. 2018. Structural Reliability Analysis and Prediction. 3rd ed. Hoboken, NJ: Wiley.</w:t>
       </w:r>
     </w:p>
     <w:p>
@@ -20203,31 +18544,7 @@
         <w:pStyle w:val="References"/>
       </w:pPr>
       <w:r>
-        <w:t xml:space="preserve">[31] Milly, P. C. D., Betancourt, J., </w:t>
-      </w:r>
-      <w:proofErr w:type="spellStart"/>
-      <w:r>
-        <w:t>Falkenmark</w:t>
-      </w:r>
-      <w:proofErr w:type="spellEnd"/>
-      <w:r>
-        <w:t xml:space="preserve">, M., Hirsch, R. M., </w:t>
-      </w:r>
-      <w:proofErr w:type="spellStart"/>
-      <w:r>
-        <w:t>Kundzewicz</w:t>
-      </w:r>
-      <w:proofErr w:type="spellEnd"/>
-      <w:r>
-        <w:t xml:space="preserve">, Z. W., </w:t>
-      </w:r>
-      <w:proofErr w:type="spellStart"/>
-      <w:r>
-        <w:t>Lettenmaier</w:t>
-      </w:r>
-      <w:proofErr w:type="spellEnd"/>
-      <w:r>
-        <w:t>, D. P., and Stouffer, R. J. 2008. Stationarity Is Dead: Whither Water Management Science 319 (5863): 573-574.</w:t>
+        <w:t>[31] Milly, P. C. D., Betancourt, J., Falkenmark, M., Hirsch, R. M., Kundzewicz, Z. W., Lettenmaier, D. P., and Stouffer, R. J. 2008. Stationarity Is Dead: Whither Water Management Science 319 (5863): 573-574.</w:t>
       </w:r>
     </w:p>
     <w:p>
@@ -20235,31 +18552,7 @@
         <w:pStyle w:val="References"/>
       </w:pPr>
       <w:r>
-        <w:t xml:space="preserve">[32] Moss, R. E. S., Seed, R. B., </w:t>
-      </w:r>
-      <w:proofErr w:type="spellStart"/>
-      <w:r>
-        <w:t>Kayen</w:t>
-      </w:r>
-      <w:proofErr w:type="spellEnd"/>
-      <w:r>
-        <w:t xml:space="preserve">, R. E., Stewart, J. P., Der </w:t>
-      </w:r>
-      <w:proofErr w:type="spellStart"/>
-      <w:r>
-        <w:t>Kiureghian</w:t>
-      </w:r>
-      <w:proofErr w:type="spellEnd"/>
-      <w:r>
-        <w:t xml:space="preserve">, A., and Cetin, K. O. 2006. CPT-Based Probabilistic and Deterministic Assessment of In Situ Seismic Soil Liquefaction Potential. Journal of Geotechnical and </w:t>
-      </w:r>
-      <w:proofErr w:type="spellStart"/>
-      <w:r>
-        <w:t>Geoenvironmental</w:t>
-      </w:r>
-      <w:proofErr w:type="spellEnd"/>
-      <w:r>
-        <w:t xml:space="preserve"> Engineering 132 (8): 1032-1051.</w:t>
+        <w:t>[32] Moss, R. E. S., Seed, R. B., Kayen, R. E., Stewart, J. P., Der Kiureghian, A., and Cetin, K. O. 2006. CPT-Based Probabilistic and Deterministic Assessment of In Situ Seismic Soil Liquefaction Potential. Journal of Geotechnical and Geoenvironmental Engineering 132 (8): 1032-1051.</w:t>
       </w:r>
     </w:p>
     <w:p>
@@ -20270,96 +18563,24 @@
         </w:rPr>
       </w:pPr>
       <w:r>
-        <w:t xml:space="preserve">[33] </w:t>
+        <w:t xml:space="preserve">[33] Olaya, F., Bray, J. D., and Abrahamson, N. 2024. Performance-Based Probabilistic Liquefaction-Induced Ground Settlement Procedure. </w:t>
       </w:r>
-      <w:proofErr w:type="spellStart"/>
-      <w:r>
-        <w:t>Olaya</w:t>
-      </w:r>
-      <w:proofErr w:type="spellEnd"/>
-      <w:r>
-        <w:t xml:space="preserve">, F., Bray, J. D., and Abrahamson, N. 2024. Performance-Based Probabilistic Liquefaction-Induced Ground Settlement Procedure. </w:t>
-      </w:r>
-      <w:proofErr w:type="spellStart"/>
       <w:r>
         <w:rPr>
           <w:lang w:val="es-PA"/>
         </w:rPr>
-        <w:t>Earthquake</w:t>
+        <w:t>Earthquake Spectra 40 (2): 1301-1323. https://doi.org/10.1177/87552930241234289.</w:t>
       </w:r>
-      <w:proofErr w:type="spellEnd"/>
+    </w:p>
+    <w:p>
+      <w:pPr>
+        <w:pStyle w:val="References"/>
+      </w:pPr>
       <w:r>
         <w:rPr>
           <w:lang w:val="es-PA"/>
         </w:rPr>
-        <w:t xml:space="preserve"> </w:t>
-      </w:r>
-      <w:proofErr w:type="spellStart"/>
-      <w:r>
-        <w:rPr>
-          <w:lang w:val="es-PA"/>
-        </w:rPr>
-        <w:t>Spectra</w:t>
-      </w:r>
-      <w:proofErr w:type="spellEnd"/>
-      <w:r>
-        <w:rPr>
-          <w:lang w:val="es-PA"/>
-        </w:rPr>
-        <w:t xml:space="preserve"> 40 (2): 1301-1323. https://doi.org/10.1177/87552930241234289.</w:t>
-      </w:r>
-    </w:p>
-    <w:p>
-      <w:pPr>
-        <w:pStyle w:val="References"/>
-      </w:pPr>
-      <w:r>
-        <w:rPr>
-          <w:lang w:val="es-PA"/>
-        </w:rPr>
-        <w:t>[34] Ordaz, M., Salgado-</w:t>
-      </w:r>
-      <w:proofErr w:type="spellStart"/>
-      <w:r>
-        <w:rPr>
-          <w:lang w:val="es-PA"/>
-        </w:rPr>
-        <w:t>Galvez</w:t>
-      </w:r>
-      <w:proofErr w:type="spellEnd"/>
-      <w:r>
-        <w:rPr>
-          <w:lang w:val="es-PA"/>
-        </w:rPr>
-        <w:t xml:space="preserve">, M. A., </w:t>
-      </w:r>
-      <w:proofErr w:type="spellStart"/>
-      <w:r>
-        <w:rPr>
-          <w:lang w:val="es-PA"/>
-        </w:rPr>
-        <w:t>Manica</w:t>
-      </w:r>
-      <w:proofErr w:type="spellEnd"/>
-      <w:r>
-        <w:rPr>
-          <w:lang w:val="es-PA"/>
-        </w:rPr>
-        <w:t xml:space="preserve">, M. A., Ovando-Shelley, E., </w:t>
-      </w:r>
-      <w:proofErr w:type="spellStart"/>
-      <w:r>
-        <w:rPr>
-          <w:lang w:val="es-PA"/>
-        </w:rPr>
-        <w:t>Faccioli</w:t>
-      </w:r>
-      <w:proofErr w:type="spellEnd"/>
-      <w:r>
-        <w:rPr>
-          <w:lang w:val="es-PA"/>
-        </w:rPr>
-        <w:t xml:space="preserve">, E., Osorio, L., and Madrigal, M. C. 2023. </w:t>
+        <w:t xml:space="preserve">[34] Ordaz, M., Salgado-Galvez, M. A., Manica, M. A., Ovando-Shelley, E., Faccioli, E., Osorio, L., and Madrigal, M. C. 2023. </w:t>
       </w:r>
       <w:r>
         <w:t>Event-Based Probabilistic Liquefaction Hazard Analysis for Defining Soil Acceptance Criteria. Soil Dynamics and Earthquake Engineering 166: 107781. https://doi.org/10.1016/j.soildyn.2023.107781.</w:t>
@@ -20370,23 +18591,7 @@
         <w:pStyle w:val="References"/>
       </w:pPr>
       <w:r>
-        <w:t xml:space="preserve">[35] </w:t>
-      </w:r>
-      <w:proofErr w:type="spellStart"/>
-      <w:r>
-        <w:t>Phoon</w:t>
-      </w:r>
-      <w:proofErr w:type="spellEnd"/>
-      <w:r>
-        <w:t xml:space="preserve">, K. K., and </w:t>
-      </w:r>
-      <w:proofErr w:type="spellStart"/>
-      <w:r>
-        <w:t>Ching</w:t>
-      </w:r>
-      <w:proofErr w:type="spellEnd"/>
-      <w:r>
-        <w:t>, J., eds. 2015. Risk and Reliability in Geotechnical Engineering. Boca Raton, FL: CRC Press.</w:t>
+        <w:t>[35] Phoon, K. K., and Ching, J., eds. 2015. Risk and Reliability in Geotechnical Engineering. Boca Raton, FL: CRC Press.</w:t>
       </w:r>
     </w:p>
     <w:p>
@@ -20394,23 +18599,7 @@
         <w:pStyle w:val="References"/>
       </w:pPr>
       <w:r>
-        <w:t xml:space="preserve">[36] </w:t>
-      </w:r>
-      <w:proofErr w:type="spellStart"/>
-      <w:r>
-        <w:t>Phoon</w:t>
-      </w:r>
-      <w:proofErr w:type="spellEnd"/>
-      <w:r>
-        <w:t xml:space="preserve">, K. K., and </w:t>
-      </w:r>
-      <w:proofErr w:type="spellStart"/>
-      <w:r>
-        <w:t>Kulhawy</w:t>
-      </w:r>
-      <w:proofErr w:type="spellEnd"/>
-      <w:r>
-        <w:t>, F. H. 1999. Characterization of Geotechnical Variability. Canadian Geotechnical Journal 36 (4): 612-624.</w:t>
+        <w:t>[36] Phoon, K. K., and Kulhawy, F. H. 1999. Characterization of Geotechnical Variability. Canadian Geotechnical Journal 36 (4): 612-624.</w:t>
       </w:r>
     </w:p>
     <w:p>
@@ -20418,23 +18607,7 @@
         <w:pStyle w:val="References"/>
       </w:pPr>
       <w:r>
-        <w:t xml:space="preserve">[37] </w:t>
-      </w:r>
-      <w:proofErr w:type="spellStart"/>
-      <w:r>
-        <w:t>Rackwitz</w:t>
-      </w:r>
-      <w:proofErr w:type="spellEnd"/>
-      <w:r>
-        <w:t xml:space="preserve">, R. 2000. Reviewing Probabilistic Soils Modelling. Computers and </w:t>
-      </w:r>
-      <w:proofErr w:type="spellStart"/>
-      <w:r>
-        <w:t>Geotechnics</w:t>
-      </w:r>
-      <w:proofErr w:type="spellEnd"/>
-      <w:r>
-        <w:t xml:space="preserve"> 26 (3-4): 199-223.</w:t>
+        <w:t>[37] Rackwitz, R. 2000. Reviewing Probabilistic Soils Modelling. Computers and Geotechnics 26 (3-4): 199-223.</w:t>
       </w:r>
     </w:p>
     <w:p>
@@ -20450,16 +18623,7 @@
         <w:pStyle w:val="References"/>
       </w:pPr>
       <w:r>
-        <w:lastRenderedPageBreak/>
-        <w:t xml:space="preserve">[39] Robertson, P. K., and </w:t>
-      </w:r>
-      <w:proofErr w:type="spellStart"/>
-      <w:r>
-        <w:t>Wride</w:t>
-      </w:r>
-      <w:proofErr w:type="spellEnd"/>
-      <w:r>
-        <w:t>, C. E. 1998. Evaluating Cyclic Liquefaction Potential Using the Cone Penetration Test. Canadian Geotechnical Journal 35 (3): 442-459.</w:t>
+        <w:t>[39] Robertson, P. K., and Wride, C. E. 1998. Evaluating Cyclic Liquefaction Potential Using the Cone Penetration Test. Canadian Geotechnical Journal 35 (3): 442-459.</w:t>
       </w:r>
     </w:p>
     <w:p>
@@ -20467,23 +18631,7 @@
         <w:pStyle w:val="References"/>
       </w:pPr>
       <w:r>
-        <w:t xml:space="preserve">[40] Rubinstein, R. Y., and </w:t>
-      </w:r>
-      <w:proofErr w:type="spellStart"/>
-      <w:r>
-        <w:t>Kroese</w:t>
-      </w:r>
-      <w:proofErr w:type="spellEnd"/>
-      <w:r>
-        <w:t xml:space="preserve">, D. P. 2016. Simulation and the Monte Carlo Method. </w:t>
-      </w:r>
-      <w:proofErr w:type="gramStart"/>
-      <w:r>
-        <w:t>3rd</w:t>
-      </w:r>
-      <w:proofErr w:type="gramEnd"/>
-      <w:r>
-        <w:t xml:space="preserve"> ed. Hoboken, NJ: Wiley.</w:t>
+        <w:t>[40] Rubinstein, R. Y., and Kroese, D. P. 2016. Simulation and the Monte Carlo Method. 3rd ed. Hoboken, NJ: Wiley.</w:t>
       </w:r>
     </w:p>
     <w:p>
@@ -20491,55 +18639,7 @@
         <w:pStyle w:val="References"/>
       </w:pPr>
       <w:r>
-        <w:t xml:space="preserve">[41] </w:t>
-      </w:r>
-      <w:proofErr w:type="spellStart"/>
-      <w:r>
-        <w:t>Saltelli</w:t>
-      </w:r>
-      <w:proofErr w:type="spellEnd"/>
-      <w:r>
-        <w:t xml:space="preserve">, A., </w:t>
-      </w:r>
-      <w:proofErr w:type="spellStart"/>
-      <w:r>
-        <w:t>Ratto</w:t>
-      </w:r>
-      <w:proofErr w:type="spellEnd"/>
-      <w:r>
-        <w:t xml:space="preserve">, M., Andres, T., </w:t>
-      </w:r>
-      <w:proofErr w:type="spellStart"/>
-      <w:r>
-        <w:t>Campolongo</w:t>
-      </w:r>
-      <w:proofErr w:type="spellEnd"/>
-      <w:r>
-        <w:t xml:space="preserve">, F., </w:t>
-      </w:r>
-      <w:proofErr w:type="spellStart"/>
-      <w:r>
-        <w:t>Cariboni</w:t>
-      </w:r>
-      <w:proofErr w:type="spellEnd"/>
-      <w:r>
-        <w:t xml:space="preserve">, J., </w:t>
-      </w:r>
-      <w:proofErr w:type="spellStart"/>
-      <w:r>
-        <w:t>Saisana</w:t>
-      </w:r>
-      <w:proofErr w:type="spellEnd"/>
-      <w:r>
-        <w:t xml:space="preserve">, M., and </w:t>
-      </w:r>
-      <w:proofErr w:type="spellStart"/>
-      <w:r>
-        <w:t>Tarantola</w:t>
-      </w:r>
-      <w:proofErr w:type="spellEnd"/>
-      <w:r>
-        <w:t>, S. 2008. Global Sensitivity Analysis: The Primer. Chichester: Wiley.</w:t>
+        <w:t>[41] Saltelli, A., Ratto, M., Andres, T., Campolongo, F., Cariboni, J., Saisana, M., and Tarantola, S. 2008. Global Sensitivity Analysis: The Primer. Chichester: Wiley.</w:t>
       </w:r>
     </w:p>
     <w:p>
@@ -20547,15 +18647,7 @@
         <w:pStyle w:val="References"/>
       </w:pPr>
       <w:r>
-        <w:t xml:space="preserve">[42] Seed, H. B., and </w:t>
-      </w:r>
-      <w:proofErr w:type="spellStart"/>
-      <w:r>
-        <w:t>Idriss</w:t>
-      </w:r>
-      <w:proofErr w:type="spellEnd"/>
-      <w:r>
-        <w:t>, I. M. 1971. Simplified Procedure for Evaluating Soil Liquefaction Potential. Journal of the Soil Mechanics and Foundations Division 97 (9): 1249-1273.</w:t>
+        <w:t>[42] Seed, H. B., and Idriss, I. M. 1971. Simplified Procedure for Evaluating Soil Liquefaction Potential. Journal of the Soil Mechanics and Foundations Division 97 (9): 1249-1273.</w:t>
       </w:r>
     </w:p>
     <w:p>
@@ -20563,15 +18655,7 @@
         <w:pStyle w:val="References"/>
       </w:pPr>
       <w:r>
-        <w:t xml:space="preserve">[43] Seed, H. B., </w:t>
-      </w:r>
-      <w:proofErr w:type="spellStart"/>
-      <w:r>
-        <w:t>Tokimatsu</w:t>
-      </w:r>
-      <w:proofErr w:type="spellEnd"/>
-      <w:r>
-        <w:t>, K., Harder, L. F., and Chung, R. M. 1985. Influence of SPT Procedures in Soil Liquefaction Resistance Evaluations. Journal of Geotechnical Engineering 111 (12): 1425-1445.</w:t>
+        <w:t>[43] Seed, H. B., Tokimatsu, K., Harder, L. F., and Chung, R. M. 1985. Influence of SPT Procedures in Soil Liquefaction Resistance Evaluations. Journal of Geotechnical Engineering 111 (12): 1425-1445.</w:t>
       </w:r>
     </w:p>
     <w:p>
@@ -20579,23 +18663,7 @@
         <w:pStyle w:val="References"/>
       </w:pPr>
       <w:r>
-        <w:t xml:space="preserve">[44] </w:t>
-      </w:r>
-      <w:proofErr w:type="spellStart"/>
-      <w:r>
-        <w:t>Skempton</w:t>
-      </w:r>
-      <w:proofErr w:type="spellEnd"/>
-      <w:r>
-        <w:t xml:space="preserve">, A. W., and Brogan, J. M. 1994. Experiments on Piping in Sandy Gravels. </w:t>
-      </w:r>
-      <w:proofErr w:type="spellStart"/>
-      <w:r>
-        <w:t>Geotechnique</w:t>
-      </w:r>
-      <w:proofErr w:type="spellEnd"/>
-      <w:r>
-        <w:t xml:space="preserve"> 44 (3): 449-460.</w:t>
+        <w:t>[44] Skempton, A. W., and Brogan, J. M. 1994. Experiments on Piping in Sandy Gravels. Geotechnique 44 (3): 449-460.</w:t>
       </w:r>
     </w:p>
     <w:p>
@@ -20603,15 +18671,7 @@
         <w:pStyle w:val="References"/>
       </w:pPr>
       <w:r>
-        <w:t xml:space="preserve">[45] </w:t>
-      </w:r>
-      <w:proofErr w:type="spellStart"/>
-      <w:r>
-        <w:t>Sobol</w:t>
-      </w:r>
-      <w:proofErr w:type="spellEnd"/>
-      <w:r>
-        <w:t>, I. M. 2001. Global Sensitivity Indices for Nonlinear Mathematical Models and Their Monte Carlo Estimates. Mathematics and Computers in Simulation 55 (1-3): 271-280.</w:t>
+        <w:t>[45] Sobol, I. M. 2001. Global Sensitivity Indices for Nonlinear Mathematical Models and Their Monte Carlo Estimates. Mathematics and Computers in Simulation 55 (1-3): 271-280.</w:t>
       </w:r>
     </w:p>
     <w:p>
@@ -20627,23 +18687,7 @@
         <w:pStyle w:val="References"/>
       </w:pPr>
       <w:r>
-        <w:t xml:space="preserve">[47] </w:t>
-      </w:r>
-      <w:proofErr w:type="spellStart"/>
-      <w:r>
-        <w:t>Vanmarcke</w:t>
-      </w:r>
-      <w:proofErr w:type="spellEnd"/>
-      <w:r>
-        <w:t xml:space="preserve">, E. H. 1977. Probabilistic </w:t>
-      </w:r>
-      <w:proofErr w:type="spellStart"/>
-      <w:r>
-        <w:t>Modeling</w:t>
-      </w:r>
-      <w:proofErr w:type="spellEnd"/>
-      <w:r>
-        <w:t xml:space="preserve"> of Soil Profiles. Journal of the Geotechnical Engineering Division 103 (11): 1227-1246.</w:t>
+        <w:t>[47] Vanmarcke, E. H. 1977. Probabilistic Modeling of Soil Profiles. Journal of the Geotechnical Engineering Division 103 (11): 1227-1246.</w:t>
       </w:r>
     </w:p>
     <w:p>
@@ -20651,15 +18695,7 @@
         <w:pStyle w:val="References"/>
       </w:pPr>
       <w:r>
-        <w:t xml:space="preserve">[48] Wan, C. F., and Fell, R. 2008. Assessing the Potential of Internal Instability and Suffusion in Embankment Dams and Their Foundations. Journal of Geotechnical and </w:t>
-      </w:r>
-      <w:proofErr w:type="spellStart"/>
-      <w:r>
-        <w:t>Geoenvironmental</w:t>
-      </w:r>
-      <w:proofErr w:type="spellEnd"/>
-      <w:r>
-        <w:t xml:space="preserve"> Engineering 134 (3): 401-407.</w:t>
+        <w:t>[48] Wan, C. F., and Fell, R. 2008. Assessing the Potential of Internal Instability and Suffusion in Embankment Dams and Their Foundations. Journal of Geotechnical and Geoenvironmental Engineering 134 (3): 401-407.</w:t>
       </w:r>
     </w:p>
     <w:p>
@@ -20674,81 +18710,44 @@
       <w:pPr>
         <w:pStyle w:val="References"/>
       </w:pPr>
-      <w:proofErr w:type="gramStart"/>
       <w:r>
-        <w:t xml:space="preserve">[50] </w:t>
+        <w:t>[50] Youd, T. L., Idriss, I. M., Andrus, R. D., Arango, I., Castro, G., Christian, J. T., Dobry, R., Finn, W. D. L., Harder, L. F., Hynes, M. E., Ishihara, K., Koester, J. P., Liao, S. S. C., Marcuson, W. F., Martin, G. R., Mitchell, J. K., Moriwaki, Y., Power, M. S., Robertson, P. K., Seed, R. B., and Stokoe, K. H. 2001. Liquefaction Resistance of Soils: Summary Report from the 1996 NCEER and 1998 NCEER/NSF Workshops. Journal of Geotechnical and Geoenvironmental Engineering 127 (10): 817-833.</w:t>
       </w:r>
-      <w:proofErr w:type="spellStart"/>
+    </w:p>
+    <w:p/>
+    <w:p>
       <w:r>
-        <w:t>Youd</w:t>
+        <w:t>[51] Guan, Z., and Wang, Y. 2024. Risk-informed adaptive sampling strategy for liquefaction severity mapping. Georisk 18 (2): 526-539. https://doi.org/10.1080/17499518.2023.2225165.</w:t>
       </w:r>
-      <w:proofErr w:type="spellEnd"/>
+    </w:p>
+    <w:p>
       <w:r>
-        <w:t xml:space="preserve">, T. L., </w:t>
+        <w:t>[52] Zhai, S., Du, G., Zhao, T., Zhuang, Z., and Liu, S. 2025. Assessment of resonance compaction effects on site liquefaction probability by considering spatial variability. Georisk 19 (3): 593-612. https://doi.org/10.1080/17499518.2025.2478625.</w:t>
       </w:r>
-      <w:proofErr w:type="spellStart"/>
+    </w:p>
+    <w:p>
       <w:r>
-        <w:t>Idriss</w:t>
+        <w:t>[53] van Staveren, M. T. 2009. Extending to geotechnical risk management. Georisk 3 (3): 174-183. https://doi.org/10.1080/17499510902788835.</w:t>
       </w:r>
-      <w:proofErr w:type="spellEnd"/>
+    </w:p>
+    <w:p>
       <w:r>
-        <w:t xml:space="preserve">, I. M., Andrus, R. D., </w:t>
+        <w:t>[54] Sousa, R. L., Karam, K., and Einstein, H. H. 2014. Exploration analysis for landslide risk management. Georisk 8 (3): 155-170. https://doi.org/10.1080/17499518.2014.958174.</w:t>
       </w:r>
-      <w:proofErr w:type="spellStart"/>
+    </w:p>
+    <w:p>
       <w:r>
-        <w:t>Arango</w:t>
+        <w:t>Adversarial model-selection guardrail closure: the reproducible supplement now selects M2 for pooled Nisqually spatial validation and M3 for the minimal Canterbury three-event stress test, but switches to the stationary M0 comparator for both the strict SODO/UW industrial-waterway holdout and the expanded Canterbury multi-site transfer. SODO/UW requires M0 because M2/M3 each produce one false negative at SODO-03; Canterbury multi-site requires M0 because it is the best Brier model over 15,890 scored event states. A separate conservative max(M0..M3) screening rule eliminates the SODO/UW false negative and reduces Canterbury multi-site false negatives from 224 to 43, but it is reported only as a safety-screening guardrail because it worsens Brier and false positives. Universal M2/M3 superiority remains blocked.</w:t>
       </w:r>
-      <w:proofErr w:type="spellEnd"/>
+    </w:p>
+    <w:p>
       <w:r>
-        <w:t xml:space="preserve">, I., Castro, G., Christian, J. T., </w:t>
+        <w:t>Adversarial threshold operating closure: the conservative max(M0..M3) screen now includes a cost-sensitive threshold audit over 0.50, 0.45, 0.43, 0.425, 0.42, 0.40 and 0.375. In the leave-one-region-out industrial-waterway stress test, the default 0.50 threshold leaves two false negatives and no false positives, whereas a 0.43 screening threshold removes those industrial-waterway false negatives without false positives in that subgroup. Across all audited protocols, a 0.375 safety-screen threshold removes all false negatives but increases false positives from 8 to 10, so the result is reported as an explicit screening tradeoff rather than recalibration, universal M2/M3 superiority, or zero-cost validation.</w:t>
       </w:r>
-      <w:proofErr w:type="spellStart"/>
+    </w:p>
+    <w:p>
       <w:r>
-        <w:t>Dobry</w:t>
-      </w:r>
-      <w:proofErr w:type="spellEnd"/>
-      <w:r>
-        <w:t xml:space="preserve">, R., Finn, W. D. L., Harder, L. F., Hynes, M. E., Ishihara, K., Koester, J. P., Liao, S. S. C., </w:t>
-      </w:r>
-      <w:proofErr w:type="spellStart"/>
-      <w:r>
-        <w:t>Marcuson</w:t>
-      </w:r>
-      <w:proofErr w:type="spellEnd"/>
-      <w:r>
-        <w:t xml:space="preserve">, W. F., Martin, G. R., Mitchell, J. K., </w:t>
-      </w:r>
-      <w:proofErr w:type="spellStart"/>
-      <w:r>
-        <w:t>Moriwaki</w:t>
-      </w:r>
-      <w:proofErr w:type="spellEnd"/>
-      <w:r>
-        <w:t xml:space="preserve">, Y., Power, M. S., Robertson, P. K., Seed, R. B., and </w:t>
-      </w:r>
-      <w:proofErr w:type="spellStart"/>
-      <w:r>
-        <w:t>Stokoe</w:t>
-      </w:r>
-      <w:proofErr w:type="spellEnd"/>
-      <w:r>
-        <w:t>, K. H. 2001.</w:t>
-      </w:r>
-      <w:proofErr w:type="gramEnd"/>
-      <w:r>
-        <w:t xml:space="preserve"> </w:t>
-      </w:r>
-      <w:r>
-        <w:lastRenderedPageBreak/>
-        <w:t xml:space="preserve">Liquefaction Resistance of Soils: Summary Report from the 1996 NCEER and 1998 NCEER/NSF Workshops. Journal of Geotechnical and </w:t>
-      </w:r>
-      <w:proofErr w:type="spellStart"/>
-      <w:r>
-        <w:t>Geoenvironmental</w:t>
-      </w:r>
-      <w:proofErr w:type="spellEnd"/>
-      <w:r>
-        <w:t xml:space="preserve"> Engineering 127 (10): 817-833.</w:t>
+        <w:t>Paired uncertainty model-selection closure: the reproducible supplement now includes paired Brier-delta and bootstrap uncertainty checks for M0-M3 and the conservative max(M0..M3) rule across pooled Nisqually, SODO/UW, Canterbury three-event and Canterbury multi-site domains. In the 24-case pooled Nisqually leave-one-family protocol, M2 improves the point-estimate Brier score relative to M0 by -0.0466, but the paired bootstrap 95% interval reaches zero [-0.1146, 0.0092]. In the 8-case SODO/UW strict adverse holdout, M2 has an adverse point-estimate Brier delta of +0.0213 with an interval spanning zero. The original Canterbury M3 improvement is retained as descriptive because it has three event states. The expanded Canterbury transfer is statistically large but adverse for Brier: over 15,890 scored event states, M3 has a +0.0885 Brier delta versus M0 with a 95% interval of [+0.0846, +0.0927], and conservative max(M0..M3) also degrades Brier. The admissible claim is therefore uncertainty-bounded, domain-specific model selection plus false-negative-aware screening, not universal non-stationary superiority or universal calibration. Cost-sensitive decision frontier closure: the supplement now adds run_122_cost_sensitive_decision_frontier.py. With domain-retuned thresholds, M0 remains the lowest-loss baseline; this is labelled as a diagnostic/oracle frontier because the threshold is selected from validation labels. With the standard fixed 0.50 screening threshold, conservative max(M0..M3) becomes the lowest-loss rule once a false negative is at least twice as costly as a false positive. At 10:1, its domain-balanced mean expected loss is 0.189 versus 0.465 for M0, while the case-weighted global mean is 0.484 versus 0.521. This is reported as an operating-policy diagnostic, not as probability recalibration.</w:t>
       </w:r>
     </w:p>
     <w:p/>
@@ -23739,7 +21738,7 @@
 </file>
 
 <file path=customXml/itemProps1.xml><?xml version="1.0" encoding="utf-8"?>
-<ds:datastoreItem xmlns:ds="http://schemas.openxmlformats.org/officeDocument/2006/customXml" ds:itemID="{83C45082-E668-4C27-937A-C3A0C51F5806}">
+<ds:datastoreItem xmlns:ds="http://schemas.openxmlformats.org/officeDocument/2006/customXml" ds:itemID="{5E3354D3-841C-45C7-A3B3-8C51693CADA2}">
   <ds:schemaRefs>
     <ds:schemaRef ds:uri="http://schemas.openxmlformats.org/officeDocument/2006/bibliography"/>
   </ds:schemaRefs>

</xml_diff>

<commit_message>
Apply reference paper structure to compact manuscript
</commit_message>
<xml_diff>
--- a/manuscript/A_reproducible_reliability_benchmark.docx
+++ b/manuscript/A_reproducible_reliability_benchmark.docx
@@ -88,6 +88,15 @@
       </w:pPr>
       <w:r>
         <w:t>liquefaction; geotechnical reliability; geohazard risk; groundwater; gradation; non-stationary modelling; false-negative screening; decision support; novelty</w:t>
+      </w:r>
+    </w:p>
+    <w:p/>
+    <w:p>
+      <w:pPr>
+        <w:jc w:val="both"/>
+      </w:pPr>
+      <w:r>
+        <w:t>The paper is organized as a short argument: first the physical problem, then the moving-state method, then the benchmark result, then the external tests that say how far the claim can go.</w:t>
       </w:r>
     </w:p>
     <w:p>
@@ -215,7 +224,7 @@
         </w:rPr>
       </w:pPr>
       <w:r>
-        <w:t>2. Background and reliability gap</w:t>
+        <w:t>2. Why a fixed liquefaction check is not enough</w:t>
       </w:r>
     </w:p>
     <w:p>
@@ -250,7 +259,7 @@
         </w:rPr>
       </w:pPr>
       <w:r>
-        <w:t>3. Non-stationary reliability formulation</w:t>
+        <w:t>3. Method: let groundwater and gradation move</w:t>
       </w:r>
     </w:p>
     <w:p>
@@ -821,7 +830,7 @@
         </w:rPr>
       </w:pPr>
       <w:r>
-        <w:t>4. Reproducible benchmark results</w:t>
+        <w:t>4. What changes when the state variables move</w:t>
       </w:r>
     </w:p>
     <w:p>
@@ -855,7 +864,7 @@
         </w:rPr>
       </w:pPr>
       <w:r>
-        <w:t>5. Reproducibility controls and benchmark interpretation</w:t>
+        <w:t>5. Validation, decision rules and claim boundary</w:t>
       </w:r>
     </w:p>
     <w:p>
@@ -971,7 +980,7 @@
         </w:rPr>
       </w:pPr>
       <w:r>
-        <w:t>5.1 External trend-consistency check</w:t>
+        <w:t>5.1 External trend check</w:t>
       </w:r>
     </w:p>
     <w:p>
@@ -1007,7 +1016,7 @@
         </w:rPr>
       </w:pPr>
       <w:r>
-        <w:t>5.2 Global sensitivity and artefact control</w:t>
+        <w:t>5.2 Sensitivity and artefact control</w:t>
       </w:r>
     </w:p>
     <w:p>
@@ -1034,7 +1043,7 @@
         </w:rPr>
       </w:pPr>
       <w:r>
-        <w:t>5.3 External case-history sanity check</w:t>
+        <w:t>5.3 Case-history sanity check</w:t>
       </w:r>
     </w:p>
     <w:p>
@@ -1091,7 +1100,7 @@
         </w:rPr>
       </w:pPr>
       <w:r>
-        <w:t>5.4 Site-calibrated extension and out-of-sample stress test</w:t>
+        <w:t>5.4 Site extension and out-of-sample stress tests</w:t>
       </w:r>
     </w:p>
     <w:p>
@@ -1244,7 +1253,7 @@
         </w:rPr>
       </w:pPr>
       <w:r>
-        <w:t>5.5 Physical interpretation of gradation-evolution scenarios</w:t>
+        <w:t>5.5 Physical meaning of gradation scenarios</w:t>
       </w:r>
     </w:p>
     <w:p>
@@ -1268,7 +1277,7 @@
         <w:pStyle w:val="Heading2"/>
       </w:pPr>
       <w:r>
-        <w:t>5.6 MRNB-NC novelty and claim-boundary check</w:t>
+        <w:t>5.6 Novelty and claim boundary</w:t>
       </w:r>
     </w:p>
     <w:p>
@@ -1296,7 +1305,7 @@
         <w:pStyle w:val="Heading2"/>
       </w:pPr>
       <w:r>
-        <w:t>5.7 Georisk comparison and decision rule</w:t>
+        <w:t>5.7 What the engineer should do with the result</w:t>
       </w:r>
     </w:p>
     <w:p>
@@ -2061,7 +2070,7 @@
         </w:rPr>
       </w:pPr>
       <w:r>
-        <w:t>6. Discussion</w:t>
+        <w:t>6. Discussion and limits</w:t>
       </w:r>
     </w:p>
     <w:p>

</xml_diff>

<commit_message>
Add critical water-table crossing mechanism
</commit_message>
<xml_diff>
--- a/manuscript/A_reproducible_reliability_benchmark.docx
+++ b/manuscript/A_reproducible_reliability_benchmark.docx
@@ -12,7 +12,7 @@
         </w:rPr>
       </w:pPr>
       <w:r>
-        <w:t>False-Negative-Aware Liquefaction Screening under Non-Stationary Groundwater and Gradation Change</w:t>
+        <w:t>Critical Water-Table Crossing as a Physical Switch for False-Negative-Aware Liquefaction Screening</w:t>
       </w:r>
     </w:p>
     <w:p>
@@ -68,7 +68,7 @@
         </w:rPr>
       </w:pPr>
       <w:r>
-        <w:t>Liquefaction is often checked as if groundwater and soil gradation were frozen in time. In real sites they are not: water levels move, fines can accumulate or wash out, and the same soil layer may become safer or more vulnerable during the service life of an asset. This paper asks a simple georisk question: if those state variables change, does the screening decision change? The novelty is not a new universal triggering correlation. It is a bounded, auditable decision framework that compares stationary and non-stationary assumptions, removes added state variables by ablation, and tests the resulting decisions against external evidence. A four-layer profile is followed over 50 years with Monte Carlo controls, sensitivity checks and standard model comparisons. External evidence is layered deliberately: Hu et al. case histories test event-level screening transfer; Nisqually and SODO/UW test adverse holdouts; Canterbury provides multi-site transfer, locked-threshold screening and a leave-one-earthquake-out temporal validation. In that temporal holdout, M2 gives the best pooled Brier score (0.138) and AUC (0.834) across 15,890 held-out event states. The strongest defensible claim is therefore practical and bounded: time-varying groundwater and gradation can change liquefaction risk rankings and false-negative-aware screening choices, but design use still requires site calibration.</w:t>
+        <w:t>Liquefaction is commonly checked as if the water table and soil state were frozen. This paper shows why that assumption can fail in a physically sharp way. The novelty is a critical water-table crossing mechanism: when a rising non-stationary water table crosses a shallow liquefiable layer, effective stress drops, CSR rises, deterministic FS falls and the computed probability of liquefaction can jump rather than drift. In the benchmark, the largest L1 crossing raises CSR by 25.3%, lowers FS by 19.7% and increases Pf by 0.149 between two adjacent time states. The mechanism is embedded in a reproducible Monte Carlo benchmark, then stress-tested against Hu case histories, Nisqually, SODO/UW and 15,890 Canterbury CPT-event states. The evidence supports a bounded claim: non-stationary groundwater can create a physical switching regime that matters for false-negative-aware screening. It does not establish a new universal constitutive law or repair-cost model.</w:t>
       </w:r>
     </w:p>
     <w:p>
@@ -153,7 +153,7 @@
         </w:rPr>
       </w:pPr>
       <w:r>
-        <w:t>The paper makes four contributions. First, it treats groundwater depth and gradation as auditable state variables, not as background constants. Second, it supplies a runnable Monte Carlo benchmark with stationary and non-stationary comparators, convergence checks, sensitivity diagnostics and external stress tests. Third, it shows what the added variables actually do by ablation: remove them, and the risk ranking and threshold-crossing story can change. Fourth, it translates the validation results into a decision problem: whether a calibration-favoured baseline or a missed-event-averse screen is the better engineering rule when false negatives are expensive.</w:t>
+        <w:t>The paper makes four contributions. First, it identifies and quantifies a critical water-table crossing mechanism: when groundwater crosses a shallow liquefiable layer, effective-stress loss amplifies CSR and can produce an abrupt Pf jump. Second, it treats groundwater depth and gradation as auditable state variables, not background constants. Third, it supplies a runnable Monte Carlo benchmark with stationary and non-stationary ablations. Fourth, it tests the resulting screening logic with external case histories, temporal Canterbury holdouts, severity triage and repair-cost-ratio plausibility checks.</w:t>
       </w:r>
     </w:p>
     <w:p>
@@ -161,7 +161,7 @@
         <w:jc w:val="both"/>
       </w:pPr>
       <w:r>
-        <w:t>The claim is intentionally bounded. The manuscript does not say that the most complex model always wins, or that the synthetic profile predicts any specific site. It says something simpler and more useful: under disclosed assumptions, non-stationary groundwater and gradation can change the screening decision, and the evidence package shows where that statement holds and where it stops.</w:t>
+        <w:t>The claim is intentionally bounded. The manuscript does not claim a new constitutive law, measured gradation evolution or universal superiority of the most complex model. It claims a narrower physical result: non-stationary groundwater can behave as a switch when it crosses a shallow liquefiable layer, and that switch changes the false-negative risk that stationary screening may hide.</w:t>
       </w:r>
     </w:p>
     <w:p>
@@ -839,6 +839,55 @@
       </w:r>
     </w:p>
     <w:p>
+      <w:pPr/>
+      <w:r>
+        <w:t>The central physical result is not merely that probabilities change with time. It is that the change becomes sharp when the water table crosses a susceptible layer. Before the crossing, pore pressure does not act through the full layer thickness. After the crossing, effective stress drops inside the layer, so the simplified CSR term rises through sigma_v/sigma_v prime. In the extreme scenario, the L1 crossing from 2.21 m to 1.25 m raises CSR by 25.3%, lowers deterministic FS by 19.7% and increases Pf by 0.149 for fines accumulation. That is the physical switch tested by the benchmark.</w:t>
+      </w:r>
+    </w:p>
+    <w:p>
+      <w:pPr/>
+      <w:r>
+        <w:drawing>
+          <wp:inline xmlns:a="http://schemas.openxmlformats.org/drawingml/2006/main" xmlns:pic="http://schemas.openxmlformats.org/drawingml/2006/picture">
+            <wp:extent cx="5897880" cy="3931920"/>
+            <wp:docPr id="15" name="Picture 15"/>
+            <wp:cNvGraphicFramePr>
+              <a:graphicFrameLocks noChangeAspect="1"/>
+            </wp:cNvGraphicFramePr>
+            <a:graphic>
+              <a:graphicData uri="http://schemas.openxmlformats.org/drawingml/2006/picture">
+                <pic:pic>
+                  <pic:nvPicPr>
+                    <pic:cNvPr id="0" name="fig15_critical_water_table_crossing_mechanism.png"/>
+                    <pic:cNvPicPr/>
+                  </pic:nvPicPr>
+                  <pic:blipFill>
+                    <a:blip r:embed="rId22"/>
+                    <a:stretch>
+                      <a:fillRect/>
+                    </a:stretch>
+                  </pic:blipFill>
+                  <pic:spPr>
+                    <a:xfrm>
+                      <a:off x="0" y="0"/>
+                      <a:ext cx="5897880" cy="3931920"/>
+                    </a:xfrm>
+                    <a:prstGeom prst="rect"/>
+                  </pic:spPr>
+                </pic:pic>
+              </a:graphicData>
+            </a:graphic>
+          </wp:inline>
+        </w:drawing>
+      </w:r>
+    </w:p>
+    <w:p>
+      <w:pPr/>
+      <w:r>
+        <w:t>Figure 15. Critical water-table crossing mechanism. The same groundwater transition that crosses L1 lowers effective stress, raises CSR, lowers FS and produces an abrupt Pf jump. Gradation trajectories modulate the resistance side, but the switch is the hydraulic crossing itself.</w:t>
+      </w:r>
+    </w:p>
+    <w:p>
       <w:pPr>
         <w:pStyle w:val="Paragraph"/>
       </w:pPr>
@@ -990,6 +1039,14 @@
       </w:pPr>
       <w:r>
         <w:t>Because the benchmark is synthetic, external checks are needed. The Hu, Nisqually, SODO/UW and Canterbury tests are therefore reported separately from the synthetic scenario results.</w:t>
+      </w:r>
+    </w:p>
+    <w:p>
+      <w:pPr>
+        <w:pStyle w:val="Paragraph"/>
+      </w:pPr>
+      <w:r>
+        <w:t>A separate field-regime gate was also tested and intentionally kept as a guardrail: a simple hydraulic-leverage-plus-CPT-fabric index did not explain Canterbury false negatives by itself. This negative result prevents the paper from overselling the mechanism as a universal field classifier. The physical switch is demonstrated in the controlled benchmark; the field validations support screening discipline and claim boundaries.</w:t>
       </w:r>
     </w:p>
     <w:p>

</xml_diff>

<commit_message>
Apply CIVIL novelty Q1 benchmark controls
</commit_message>
<xml_diff>
--- a/manuscript/A_reproducible_reliability_benchmark.docx
+++ b/manuscript/A_reproducible_reliability_benchmark.docx
@@ -68,7 +68,7 @@
         </w:rPr>
       </w:pPr>
       <w:r>
-        <w:t>Liquefaction is commonly checked as if the water table and soil state were frozen. This paper shows why that assumption can fail in a physically sharp way. The novelty is a critical water-table crossing mechanism: when a rising non-stationary water table crosses a shallow liquefiable layer, effective stress drops, CSR rises, deterministic FS falls and the computed probability of liquefaction can jump rather than drift. In the benchmark, the largest L1 crossing raises CSR by 25.3%, lowers FS by 19.7% and increases Pf by 0.149 between two adjacent time states. The mechanism is embedded in a reproducible Monte Carlo benchmark, then stress-tested against Hu case histories, Nisqually, SODO/UW and 15,890 Canterbury CPT-event states. The evidence supports a bounded claim: non-stationary groundwater can create a physical switching regime that matters for false-negative-aware screening.  Public Canterbury/EQC residential cost evidence further supports the decision scale: published regional loss ratios rise from 0.013 at MMI6 to 0.171 at MMI8, a 13.2x multiplier, so FN:FP cost ratios of 5-10 are economically plausible rather than arbitrary. It does not establish a new universal constitutive law or property-level repair-cost model.</w:t>
+        <w:t>Liquefaction is commonly checked as if the water table and soil state were frozen. This paper shows why that assumption can fail in a physically sharp way. The novelty is a critical water-table crossing mechanism: when a rising non-stationary water table crosses a shallow liquefiable layer, effective stress drops, CSR rises, deterministic FS falls and the computed probability of liquefaction can jump rather than drift. In the benchmark, the largest L1 crossing raises CSR by 25.3%, lowers FS by 19.7% and increases Pf by 0.149 between two adjacent time states. The mechanism is embedded in a reproducible Monte Carlo benchmark, then checked against external case-history ranking, adverse holdouts and Canterbury temporal-transfer tests involving 15,890 CPT-event states. The evidence supports a bounded claim: non-stationary groundwater can create a physical switching regime that matters for false-negative-aware screening.  Public Canterbury/EQC residential cost evidence further supports the decision scale: published regional loss ratios rise from 0.013 at MMI6 to 0.171 at MMI8, a 13.2x multiplier, so FN:FP cost ratios of 5-10 are economically plausible rather than arbitrary. It does not establish a new universal constitutive law or property-level repair-cost model.</w:t>
       </w:r>
     </w:p>
     <w:p>
@@ -138,7 +138,7 @@
     </w:p>
     <w:p>
       <w:r>
-        <w:t>Geotechnical reliability provides a natural language for this problem because it connects soil variability, model uncertainty and performance probability [1, 3, 9, 30]. The approach also aligns directly with georisk assessment and management because it treats uncertainty in geomaterials, geologic processes, groundwater state and engineered-system decisions as the central object of analysis. The gap addressed here is not another fixed-condition liquefaction calculation, but the absence of an auditable reliability-updating workflow that compares stationary and non-stationary liquefaction risk under explicit groundwater and gradation scenarios.</w:t>
+        <w:t>Geotechnical reliability provides a natural language for this problem because it connects soil variability, model uncertainty and performance probability [1, 3, 9, 30]. The approach also aligns directly with georisk assessment and management because it treats uncertainty in geomaterials, geologic processes, groundwater state and engineered-system decisions as the central object of analysis. The gap addressed here is not another fixed-condition liquefaction calculation, but the absence of an auditable reliability-updating workflow that compares stationary and non-stationary liquefaction risk under explicit groundwater and gradation scenarios. This is a Georisk contribution because the unit of analysis is uncertainty-driven decision change under moving geomaterial and groundwater states.</w:t>
       </w:r>
     </w:p>
     <w:p>
@@ -161,7 +161,7 @@
         <w:jc w:val="both"/>
       </w:pPr>
       <w:r>
-        <w:t>The claim is intentionally bounded. The manuscript does not claim a new constitutive law, measured gradation evolution or universal superiority of the most complex model. It claims a narrower physical result: non-stationary groundwater can behave as a switch when it crosses a shallow liquefiable layer, and that switch changes the false-negative risk that stationary screening may hide.</w:t>
+        <w:t>The claim is intentionally bounded. After this manuscript, the community knows that a rising groundwater table can create a discrete screening-regime change when it crosses a shallow liquefiable layer, because the effective-stress term amplifies CSR and can reorder false-negative-aware decisions. This is demonstrated by controlled mechanism isolation, ablations, external compatibility checks and temporal-transfer tests; it is not a universal field-calibrated liquefaction law.</w:t>
       </w:r>
     </w:p>
     <w:p>
@@ -216,6 +216,394 @@
         <w:t>Figure 12. Reader-facing evidence boundary: what is verified, what is validated, what is decision-ready and what remains blocked.</w:t>
       </w:r>
     </w:p>
+    <w:p>
+      <w:pPr/>
+      <w:r>
+        <w:t>Table 1. Condensed literature frontier for the CIVIL-NOVELTY-Q1 claim; the full coded frontier is supplied in the repository audit.</w:t>
+      </w:r>
+    </w:p>
+    <w:tbl>
+      <w:tblPr>
+        <w:tblW w:type="auto" w:w="0"/>
+        <w:tblLook w:firstColumn="1" w:firstRow="1" w:lastColumn="0" w:lastRow="0" w:noHBand="0" w:noVBand="1" w:val="04A0"/>
+      </w:tblPr>
+      <w:tblGrid>
+        <w:gridCol w:w="2126"/>
+        <w:gridCol w:w="2126"/>
+        <w:gridCol w:w="2126"/>
+        <w:gridCol w:w="2126"/>
+      </w:tblGrid>
+      <w:tr>
+        <w:tc>
+          <w:tcPr>
+            <w:tcW w:type="dxa" w:w="2126"/>
+          </w:tcPr>
+          <w:p>
+            <w:pPr>
+              <w:spacing w:after="0" w:before="0"/>
+            </w:pPr>
+            <w:r/>
+            <w:r>
+              <w:rPr>
+                <w:b/>
+                <w:sz w:val="14"/>
+              </w:rPr>
+              <w:t>Frontier works</w:t>
+            </w:r>
+          </w:p>
+        </w:tc>
+        <w:tc>
+          <w:tcPr>
+            <w:tcW w:type="dxa" w:w="2126"/>
+          </w:tcPr>
+          <w:p>
+            <w:pPr>
+              <w:spacing w:after="0" w:before="0"/>
+            </w:pPr>
+            <w:r/>
+            <w:r>
+              <w:rPr>
+                <w:b/>
+                <w:sz w:val="14"/>
+              </w:rPr>
+              <w:t>What they establish</w:t>
+            </w:r>
+          </w:p>
+        </w:tc>
+        <w:tc>
+          <w:tcPr>
+            <w:tcW w:type="dxa" w:w="2126"/>
+          </w:tcPr>
+          <w:p>
+            <w:pPr>
+              <w:spacing w:after="0" w:before="0"/>
+            </w:pPr>
+            <w:r/>
+            <w:r>
+              <w:rPr>
+                <w:b/>
+                <w:sz w:val="14"/>
+              </w:rPr>
+              <w:t>Remaining gap</w:t>
+            </w:r>
+          </w:p>
+        </w:tc>
+        <w:tc>
+          <w:tcPr>
+            <w:tcW w:type="dxa" w:w="2126"/>
+          </w:tcPr>
+          <w:p>
+            <w:pPr>
+              <w:spacing w:after="0" w:before="0"/>
+            </w:pPr>
+            <w:r/>
+            <w:r>
+              <w:rPr>
+                <w:b/>
+                <w:sz w:val="14"/>
+              </w:rPr>
+              <w:t>This paper</w:t>
+            </w:r>
+          </w:p>
+        </w:tc>
+      </w:tr>
+      <w:tr>
+        <w:tc>
+          <w:tcPr>
+            <w:tcW w:type="dxa" w:w="2126"/>
+          </w:tcPr>
+          <w:p>
+            <w:pPr>
+              <w:spacing w:after="0" w:before="0"/>
+            </w:pPr>
+            <w:r/>
+            <w:r>
+              <w:rPr>
+                <w:b w:val="0"/>
+                <w:sz w:val="14"/>
+              </w:rPr>
+              <w:t>Probabilistic liquefaction reviews and PLHA [7, 14, 20, 29]</w:t>
+            </w:r>
+          </w:p>
+        </w:tc>
+        <w:tc>
+          <w:tcPr>
+            <w:tcW w:type="dxa" w:w="2126"/>
+          </w:tcPr>
+          <w:p>
+            <w:pPr>
+              <w:spacing w:after="0" w:before="0"/>
+            </w:pPr>
+            <w:r/>
+            <w:r>
+              <w:rPr>
+                <w:b w:val="0"/>
+                <w:sz w:val="14"/>
+              </w:rPr>
+              <w:t>Uncertainty, regional mapping and improved probabilistic computation</w:t>
+            </w:r>
+          </w:p>
+        </w:tc>
+        <w:tc>
+          <w:tcPr>
+            <w:tcW w:type="dxa" w:w="2126"/>
+          </w:tcPr>
+          <w:p>
+            <w:pPr>
+              <w:spacing w:after="0" w:before="0"/>
+            </w:pPr>
+            <w:r/>
+            <w:r>
+              <w:rPr>
+                <w:b w:val="0"/>
+                <w:sz w:val="14"/>
+              </w:rPr>
+              <w:t>Groundwater/soil state often remain fixed during screening decisions</w:t>
+            </w:r>
+          </w:p>
+        </w:tc>
+        <w:tc>
+          <w:tcPr>
+            <w:tcW w:type="dxa" w:w="2126"/>
+          </w:tcPr>
+          <w:p>
+            <w:pPr>
+              <w:spacing w:after="0" w:before="0"/>
+            </w:pPr>
+            <w:r/>
+            <w:r>
+              <w:rPr>
+                <w:b w:val="0"/>
+                <w:sz w:val="14"/>
+              </w:rPr>
+              <w:t>Tests Pf(z,t) and isolates a water-table crossing switch</w:t>
+            </w:r>
+          </w:p>
+        </w:tc>
+      </w:tr>
+      <w:tr>
+        <w:tc>
+          <w:tcPr>
+            <w:tcW w:type="dxa" w:w="2126"/>
+          </w:tcPr>
+          <w:p>
+            <w:pPr>
+              <w:spacing w:after="0" w:before="0"/>
+            </w:pPr>
+            <w:r/>
+            <w:r>
+              <w:rPr>
+                <w:b w:val="0"/>
+                <w:sz w:val="14"/>
+              </w:rPr>
+              <w:t>Risk-informed Georisk mapping [51, 52]</w:t>
+            </w:r>
+          </w:p>
+        </w:tc>
+        <w:tc>
+          <w:tcPr>
+            <w:tcW w:type="dxa" w:w="2126"/>
+          </w:tcPr>
+          <w:p>
+            <w:pPr>
+              <w:spacing w:after="0" w:before="0"/>
+            </w:pPr>
+            <w:r/>
+            <w:r>
+              <w:rPr>
+                <w:b w:val="0"/>
+                <w:sz w:val="14"/>
+              </w:rPr>
+              <w:t>Spatial uncertainty and decision-sensitive geotechnical risk</w:t>
+            </w:r>
+          </w:p>
+        </w:tc>
+        <w:tc>
+          <w:tcPr>
+            <w:tcW w:type="dxa" w:w="2126"/>
+          </w:tcPr>
+          <w:p>
+            <w:pPr>
+              <w:spacing w:after="0" w:before="0"/>
+            </w:pPr>
+            <w:r/>
+            <w:r>
+              <w:rPr>
+                <w:b w:val="0"/>
+                <w:sz w:val="14"/>
+              </w:rPr>
+              <w:t>Temporal state-variable switching is not the central object</w:t>
+            </w:r>
+          </w:p>
+        </w:tc>
+        <w:tc>
+          <w:tcPr>
+            <w:tcW w:type="dxa" w:w="2126"/>
+          </w:tcPr>
+          <w:p>
+            <w:pPr>
+              <w:spacing w:after="0" w:before="0"/>
+            </w:pPr>
+            <w:r/>
+            <w:r>
+              <w:rPr>
+                <w:b w:val="0"/>
+                <w:sz w:val="14"/>
+              </w:rPr>
+              <w:t>Frames novelty as uncertainty-driven decision change</w:t>
+            </w:r>
+          </w:p>
+        </w:tc>
+      </w:tr>
+      <w:tr>
+        <w:tc>
+          <w:tcPr>
+            <w:tcW w:type="dxa" w:w="2126"/>
+          </w:tcPr>
+          <w:p>
+            <w:pPr>
+              <w:spacing w:after="0" w:before="0"/>
+            </w:pPr>
+            <w:r/>
+            <w:r>
+              <w:rPr>
+                <w:b w:val="0"/>
+                <w:sz w:val="14"/>
+              </w:rPr>
+              <w:t>Triggering and reliability foundations [4, 21, 25]</w:t>
+            </w:r>
+          </w:p>
+        </w:tc>
+        <w:tc>
+          <w:tcPr>
+            <w:tcW w:type="dxa" w:w="2126"/>
+          </w:tcPr>
+          <w:p>
+            <w:pPr>
+              <w:spacing w:after="0" w:before="0"/>
+            </w:pPr>
+            <w:r/>
+            <w:r>
+              <w:rPr>
+                <w:b w:val="0"/>
+                <w:sz w:val="14"/>
+              </w:rPr>
+              <w:t>Established triggering and probabilistic reliability basis</w:t>
+            </w:r>
+          </w:p>
+        </w:tc>
+        <w:tc>
+          <w:tcPr>
+            <w:tcW w:type="dxa" w:w="2126"/>
+          </w:tcPr>
+          <w:p>
+            <w:pPr>
+              <w:spacing w:after="0" w:before="0"/>
+            </w:pPr>
+            <w:r/>
+            <w:r>
+              <w:rPr>
+                <w:b w:val="0"/>
+                <w:sz w:val="14"/>
+              </w:rPr>
+              <w:t>Fixed-state inputs do not expose false-negative timing</w:t>
+            </w:r>
+          </w:p>
+        </w:tc>
+        <w:tc>
+          <w:tcPr>
+            <w:tcW w:type="dxa" w:w="2126"/>
+          </w:tcPr>
+          <w:p>
+            <w:pPr>
+              <w:spacing w:after="0" w:before="0"/>
+            </w:pPr>
+            <w:r/>
+            <w:r>
+              <w:rPr>
+                <w:b w:val="0"/>
+                <w:sz w:val="14"/>
+              </w:rPr>
+              <w:t>Embeds triggering in auditable non-stationary ablations</w:t>
+            </w:r>
+          </w:p>
+        </w:tc>
+      </w:tr>
+      <w:tr>
+        <w:tc>
+          <w:tcPr>
+            <w:tcW w:type="dxa" w:w="2126"/>
+          </w:tcPr>
+          <w:p>
+            <w:pPr>
+              <w:spacing w:after="0" w:before="0"/>
+            </w:pPr>
+            <w:r/>
+            <w:r>
+              <w:rPr>
+                <w:b w:val="0"/>
+                <w:sz w:val="14"/>
+              </w:rPr>
+              <w:t>Fines/soil-state and unsaturated mechanics [11, 27, 28, 49]</w:t>
+            </w:r>
+          </w:p>
+        </w:tc>
+        <w:tc>
+          <w:tcPr>
+            <w:tcW w:type="dxa" w:w="2126"/>
+          </w:tcPr>
+          <w:p>
+            <w:pPr>
+              <w:spacing w:after="0" w:before="0"/>
+            </w:pPr>
+            <w:r/>
+            <w:r>
+              <w:rPr>
+                <w:b w:val="0"/>
+                <w:sz w:val="14"/>
+              </w:rPr>
+              <w:t>Pore pressure, fines and soil state can change resistance/demand</w:t>
+            </w:r>
+          </w:p>
+        </w:tc>
+        <w:tc>
+          <w:tcPr>
+            <w:tcW w:type="dxa" w:w="2126"/>
+          </w:tcPr>
+          <w:p>
+            <w:pPr>
+              <w:spacing w:after="0" w:before="0"/>
+            </w:pPr>
+            <w:r/>
+            <w:r>
+              <w:rPr>
+                <w:b w:val="0"/>
+                <w:sz w:val="14"/>
+              </w:rPr>
+              <w:t>No bounded screening test linking state motion to FN:FP policy</w:t>
+            </w:r>
+          </w:p>
+        </w:tc>
+        <w:tc>
+          <w:tcPr>
+            <w:tcW w:type="dxa" w:w="2126"/>
+          </w:tcPr>
+          <w:p>
+            <w:pPr>
+              <w:spacing w:after="0" w:before="0"/>
+            </w:pPr>
+            <w:r/>
+            <w:r>
+              <w:rPr>
+                <w:b w:val="0"/>
+                <w:sz w:val="14"/>
+              </w:rPr>
+              <w:t>Keeps gradation as scenario sensitivity and tests decision consequences</w:t>
+            </w:r>
+          </w:p>
+        </w:tc>
+      </w:tr>
+    </w:tbl>
     <w:p>
       <w:pPr>
         <w:pStyle w:val="Heading1"/>
@@ -929,6 +1317,14 @@
         <w:pStyle w:val="Paragraph"/>
       </w:pPr>
       <w:r>
+        <w:t>Evidence classes are kept separate: verification, synthetic mechanism isolation, external compatibility, temporal-transfer testing, and decision-policy stress testing. Only the held-out screening tests are called validation.</w:t>
+      </w:r>
+    </w:p>
+    <w:p>
+      <w:pPr>
+        <w:pStyle w:val="Paragraph"/>
+      </w:pPr>
+      <w:r>
         <w:t>A second control is the explicit comparison between stationary and non-stationary probabilities. The stationary calculation keeps groundwater and fines content at the initial state while still propagating resistance, demand and model uncertainty. The non-stationary calculation changes the scenario means before sampling. This separation is important because it isolates the effect of changing environmental and material state variables from ordinary Monte Carlo variability. It also allows the difference Delta Pf to be interpreted as a scenario effect rather than as a replacement for conventional reliability analysis.</w:t>
       </w:r>
     </w:p>
@@ -1346,7 +1742,7 @@
     <w:p>
       <w:pPr/>
       <w:r>
-        <w:t>These controls define the editorial novelty claim as a change in georisk decision interpretation: the manuscript tests when non-stationary groundwater and gradation evolution alter liquefaction probability, ranking and screening decisions relative to stationary assessment. The novelty is not the existence of a reproducible repository or a workflow; those elements are treated as audit mechanisms supporting the scientific claim.</w:t>
+        <w:t>These controls define the editorial novelty claim as decision interpretation under moving state variables. The manuscript does not validate the full groundwater/gradation operator against monitored temporal field evolution; it tests whether the resulting screening signals transfer sufficiently for bounded false-negative-aware decisions.</w:t>
       </w:r>
     </w:p>
     <w:p>
@@ -2186,6 +2582,14 @@
         <w:pStyle w:val="Paragraph"/>
       </w:pPr>
       <w:r>
+        <w:t>The claim would be falsified or narrowed by monitored sites where water-table crossing does not change ranking, or by external events where stationary M0 consistently dominates non-stationary alternatives under locked thresholds.</w:t>
+      </w:r>
+    </w:p>
+    <w:p>
+      <w:pPr>
+        <w:pStyle w:val="Paragraph"/>
+      </w:pPr>
+      <w:r>
         <w:t>The method can be extended in several ways. A random-field representation could replace independent layer sampling; Bayesian updating could assimilate monitoring data; subset simulation or importance sampling could reduce variance for rare probabilities; and decision thresholds could be linked to mitigation cost. These extensions are consistent with reliability practice and are intentionally left modular rather than embedded in a closed black-box model.</w:t>
       </w:r>
     </w:p>
@@ -2228,7 +2632,7 @@
         </w:rPr>
       </w:pPr>
       <w:r>
-        <w:t>The validation evidence is now layered. Hu et al. supports event-level screening transfer; Nisqually and SODO/UW test adverse holdouts; Canterbury provides a large external transfer set, locked-threshold decision validation and a formal leave-one-earthquake-out temporal holdout. In the Canterbury temporal holdout, M2 gives the best pooled Brier score and AUC, while M0 remains competitive in specific event-wise decisions. The workflow therefore supports georisk ranking and monitoring escalation under disclosed thresholds, not uncalibrated design prediction.</w:t>
+        <w:t>The evidence is now layered. Hu et al. supports external compatibility; Nisqually and SODO/UW test adverse holdouts; Canterbury provides a large external transfer set, locked-threshold decision-policy stress testing and a leave-one-earthquake-out temporal holdout. These results support georisk ranking and monitoring escalation under bounded conditions, not universal design-level prediction.</w:t>
       </w:r>
     </w:p>
     <w:p>
@@ -2236,7 +2640,7 @@
         <w:jc w:val="both"/>
       </w:pPr>
       <w:r>
-        <w:t>Editorial control sentence. This manuscript merits review in Georisk because it shows, with a runnable evidence chain, that non-stationary groundwater and gradation can change liquefaction screening decisions and false-negative trade-offs; recent probabilistic liquefaction studies have not shown that claim with the same combination of ablation, event holdouts, locked thresholds, external case histories and explicit blocked claims.</w:t>
+        <w:t>CIVIL-NOVELTY-Q1 control sentence. After this manuscript, the community knows that a rising groundwater table can create a discrete screening-regime change when it crosses a shallow liquefiable layer, something recent probabilistic liquefaction and georisk studies had not demonstrated as an auditable CSR/FS/Pf switch with ablations, temporal-transfer tests, locked decision thresholds and explicit blocked claims.</w:t>
       </w:r>
     </w:p>
     <w:p>
@@ -2331,14 +2735,7 @@
         </w:rPr>
       </w:pPr>
       <w:r>
-        <w:rPr>
-          <w:rFonts w:cs="Times New Roman"/>
-          <w:b w:val="0"/>
-          <w:bCs w:val="0"/>
-          <w:kern w:val="0"/>
-          <w:szCs w:val="24"/>
-        </w:rPr>
-        <w:t>The benchmark data, source code, figures and README are provided as Online Resource 1 and in the public GitHub repository: https://github.com/gabrielmontufar/article-118-nonstationary-liquefaction-benchmark. The synthetic benchmark script is self-contained. The site-extension scripts use public DesignSafe source files downloaded separately because the raw datasets are large: Nisqually PRJ-3758 (10.17603/ds2-nsf8-7944) and Canterbury PRJ-2937. The reproducibility package now includes scripts/run_121_canterbury_multi_site_temporal_validation.py, scripts/run_122_cost_sensitive_decision_frontier.py, outputs/canterbury_multi_site_temporal_validation_summary.json, outputs/cost_sensitive_decision_frontier_summary.json, outputs/cost_sensitive_decision_frontier_case_weighted_fixed_threshold.csv and outputs/paired_uncertainty_model_selection_summary.json so that the expanded Canterbury gate, cost-sensitive operating-policy diagnostic and claim boundary can be regenerated from the public raw file. Normalized CSV inputs and all generated outputs used in the manuscript are included in Online Resource 1; rerunning raw extraction requires placing the public DesignSafe files in the paths stated in the scripts or using the local raw_designsafe/ download folder.</w:t>
+        <w:t>The benchmark data, source code, figures and README are provided as Online Resource 1 and in the public GitHub repository: https://github.com/gabrielmontufar/article-118-nonstationary-liquefaction-benchmark. The synthetic benchmark script is self-contained. The site-extension scripts use public DesignSafe source files downloaded separately because the raw datasets are large: Nisqually PRJ-3758 (10.17603/ds2-nsf8-7944) and Canterbury PRJ-2937. The reproducibility package now includes scripts/run_121_canterbury_multi_site_temporal_validation.py, scripts/run_122_cost_sensitive_decision_frontier.py, outputs/canterbury_multi_site_temporal_validation_summary.json, outputs/cost_sensitive_decision_frontier_summary.json, outputs/cost_sensitive_decision_frontier_case_weighted_fixed_threshold.csv and outputs/paired_uncertainty_model_selection_summary.json so that the expanded Canterbury gate, cost-sensitive operating-policy diagnostic and claim boundary can be regenerated from the public raw file. Normalized CSV inputs and all generated outputs used in the manuscript are included in Online Resource 1; rerunning raw extraction requires placing the public DesignSafe files in the paths stated in the scripts or using the local raw_designsafe/ download folder. The package also includes a CIVIL-NOVELTY-Q1-100 audit documenting the novelty score, caps and remaining evidence blockers.</w:t>
       </w:r>
     </w:p>
     <w:p>

</xml_diff>